<commit_message>
[REF] cv: add SAP bidirectional integration and 7 NZ/AUS payment gateways (1-month milestones) to Tech Lead DOCX CV
</commit_message>
<xml_diff>
--- a/Md_Niaj_Shahriar_Shishir_Tech_Lead_Odoo_Customization_Integrations.docx
+++ b/Md_Niaj_Shahriar_Shishir_Tech_Lead_Odoo_Customization_Integrations.docx
@@ -10,13 +10,13 @@
         <w:tblLook w:firstColumn="1" w:firstRow="1" w:lastColumn="0" w:lastRow="0" w:noHBand="0" w:noVBand="1" w:val="04A0"/>
       </w:tblPr>
       <w:tblGrid>
-        <w:gridCol w:w="5162"/>
-        <w:gridCol w:w="5162"/>
+        <w:gridCol w:w="5205"/>
+        <w:gridCol w:w="5205"/>
       </w:tblGrid>
       <w:tr>
         <w:tc>
           <w:tcPr>
-            <w:tcW w:type="dxa" w:w="6480"/>
+            <w:tcW w:type="dxa" w:w="6552"/>
             <w:tcBorders>
               <w:top w:val="none"/>
               <w:left w:val="none"/>
@@ -24,10 +24,10 @@
               <w:right w:val="none"/>
             </w:tcBorders>
             <w:tcMar>
-              <w:top w:w="20" w:type="dxa"/>
-              <w:bottom w:w="40" w:type="dxa"/>
+              <w:top w:w="15" w:type="dxa"/>
+              <w:bottom w:w="30" w:type="dxa"/>
               <w:left w:w="0" w:type="dxa"/>
-              <w:right w:w="40" w:type="dxa"/>
+              <w:right w:w="30" w:type="dxa"/>
             </w:tcMar>
           </w:tcPr>
           <w:p>
@@ -39,7 +39,7 @@
                 <w:rFonts w:ascii="Arial" w:hAnsi="Arial"/>
                 <w:b/>
                 <w:color w:val="0F172A"/>
-                <w:sz w:val="36"/>
+                <w:sz w:val="35"/>
               </w:rPr>
               <w:t>Md Niaj Shahriar Shishir</w:t>
             </w:r>
@@ -74,7 +74,7 @@
         </w:tc>
         <w:tc>
           <w:tcPr>
-            <w:tcW w:type="dxa" w:w="3845"/>
+            <w:tcW w:type="dxa" w:w="3859"/>
             <w:tcBorders>
               <w:top w:val="none"/>
               <w:left w:val="none"/>
@@ -82,9 +82,9 @@
               <w:right w:val="none"/>
             </w:tcBorders>
             <w:tcMar>
-              <w:top w:w="20" w:type="dxa"/>
-              <w:bottom w:w="40" w:type="dxa"/>
-              <w:left w:w="40" w:type="dxa"/>
+              <w:top w:w="15" w:type="dxa"/>
+              <w:bottom w:w="30" w:type="dxa"/>
+              <w:left w:w="30" w:type="dxa"/>
               <w:right w:w="0" w:type="dxa"/>
             </w:tcMar>
           </w:tcPr>
@@ -98,7 +98,7 @@
                 <w:rFonts w:ascii="Calibri" w:hAnsi="Calibri"/>
                 <w:b/>
                 <w:color w:val="64748B"/>
-                <w:sz w:val="16"/>
+                <w:sz w:val="15"/>
               </w:rPr>
               <w:t xml:space="preserve">Live Portfolio: </w:t>
             </w:r>
@@ -107,7 +107,7 @@
                 <w:rFonts w:ascii="Calibri" w:hAnsi="Calibri"/>
                 <w:b/>
                 <w:color w:val="2563EB"/>
-                <w:sz w:val="16"/>
+                <w:sz w:val="15"/>
               </w:rPr>
               <w:t>nsrshishir.github.io/nsrshishir</w:t>
             </w:r>
@@ -122,7 +122,7 @@
                 <w:rFonts w:ascii="Calibri" w:hAnsi="Calibri"/>
                 <w:b/>
                 <w:color w:val="64748B"/>
-                <w:sz w:val="16"/>
+                <w:sz w:val="15"/>
               </w:rPr>
               <w:t xml:space="preserve">Email: </w:t>
             </w:r>
@@ -130,7 +130,7 @@
               <w:rPr>
                 <w:rFonts w:ascii="Calibri" w:hAnsi="Calibri"/>
                 <w:color w:val="1E293B"/>
-                <w:sz w:val="16"/>
+                <w:sz w:val="15"/>
               </w:rPr>
               <w:t>niaj@metamorphosis.com.bd</w:t>
             </w:r>
@@ -145,7 +145,7 @@
                 <w:rFonts w:ascii="Calibri" w:hAnsi="Calibri"/>
                 <w:b/>
                 <w:color w:val="64748B"/>
-                <w:sz w:val="16"/>
+                <w:sz w:val="15"/>
               </w:rPr>
               <w:t xml:space="preserve">Alt Email: </w:t>
             </w:r>
@@ -153,7 +153,7 @@
               <w:rPr>
                 <w:rFonts w:ascii="Calibri" w:hAnsi="Calibri"/>
                 <w:color w:val="1E293B"/>
-                <w:sz w:val="16"/>
+                <w:sz w:val="15"/>
               </w:rPr>
               <w:t>nsrshishir550@gmail.com</w:t>
             </w:r>
@@ -168,7 +168,7 @@
                 <w:rFonts w:ascii="Calibri" w:hAnsi="Calibri"/>
                 <w:b/>
                 <w:color w:val="64748B"/>
-                <w:sz w:val="16"/>
+                <w:sz w:val="15"/>
               </w:rPr>
               <w:t xml:space="preserve">Phone: </w:t>
             </w:r>
@@ -176,7 +176,7 @@
               <w:rPr>
                 <w:rFonts w:ascii="Calibri" w:hAnsi="Calibri"/>
                 <w:color w:val="1E293B"/>
-                <w:sz w:val="16"/>
+                <w:sz w:val="15"/>
               </w:rPr>
               <w:t>+880 1827-512928 | Dhaka, BD</w:t>
             </w:r>
@@ -191,7 +191,7 @@
                 <w:rFonts w:ascii="Calibri" w:hAnsi="Calibri"/>
                 <w:b/>
                 <w:color w:val="64748B"/>
-                <w:sz w:val="16"/>
+                <w:sz w:val="15"/>
               </w:rPr>
               <w:t xml:space="preserve">LinkedIn: </w:t>
             </w:r>
@@ -199,7 +199,7 @@
               <w:rPr>
                 <w:rFonts w:ascii="Calibri" w:hAnsi="Calibri"/>
                 <w:color w:val="1E293B"/>
-                <w:sz w:val="16"/>
+                <w:sz w:val="15"/>
               </w:rPr>
               <w:t>linkedin.com/in/nsrshishir</w:t>
             </w:r>
@@ -214,7 +214,7 @@
                 <w:rFonts w:ascii="Calibri" w:hAnsi="Calibri"/>
                 <w:b/>
                 <w:color w:val="64748B"/>
-                <w:sz w:val="16"/>
+                <w:sz w:val="15"/>
               </w:rPr>
               <w:t xml:space="preserve">GitHub: </w:t>
             </w:r>
@@ -222,7 +222,7 @@
               <w:rPr>
                 <w:rFonts w:ascii="Calibri" w:hAnsi="Calibri"/>
                 <w:color w:val="1E293B"/>
-                <w:sz w:val="16"/>
+                <w:sz w:val="15"/>
               </w:rPr>
               <w:t>github.com/nsrshishir</w:t>
             </w:r>
@@ -232,7 +232,7 @@
     </w:tbl>
     <w:p>
       <w:pPr>
-        <w:spacing w:before="80" w:after="100"/>
+        <w:spacing w:before="60" w:after="80"/>
         <w:pBdr>
           <w:bottom w:val="single" w:sz="10" w:space="1" w:color="2563EB"/>
         </w:pBdr>
@@ -246,15 +246,15 @@
         <w:tblLook w:firstColumn="1" w:firstRow="1" w:lastColumn="0" w:lastRow="0" w:noHBand="0" w:noVBand="1" w:val="04A0"/>
       </w:tblPr>
       <w:tblGrid>
-        <w:gridCol w:w="2581"/>
-        <w:gridCol w:w="2581"/>
-        <w:gridCol w:w="2581"/>
-        <w:gridCol w:w="2581"/>
+        <w:gridCol w:w="2603"/>
+        <w:gridCol w:w="2603"/>
+        <w:gridCol w:w="2603"/>
+        <w:gridCol w:w="2603"/>
       </w:tblGrid>
       <w:tr>
         <w:tc>
           <w:tcPr>
-            <w:tcW w:type="dxa" w:w="2578"/>
+            <w:tcW w:type="dxa" w:w="2592"/>
             <w:shd w:fill="F1F5F9"/>
             <w:tcBorders>
               <w:top w:val="none"/>
@@ -263,10 +263,10 @@
               <w:right w:val="none"/>
             </w:tcBorders>
             <w:tcMar>
-              <w:top w:w="50" w:type="dxa"/>
-              <w:bottom w:w="50" w:type="dxa"/>
-              <w:left w:w="40" w:type="dxa"/>
-              <w:right w:w="40" w:type="dxa"/>
+              <w:top w:w="45" w:type="dxa"/>
+              <w:bottom w:w="45" w:type="dxa"/>
+              <w:left w:w="35" w:type="dxa"/>
+              <w:right w:w="35" w:type="dxa"/>
             </w:tcMar>
           </w:tcPr>
           <w:p>
@@ -279,7 +279,7 @@
                 <w:rFonts w:ascii="Arial" w:hAnsi="Arial"/>
                 <w:b/>
                 <w:color w:val="0F172A"/>
-                <w:sz w:val="18"/>
+                <w:sz w:val="17"/>
               </w:rPr>
               <w:t>900+ Custom Modules</w:t>
             </w:r>
@@ -294,7 +294,7 @@
                 <w:rFonts w:ascii="Calibri" w:hAnsi="Calibri"/>
                 <w:b/>
                 <w:color w:val="2563EB"/>
-                <w:sz w:val="13"/>
+                <w:sz w:val="12"/>
               </w:rPr>
               <w:t>HAND-CODED ODOO APPS</w:t>
             </w:r>
@@ -302,7 +302,7 @@
         </w:tc>
         <w:tc>
           <w:tcPr>
-            <w:tcW w:type="dxa" w:w="2578"/>
+            <w:tcW w:type="dxa" w:w="2592"/>
             <w:shd w:fill="F1F5F9"/>
             <w:tcBorders>
               <w:top w:val="none"/>
@@ -311,10 +311,10 @@
               <w:right w:val="none"/>
             </w:tcBorders>
             <w:tcMar>
-              <w:top w:w="50" w:type="dxa"/>
-              <w:bottom w:w="50" w:type="dxa"/>
-              <w:left w:w="40" w:type="dxa"/>
-              <w:right w:w="40" w:type="dxa"/>
+              <w:top w:w="45" w:type="dxa"/>
+              <w:bottom w:w="45" w:type="dxa"/>
+              <w:left w:w="35" w:type="dxa"/>
+              <w:right w:w="35" w:type="dxa"/>
             </w:tcMar>
           </w:tcPr>
           <w:p>
@@ -327,7 +327,55 @@
                 <w:rFonts w:ascii="Arial" w:hAnsi="Arial"/>
                 <w:b/>
                 <w:color w:val="0F172A"/>
-                <w:sz w:val="18"/>
+                <w:sz w:val="17"/>
+              </w:rPr>
+              <w:t>SAP &amp; 7 Gateways</w:t>
+            </w:r>
+          </w:p>
+          <w:p>
+            <w:pPr>
+              <w:spacing w:before="0" w:after="0"/>
+              <w:jc w:val="center"/>
+            </w:pPr>
+            <w:r>
+              <w:rPr>
+                <w:rFonts w:ascii="Calibri" w:hAnsi="Calibri"/>
+                <w:b/>
+                <w:color w:val="2563EB"/>
+                <w:sz w:val="12"/>
+              </w:rPr>
+              <w:t>1-MONTH INTEGRATION WINS</w:t>
+            </w:r>
+          </w:p>
+        </w:tc>
+        <w:tc>
+          <w:tcPr>
+            <w:tcW w:type="dxa" w:w="2592"/>
+            <w:shd w:fill="F1F5F9"/>
+            <w:tcBorders>
+              <w:top w:val="none"/>
+              <w:left w:val="none"/>
+              <w:bottom w:val="none"/>
+              <w:right w:val="none"/>
+            </w:tcBorders>
+            <w:tcMar>
+              <w:top w:w="45" w:type="dxa"/>
+              <w:bottom w:w="45" w:type="dxa"/>
+              <w:left w:w="35" w:type="dxa"/>
+              <w:right w:w="35" w:type="dxa"/>
+            </w:tcMar>
+          </w:tcPr>
+          <w:p>
+            <w:pPr>
+              <w:spacing w:before="0" w:after="10"/>
+              <w:jc w:val="center"/>
+            </w:pPr>
+            <w:r>
+              <w:rPr>
+                <w:rFonts w:ascii="Arial" w:hAnsi="Arial"/>
+                <w:b/>
+                <w:color w:val="0F172A"/>
+                <w:sz w:val="17"/>
               </w:rPr>
               <w:t>14+ Enterprise Upgrades</w:t>
             </w:r>
@@ -342,7 +390,7 @@
                 <w:rFonts w:ascii="Calibri" w:hAnsi="Calibri"/>
                 <w:b/>
                 <w:color w:val="2563EB"/>
-                <w:sz w:val="13"/>
+                <w:sz w:val="12"/>
               </w:rPr>
               <w:t>V13.0 THROUGH V19.0</w:t>
             </w:r>
@@ -350,7 +398,7 @@
         </w:tc>
         <w:tc>
           <w:tcPr>
-            <w:tcW w:type="dxa" w:w="2578"/>
+            <w:tcW w:type="dxa" w:w="2592"/>
             <w:shd w:fill="F1F5F9"/>
             <w:tcBorders>
               <w:top w:val="none"/>
@@ -359,10 +407,10 @@
               <w:right w:val="none"/>
             </w:tcBorders>
             <w:tcMar>
-              <w:top w:w="50" w:type="dxa"/>
-              <w:bottom w:w="50" w:type="dxa"/>
-              <w:left w:w="40" w:type="dxa"/>
-              <w:right w:w="40" w:type="dxa"/>
+              <w:top w:w="45" w:type="dxa"/>
+              <w:bottom w:w="45" w:type="dxa"/>
+              <w:left w:w="35" w:type="dxa"/>
+              <w:right w:w="35" w:type="dxa"/>
             </w:tcMar>
           </w:tcPr>
           <w:p>
@@ -375,55 +423,7 @@
                 <w:rFonts w:ascii="Arial" w:hAnsi="Arial"/>
                 <w:b/>
                 <w:color w:val="0F172A"/>
-                <w:sz w:val="18"/>
-              </w:rPr>
-              <w:t>Proprietary &amp; 3rd-Party</w:t>
-            </w:r>
-          </w:p>
-          <w:p>
-            <w:pPr>
-              <w:spacing w:before="0" w:after="0"/>
-              <w:jc w:val="center"/>
-            </w:pPr>
-            <w:r>
-              <w:rPr>
-                <w:rFonts w:ascii="Calibri" w:hAnsi="Calibri"/>
-                <w:b/>
-                <w:color w:val="2563EB"/>
-                <w:sz w:val="13"/>
-              </w:rPr>
-              <w:t>CUSTOM API &amp; ETL SYNC</w:t>
-            </w:r>
-          </w:p>
-        </w:tc>
-        <w:tc>
-          <w:tcPr>
-            <w:tcW w:type="dxa" w:w="2578"/>
-            <w:shd w:fill="F1F5F9"/>
-            <w:tcBorders>
-              <w:top w:val="none"/>
-              <w:left w:val="none"/>
-              <w:bottom w:val="none"/>
-              <w:right w:val="none"/>
-            </w:tcBorders>
-            <w:tcMar>
-              <w:top w:w="50" w:type="dxa"/>
-              <w:bottom w:w="50" w:type="dxa"/>
-              <w:left w:w="40" w:type="dxa"/>
-              <w:right w:w="40" w:type="dxa"/>
-            </w:tcMar>
-          </w:tcPr>
-          <w:p>
-            <w:pPr>
-              <w:spacing w:before="0" w:after="10"/>
-              <w:jc w:val="center"/>
-            </w:pPr>
-            <w:r>
-              <w:rPr>
-                <w:rFonts w:ascii="Arial" w:hAnsi="Arial"/>
-                <w:b/>
-                <w:color w:val="0F172A"/>
-                <w:sz w:val="18"/>
+                <w:sz w:val="17"/>
               </w:rPr>
               <w:t>3 Mo. Scope in 2-3 Wks</w:t>
             </w:r>
@@ -438,7 +438,7 @@
                 <w:rFonts w:ascii="Calibri" w:hAnsi="Calibri"/>
                 <w:b/>
                 <w:color w:val="2563EB"/>
-                <w:sz w:val="13"/>
+                <w:sz w:val="12"/>
               </w:rPr>
               <w:t>HYPER-VELOCITY DELIVERY</w:t>
             </w:r>
@@ -449,7 +449,7 @@
     <w:p>
       <w:pPr>
         <w:keepNext/>
-        <w:spacing w:before="120" w:after="60"/>
+        <w:spacing w:before="100" w:after="50"/>
         <w:pBdr>
           <w:bottom w:val="single" w:sz="6" w:space="1" w:color="CBD5E1"/>
         </w:pBdr>
@@ -459,14 +459,14 @@
           <w:rFonts w:ascii="Arial" w:hAnsi="Arial"/>
           <w:b/>
           <w:color w:val="0F172A"/>
-          <w:sz w:val="19"/>
+          <w:sz w:val="18"/>
         </w:rPr>
         <w:t>EXECUTIVE SUMMARY</w:t>
       </w:r>
     </w:p>
     <w:p>
       <w:pPr>
-        <w:spacing w:before="20" w:after="80" w:line="274" w:lineRule="auto"/>
+        <w:spacing w:before="20" w:after="60" w:line="269" w:lineRule="auto"/>
         <w:jc w:val="both"/>
       </w:pPr>
       <w:r>
@@ -475,13 +475,13 @@
           <w:color w:val="1E293B"/>
           <w:sz w:val="17"/>
         </w:rPr>
-        <w:t>High-impact Technical Lead and Certified Odoo Consultant (Solution Architect by Practice) with 7+ years of hands-on engineering mastery leading complex Odoo customization projects and architecting bidirectional integrations between Odoo and third-party proprietary enterprise systems. Proven authority in custom Odoo development, having hand-coded 900+ custom modules spanning custom business logic, automated workflow engines, OWL 2 interfaces, and bespoke financial/operational reports for 85+ global and domestic enterprise clients. Track record includes leading 14+ major multi-version Odoo Enterprise database upgrades (v13.0 through v19.0) with zero data loss. Expert in designing resilient, fault-tolerant integration architectures (REST, XML-RPC, JSON-RPC, Webhooks, ETL queues) linking Odoo with legacy back-offices, proprietary WMS/TMS, regional marketplaces (Kogan, Tradevine), and government compliance portals (ZATCA Phase 2, NBR). Accomplished engineering leader driving hyper-velocity teams that compress 3-month complete project scopes into 2–3 weeks while enforcing zero-defect code via the Agentic E3 Framework.</w:t>
+        <w:t>High-impact Technical Lead and Certified Odoo Consultant (Solution Architect by Practice) with 7+ years of hands-on engineering mastery leading complex Odoo customization projects and architecting mission-critical integrations between Odoo ERP and third-party enterprise proprietary systems. Proven authority in custom Odoo development, having hand-coded 900+ custom modules spanning bespoke business logic, automated workflow engines, OWL 2 interfaces, and specialized financial reports for 85+ global and domestic enterprise clients. Delivered high-stakes enterprise milestones including an end-to-end SAP ERP integration (customers, sales orders, outbound deliveries, and payments) delivered in just 1 month, and certified 7 distinct international NZ &amp; AUS payment gateways within a single 1-month milestone. Led 14+ major multi-version Odoo Enterprise upgrades (v13.0 to v19.0) with zero data loss. Expert in resilient architectures (REST, XML-RPC, JSON-RPC, Webhooks, ETL queues) linking Odoo with legacy back-offices, proprietary WMS, regional marketplaces (Kogan, Tradevine), and government compliance portals (ZATCA, NBR). Proven leader driving hyper-velocity teams that compress 3-month scopes into 2–3 weeks with zero-defect quality via the Agentic E3 Framework.</w:t>
       </w:r>
     </w:p>
     <w:p>
       <w:pPr>
         <w:keepNext/>
-        <w:spacing w:before="100" w:after="60"/>
+        <w:spacing w:before="80" w:after="50"/>
         <w:pBdr>
           <w:bottom w:val="single" w:sz="6" w:space="1" w:color="CBD5E1"/>
         </w:pBdr>
@@ -491,7 +491,7 @@
           <w:rFonts w:ascii="Arial" w:hAnsi="Arial"/>
           <w:b/>
           <w:color w:val="0F172A"/>
-          <w:sz w:val="19"/>
+          <w:sz w:val="18"/>
         </w:rPr>
         <w:t>CORE TECHNICAL &amp; INTEGRATION COMPETENCIES</w:t>
       </w:r>
@@ -504,13 +504,13 @@
         <w:tblLook w:firstColumn="1" w:firstRow="1" w:lastColumn="0" w:lastRow="0" w:noHBand="0" w:noVBand="1" w:val="04A0"/>
       </w:tblPr>
       <w:tblGrid>
-        <w:gridCol w:w="5162"/>
-        <w:gridCol w:w="5162"/>
+        <w:gridCol w:w="5205"/>
+        <w:gridCol w:w="5205"/>
       </w:tblGrid>
       <w:tr>
         <w:tc>
           <w:tcPr>
-            <w:tcW w:type="dxa" w:w="5155"/>
+            <w:tcW w:type="dxa" w:w="5184"/>
             <w:tcBorders>
               <w:top w:val="none"/>
               <w:left w:val="none"/>
@@ -518,22 +518,22 @@
               <w:right w:val="none"/>
             </w:tcBorders>
             <w:tcMar>
-              <w:top w:w="20" w:type="dxa"/>
-              <w:bottom w:w="25" w:type="dxa"/>
-              <w:left w:w="30" w:type="dxa"/>
-              <w:right w:w="40" w:type="dxa"/>
+              <w:top w:w="15" w:type="dxa"/>
+              <w:bottom w:w="20" w:type="dxa"/>
+              <w:left w:w="25" w:type="dxa"/>
+              <w:right w:w="35" w:type="dxa"/>
             </w:tcMar>
           </w:tcPr>
           <w:p>
             <w:pPr>
-              <w:spacing w:before="0" w:after="20" w:line="269" w:lineRule="auto"/>
+              <w:spacing w:before="0" w:after="20" w:line="264" w:lineRule="auto"/>
             </w:pPr>
             <w:r>
               <w:rPr>
                 <w:rFonts w:ascii="Calibri" w:hAnsi="Calibri"/>
                 <w:b/>
                 <w:color w:val="2563EB"/>
-                <w:sz w:val="17"/>
+                <w:sz w:val="16"/>
               </w:rPr>
               <w:t xml:space="preserve">• Odoo Customization Mastery: </w:t>
             </w:r>
@@ -541,7 +541,7 @@
               <w:rPr>
                 <w:rFonts w:ascii="Calibri" w:hAnsi="Calibri"/>
                 <w:color w:val="1E293B"/>
-                <w:sz w:val="17"/>
+                <w:sz w:val="16"/>
               </w:rPr>
               <w:t>900+ hand-coded modules; custom data models, business logic engines, OWL 2 reactive widgets, QWeb XML views, inheritances, compute field caching, automated server actions, cron tasks.</w:t>
             </w:r>
@@ -549,7 +549,7 @@
         </w:tc>
         <w:tc>
           <w:tcPr>
-            <w:tcW w:type="dxa" w:w="5155"/>
+            <w:tcW w:type="dxa" w:w="5184"/>
             <w:tcBorders>
               <w:top w:val="none"/>
               <w:left w:val="none"/>
@@ -557,32 +557,32 @@
               <w:right w:val="none"/>
             </w:tcBorders>
             <w:tcMar>
-              <w:top w:w="20" w:type="dxa"/>
-              <w:bottom w:w="25" w:type="dxa"/>
-              <w:left w:w="30" w:type="dxa"/>
-              <w:right w:w="40" w:type="dxa"/>
+              <w:top w:w="15" w:type="dxa"/>
+              <w:bottom w:w="20" w:type="dxa"/>
+              <w:left w:w="25" w:type="dxa"/>
+              <w:right w:w="35" w:type="dxa"/>
             </w:tcMar>
           </w:tcPr>
           <w:p>
             <w:pPr>
-              <w:spacing w:before="0" w:after="20" w:line="269" w:lineRule="auto"/>
+              <w:spacing w:before="0" w:after="20" w:line="264" w:lineRule="auto"/>
             </w:pPr>
             <w:r>
               <w:rPr>
                 <w:rFonts w:ascii="Calibri" w:hAnsi="Calibri"/>
                 <w:b/>
                 <w:color w:val="2563EB"/>
-                <w:sz w:val="17"/>
+                <w:sz w:val="16"/>
               </w:rPr>
-              <w:t xml:space="preserve">• Proprietary &amp; 3rd-Party Integration: </w:t>
+              <w:t xml:space="preserve">• Proprietary &amp; Enterprise ERP Sync: </w:t>
             </w:r>
             <w:r>
               <w:rPr>
                 <w:rFonts w:ascii="Calibri" w:hAnsi="Calibri"/>
                 <w:color w:val="1E293B"/>
-                <w:sz w:val="17"/>
+                <w:sz w:val="16"/>
               </w:rPr>
-              <w:t>Custom RESTful APIs, XML-RPC / JSON-RPC endpoints, Webhook consumers, event-driven sync, ETL data pipelines, token authentication, payload mapping &amp; transformation.</w:t>
+              <w:t>Direct bidirectional connectors with SAP, legacy ERPs, custom WMS/TMS; REST/SOAP/JSON-RPC/XML-RPC APIs, Webhook event pipelines, ETL queues, payload mapping.</w:t>
             </w:r>
           </w:p>
         </w:tc>
@@ -590,7 +590,7 @@
       <w:tr>
         <w:tc>
           <w:tcPr>
-            <w:tcW w:type="dxa" w:w="5155"/>
+            <w:tcW w:type="dxa" w:w="5184"/>
             <w:tcBorders>
               <w:top w:val="none"/>
               <w:left w:val="none"/>
@@ -598,22 +598,22 @@
               <w:right w:val="none"/>
             </w:tcBorders>
             <w:tcMar>
-              <w:top w:w="20" w:type="dxa"/>
-              <w:bottom w:w="25" w:type="dxa"/>
-              <w:left w:w="30" w:type="dxa"/>
-              <w:right w:w="40" w:type="dxa"/>
+              <w:top w:w="15" w:type="dxa"/>
+              <w:bottom w:w="20" w:type="dxa"/>
+              <w:left w:w="25" w:type="dxa"/>
+              <w:right w:w="35" w:type="dxa"/>
             </w:tcMar>
           </w:tcPr>
           <w:p>
             <w:pPr>
-              <w:spacing w:before="0" w:after="20" w:line="269" w:lineRule="auto"/>
+              <w:spacing w:before="0" w:after="20" w:line="264" w:lineRule="auto"/>
             </w:pPr>
             <w:r>
               <w:rPr>
                 <w:rFonts w:ascii="Calibri" w:hAnsi="Calibri"/>
                 <w:b/>
                 <w:color w:val="2563EB"/>
-                <w:sz w:val="17"/>
+                <w:sz w:val="16"/>
               </w:rPr>
               <w:t xml:space="preserve">• Fault Tolerance &amp; Data Reconciliation: </w:t>
             </w:r>
@@ -621,7 +621,7 @@
               <w:rPr>
                 <w:rFonts w:ascii="Calibri" w:hAnsi="Calibri"/>
                 <w:color w:val="1E293B"/>
-                <w:sz w:val="17"/>
+                <w:sz w:val="16"/>
               </w:rPr>
               <w:t>Transactional idempotency, queued retries, rate limiting, error logging/alerting, conflict resolution, bidirectional catalog/inventory/order sync, zero data loss.</w:t>
             </w:r>
@@ -629,7 +629,7 @@
         </w:tc>
         <w:tc>
           <w:tcPr>
-            <w:tcW w:type="dxa" w:w="5155"/>
+            <w:tcW w:type="dxa" w:w="5184"/>
             <w:tcBorders>
               <w:top w:val="none"/>
               <w:left w:val="none"/>
@@ -637,22 +637,22 @@
               <w:right w:val="none"/>
             </w:tcBorders>
             <w:tcMar>
-              <w:top w:w="20" w:type="dxa"/>
-              <w:bottom w:w="25" w:type="dxa"/>
-              <w:left w:w="30" w:type="dxa"/>
-              <w:right w:w="40" w:type="dxa"/>
+              <w:top w:w="15" w:type="dxa"/>
+              <w:bottom w:w="20" w:type="dxa"/>
+              <w:left w:w="25" w:type="dxa"/>
+              <w:right w:w="35" w:type="dxa"/>
             </w:tcMar>
           </w:tcPr>
           <w:p>
             <w:pPr>
-              <w:spacing w:before="0" w:after="20" w:line="269" w:lineRule="auto"/>
+              <w:spacing w:before="0" w:after="20" w:line="264" w:lineRule="auto"/>
             </w:pPr>
             <w:r>
               <w:rPr>
                 <w:rFonts w:ascii="Calibri" w:hAnsi="Calibri"/>
                 <w:b/>
                 <w:color w:val="2563EB"/>
-                <w:sz w:val="17"/>
+                <w:sz w:val="16"/>
               </w:rPr>
               <w:t xml:space="preserve">• Performance &amp; Scale Optimization: </w:t>
             </w:r>
@@ -660,7 +660,7 @@
               <w:rPr>
                 <w:rFonts w:ascii="Calibri" w:hAnsi="Calibri"/>
                 <w:color w:val="1E293B"/>
-                <w:sz w:val="17"/>
+                <w:sz w:val="16"/>
               </w:rPr>
               <w:t>ORM batching &amp; prefetching, eliminating N+1 queries, PostgreSQL index design, _read_group SQL aggregations, Gunicorn worker isolation (back-office vs API/web traffic).</w:t>
             </w:r>
@@ -670,7 +670,7 @@
       <w:tr>
         <w:tc>
           <w:tcPr>
-            <w:tcW w:type="dxa" w:w="5155"/>
+            <w:tcW w:type="dxa" w:w="5184"/>
             <w:tcBorders>
               <w:top w:val="none"/>
               <w:left w:val="none"/>
@@ -678,22 +678,22 @@
               <w:right w:val="none"/>
             </w:tcBorders>
             <w:tcMar>
-              <w:top w:w="20" w:type="dxa"/>
-              <w:bottom w:w="25" w:type="dxa"/>
-              <w:left w:w="30" w:type="dxa"/>
-              <w:right w:w="40" w:type="dxa"/>
+              <w:top w:w="15" w:type="dxa"/>
+              <w:bottom w:w="20" w:type="dxa"/>
+              <w:left w:w="25" w:type="dxa"/>
+              <w:right w:w="35" w:type="dxa"/>
             </w:tcMar>
           </w:tcPr>
           <w:p>
             <w:pPr>
-              <w:spacing w:before="0" w:after="20" w:line="269" w:lineRule="auto"/>
+              <w:spacing w:before="0" w:after="20" w:line="264" w:lineRule="auto"/>
             </w:pPr>
             <w:r>
               <w:rPr>
                 <w:rFonts w:ascii="Calibri" w:hAnsi="Calibri"/>
                 <w:b/>
                 <w:color w:val="2563EB"/>
-                <w:sz w:val="17"/>
+                <w:sz w:val="16"/>
               </w:rPr>
               <w:t xml:space="preserve">• Multi-Version Database Migrations: </w:t>
             </w:r>
@@ -701,7 +701,7 @@
               <w:rPr>
                 <w:rFonts w:ascii="Calibri" w:hAnsi="Calibri"/>
                 <w:color w:val="1E293B"/>
-                <w:sz w:val="17"/>
+                <w:sz w:val="16"/>
               </w:rPr>
               <w:t>14+ Enterprise upgrades (v13-v17, v14-v19, v16-v19), structural data retention, legacy workflow extraction, custom migration scripts, financial ledger reconciliation.</w:t>
             </w:r>
@@ -709,7 +709,7 @@
         </w:tc>
         <w:tc>
           <w:tcPr>
-            <w:tcW w:type="dxa" w:w="5155"/>
+            <w:tcW w:type="dxa" w:w="5184"/>
             <w:tcBorders>
               <w:top w:val="none"/>
               <w:left w:val="none"/>
@@ -717,22 +717,22 @@
               <w:right w:val="none"/>
             </w:tcBorders>
             <w:tcMar>
-              <w:top w:w="20" w:type="dxa"/>
-              <w:bottom w:w="25" w:type="dxa"/>
-              <w:left w:w="30" w:type="dxa"/>
-              <w:right w:w="40" w:type="dxa"/>
+              <w:top w:w="15" w:type="dxa"/>
+              <w:bottom w:w="20" w:type="dxa"/>
+              <w:left w:w="25" w:type="dxa"/>
+              <w:right w:w="35" w:type="dxa"/>
             </w:tcMar>
           </w:tcPr>
           <w:p>
             <w:pPr>
-              <w:spacing w:before="0" w:after="20" w:line="269" w:lineRule="auto"/>
+              <w:spacing w:before="0" w:after="20" w:line="264" w:lineRule="auto"/>
             </w:pPr>
             <w:r>
               <w:rPr>
                 <w:rFonts w:ascii="Calibri" w:hAnsi="Calibri"/>
                 <w:b/>
                 <w:color w:val="2563EB"/>
-                <w:sz w:val="17"/>
+                <w:sz w:val="16"/>
               </w:rPr>
               <w:t xml:space="preserve">• Tech Leadership &amp; Project Delivery: </w:t>
             </w:r>
@@ -740,7 +740,7 @@
               <w:rPr>
                 <w:rFonts w:ascii="Calibri" w:hAnsi="Calibri"/>
                 <w:color w:val="1E293B"/>
-                <w:sz w:val="17"/>
+                <w:sz w:val="16"/>
               </w:rPr>
               <w:t>Team leadership &amp; developer mentorship, technical solution architecture, client stakeholder management, 6-milestone delivery model, CI/CD, Docker deployment automation.</w:t>
             </w:r>
@@ -751,7 +751,7 @@
     <w:p>
       <w:pPr>
         <w:keepNext/>
-        <w:spacing w:before="100" w:after="60"/>
+        <w:spacing w:before="80" w:after="50"/>
         <w:pBdr>
           <w:bottom w:val="single" w:sz="6" w:space="1" w:color="CBD5E1"/>
         </w:pBdr>
@@ -761,7 +761,7 @@
           <w:rFonts w:ascii="Arial" w:hAnsi="Arial"/>
           <w:b/>
           <w:color w:val="0F172A"/>
-          <w:sz w:val="19"/>
+          <w:sz w:val="18"/>
         </w:rPr>
         <w:t>KEY INTEGRATION &amp; CUSTOMIZATION DELIVERABLES</w:t>
       </w:r>
@@ -769,7 +769,53 @@
     <w:p>
       <w:pPr>
         <w:pStyle w:val="ListBullet"/>
-        <w:spacing w:before="0" w:after="30" w:line="269" w:lineRule="auto"/>
+        <w:spacing w:before="0" w:after="24" w:line="264" w:lineRule="auto"/>
+      </w:pPr>
+      <w:r>
+        <w:rPr>
+          <w:rFonts w:ascii="Calibri" w:hAnsi="Calibri"/>
+          <w:b/>
+          <w:color w:val="1E293B"/>
+          <w:sz w:val="17"/>
+        </w:rPr>
+        <w:t xml:space="preserve">Enterprise SAP Integration (Customers, Orders, Deliveries &amp; Payments in 1 Month): </w:t>
+      </w:r>
+      <w:r>
+        <w:rPr>
+          <w:rFonts w:ascii="Calibri" w:hAnsi="Calibri"/>
+          <w:color w:val="1E293B"/>
+          <w:sz w:val="17"/>
+        </w:rPr>
+        <w:t>Architected and deployed an end-to-end bidirectional integration bridge between Odoo ERP and SAP enterprise system. Successfully completed full customer master sync, live sales order ingest, outbound delivery status tracking, and payment reconciliations within an aggressive 1-month delivery timeline.</w:t>
+      </w:r>
+    </w:p>
+    <w:p>
+      <w:pPr>
+        <w:pStyle w:val="ListBullet"/>
+        <w:spacing w:before="0" w:after="24" w:line="264" w:lineRule="auto"/>
+      </w:pPr>
+      <w:r>
+        <w:rPr>
+          <w:rFonts w:ascii="Calibri" w:hAnsi="Calibri"/>
+          <w:b/>
+          <w:color w:val="1E293B"/>
+          <w:sz w:val="17"/>
+        </w:rPr>
+        <w:t xml:space="preserve">7 International NZ &amp; AUS Payment Gateways (1-Month Delivery Milestone): </w:t>
+      </w:r>
+      <w:r>
+        <w:rPr>
+          <w:rFonts w:ascii="Calibri" w:hAnsi="Calibri"/>
+          <w:color w:val="1E293B"/>
+          <w:sz w:val="17"/>
+        </w:rPr>
+        <w:t>Engineered, integrated, and certified 7 distinct New Zealand and Australia-based payment gateways and BNPL platforms within a single 1-month milestone—ensuring automated invoice matching, instant webhook reconciliation, and PCI-DSS compliance.</w:t>
+      </w:r>
+    </w:p>
+    <w:p>
+      <w:pPr>
+        <w:pStyle w:val="ListBullet"/>
+        <w:spacing w:before="0" w:after="24" w:line="264" w:lineRule="auto"/>
       </w:pPr>
       <w:r>
         <w:rPr>
@@ -786,13 +832,13 @@
           <w:color w:val="1E293B"/>
           <w:sz w:val="17"/>
         </w:rPr>
-        <w:t>Architected bidirectional integration bridges linking Odoo ERP to clients' in-house proprietary software, warehouse management systems (WMS), and legacy SQL databases. Designed asynchronous queue handlers and data reconcilers handling catalog, on-hand inventory quants, and live order streaming with zero data divergence.</w:t>
+        <w:t>Architected bidirectional integration bridges linking Odoo ERP to clients' in-house proprietary software, warehouse management systems (WMS), and legacy SQL databases with asynchronous queue handlers and real-time inventory reconcilers.</w:t>
       </w:r>
     </w:p>
     <w:p>
       <w:pPr>
         <w:pStyle w:val="ListBullet"/>
-        <w:spacing w:before="0" w:after="30" w:line="269" w:lineRule="auto"/>
+        <w:spacing w:before="0" w:after="24" w:line="264" w:lineRule="auto"/>
       </w:pPr>
       <w:r>
         <w:rPr>
@@ -809,13 +855,13 @@
           <w:color w:val="1E293B"/>
           <w:sz w:val="17"/>
         </w:rPr>
-        <w:t>Spearheaded real-time API integrations connecting Odoo ERP with leading New Zealand marketplaces (Kogan and Tradevine). Handled automated product mapping, multi-warehouse stock reservation sync, order fulfillment webhooks, and tracking notification dispatch.</w:t>
+        <w:t>Spearheaded real-time API integrations connecting Odoo ERP with leading New Zealand marketplaces (Kogan and Tradevine), automating catalog mapping, multi-warehouse stock reservation sync, and order fulfillment webhooks.</w:t>
       </w:r>
     </w:p>
     <w:p>
       <w:pPr>
         <w:pStyle w:val="ListBullet"/>
-        <w:spacing w:before="0" w:after="30" w:line="269" w:lineRule="auto"/>
+        <w:spacing w:before="0" w:after="24" w:line="264" w:lineRule="auto"/>
       </w:pPr>
       <w:r>
         <w:rPr>
@@ -832,13 +878,13 @@
           <w:color w:val="1E293B"/>
           <w:sz w:val="17"/>
         </w:rPr>
-        <w:t>Architected and deployed a universal MCP server exposing Odoo ORM schemas and database models safely to external AI agent platforms (Claude Code, Gemini Enterprise, Antigravity, Cline, Puku). Enabled automated external natural language querying, schema inspection, and task orchestration.</w:t>
+        <w:t>Architected and deployed a universal MCP server exposing Odoo ORM schemas and database models safely to external AI agent platforms (Claude Code, Gemini Enterprise, Antigravity, Cline, Puku) for automated schema inspection and task orchestration.</w:t>
       </w:r>
     </w:p>
     <w:p>
       <w:pPr>
         <w:pStyle w:val="ListBullet"/>
-        <w:spacing w:before="0" w:after="30" w:line="269" w:lineRule="auto"/>
+        <w:spacing w:before="0" w:after="24" w:line="264" w:lineRule="auto"/>
       </w:pPr>
       <w:r>
         <w:rPr>
@@ -859,29 +905,6 @@
       </w:r>
     </w:p>
     <w:p>
-      <w:pPr>
-        <w:pStyle w:val="ListBullet"/>
-        <w:spacing w:before="0" w:after="30" w:line="269" w:lineRule="auto"/>
-      </w:pPr>
-      <w:r>
-        <w:rPr>
-          <w:rFonts w:ascii="Calibri" w:hAnsi="Calibri"/>
-          <w:b/>
-          <w:color w:val="1E293B"/>
-          <w:sz w:val="17"/>
-        </w:rPr>
-        <w:t xml:space="preserve">High-Performance Mobile &amp; E-Commerce Integration (Flutter &amp; Magento 2+): </w:t>
-      </w:r>
-      <w:r>
-        <w:rPr>
-          <w:rFonts w:ascii="Calibri" w:hAnsi="Calibri"/>
-          <w:color w:val="1E293B"/>
-          <w:sz w:val="17"/>
-        </w:rPr>
-        <w:t>Built custom REST API layers in Odoo to power a cross-platform Flutter field mobile application (OpenStreetMap route tracking, offline queueing, push notifications) and previously architected high-performance mobile APIs on Magento 2+ backend systems.</w:t>
-      </w:r>
-    </w:p>
-    <w:p>
       <w:r>
         <w:br w:type="page"/>
       </w:r>
@@ -889,7 +912,7 @@
     <w:p>
       <w:pPr>
         <w:keepNext/>
-        <w:spacing w:before="0" w:after="60"/>
+        <w:spacing w:before="0" w:after="50"/>
         <w:pBdr>
           <w:bottom w:val="single" w:sz="6" w:space="1" w:color="CBD5E1"/>
         </w:pBdr>
@@ -899,7 +922,7 @@
           <w:rFonts w:ascii="Arial" w:hAnsi="Arial"/>
           <w:b/>
           <w:color w:val="0F172A"/>
-          <w:sz w:val="19"/>
+          <w:sz w:val="18"/>
         </w:rPr>
         <w:t>PROFESSIONAL LEADERSHIP &amp; ENGINEERING EXPERIENCE</w:t>
       </w:r>
@@ -914,7 +937,7 @@
           <w:rFonts w:ascii="Arial" w:hAnsi="Arial"/>
           <w:b/>
           <w:color w:val="0F172A"/>
-          <w:sz w:val="20"/>
+          <w:sz w:val="19"/>
         </w:rPr>
         <w:t>Head of Technology &amp; Lead Architect  |  Metamorphosis Ltd.</w:t>
       </w:r>
@@ -923,7 +946,7 @@
           <w:rFonts w:ascii="Calibri" w:hAnsi="Calibri"/>
           <w:b/>
           <w:color w:val="2563EB"/>
-          <w:sz w:val="18"/>
+          <w:sz w:val="17"/>
         </w:rPr>
         <w:t xml:space="preserve">  [Feb 2026 – Present]</w:t>
       </w:r>
@@ -931,7 +954,7 @@
     <w:p>
       <w:pPr>
         <w:pStyle w:val="ListBullet"/>
-        <w:spacing w:before="0" w:after="30" w:line="269" w:lineRule="auto"/>
+        <w:spacing w:before="0" w:after="24" w:line="264" w:lineRule="auto"/>
       </w:pPr>
       <w:r>
         <w:rPr>
@@ -948,13 +971,36 @@
           <w:color w:val="1E293B"/>
           <w:sz w:val="17"/>
         </w:rPr>
-        <w:t>Directing engineering teams delivering high-consequence Odoo ERP customization projects for 85+ global and domestic enterprise clients (Bangladesh, New Zealand, Saudi Arabia, Spain, South Sudan). Personally architecting core R&amp;D workflows, custom themes, and 3rd-party integrations.</w:t>
+        <w:t>Directing engineering teams delivering high-consequence Odoo ERP customization projects for 85+ global and domestic enterprise clients (Bangladesh, New Zealand, Saudi Arabia, Spain, South Sudan). Personally designing core R&amp;D workflows, custom themes, and proprietary integrations.</w:t>
       </w:r>
     </w:p>
     <w:p>
       <w:pPr>
         <w:pStyle w:val="ListBullet"/>
-        <w:spacing w:before="0" w:after="30" w:line="269" w:lineRule="auto"/>
+        <w:spacing w:before="0" w:after="24" w:line="264" w:lineRule="auto"/>
+      </w:pPr>
+      <w:r>
+        <w:rPr>
+          <w:rFonts w:ascii="Calibri" w:hAnsi="Calibri"/>
+          <w:b/>
+          <w:color w:val="1E293B"/>
+          <w:sz w:val="17"/>
+        </w:rPr>
+        <w:t xml:space="preserve">Rapid Enterprise Integrations (SAP &amp; 7 NZ/AUS Payment Gateways): </w:t>
+      </w:r>
+      <w:r>
+        <w:rPr>
+          <w:rFonts w:ascii="Calibri" w:hAnsi="Calibri"/>
+          <w:color w:val="1E293B"/>
+          <w:sz w:val="17"/>
+        </w:rPr>
+        <w:t>Directed the rapid delivery of complex integrations including full SAP sync (customers, orders, deliveries, payments) within 1 month, and the simultaneous rollout of 7 international NZ &amp; AUS payment gateways within a 1-month milestone.</w:t>
+      </w:r>
+    </w:p>
+    <w:p>
+      <w:pPr>
+        <w:pStyle w:val="ListBullet"/>
+        <w:spacing w:before="0" w:after="24" w:line="264" w:lineRule="auto"/>
       </w:pPr>
       <w:r>
         <w:rPr>
@@ -977,30 +1023,7 @@
     <w:p>
       <w:pPr>
         <w:pStyle w:val="ListBullet"/>
-        <w:spacing w:before="0" w:after="30" w:line="269" w:lineRule="auto"/>
-      </w:pPr>
-      <w:r>
-        <w:rPr>
-          <w:rFonts w:ascii="Calibri" w:hAnsi="Calibri"/>
-          <w:b/>
-          <w:color w:val="1E293B"/>
-          <w:sz w:val="17"/>
-        </w:rPr>
-        <w:t xml:space="preserve">Proprietary Systems &amp; 3rd-Party Integration Architecture: </w:t>
-      </w:r>
-      <w:r>
-        <w:rPr>
-          <w:rFonts w:ascii="Calibri" w:hAnsi="Calibri"/>
-          <w:color w:val="1E293B"/>
-          <w:sz w:val="17"/>
-        </w:rPr>
-        <w:t>Lead technical architect for all custom interface layers connecting Odoo with third-party proprietary systems, banking APIs, regional logistics providers, and external e-commerce engines.</w:t>
-      </w:r>
-    </w:p>
-    <w:p>
-      <w:pPr>
-        <w:pStyle w:val="ListBullet"/>
-        <w:spacing w:before="0" w:after="30" w:line="269" w:lineRule="auto"/>
+        <w:spacing w:before="0" w:after="24" w:line="264" w:lineRule="auto"/>
       </w:pPr>
       <w:r>
         <w:rPr>
@@ -1023,7 +1046,7 @@
     <w:p>
       <w:pPr>
         <w:pStyle w:val="ListBullet"/>
-        <w:spacing w:before="0" w:after="30" w:line="269" w:lineRule="auto"/>
+        <w:spacing w:before="0" w:after="24" w:line="264" w:lineRule="auto"/>
       </w:pPr>
       <w:r>
         <w:rPr>
@@ -1040,20 +1063,20 @@
           <w:color w:val="1E293B"/>
           <w:sz w:val="17"/>
         </w:rPr>
-        <w:t>Architected Nginx upstream routing dividing server workers into dedicated pools (isolating CPU-intensive external API/e-commerce sync from internal administrative back-office Gunicorn workers), eliminating downtime and latency spikes.</w:t>
+        <w:t>Designed Nginx upstream routing dividing server workers into dedicated pools (isolating CPU-intensive external API/e-commerce sync from internal administrative back-office Gunicorn workers), eliminating downtime and latency spikes.</w:t>
       </w:r>
     </w:p>
     <w:p>
       <w:pPr>
         <w:keepNext/>
-        <w:spacing w:before="100" w:after="20"/>
+        <w:spacing w:before="90" w:after="20"/>
       </w:pPr>
       <w:r>
         <w:rPr>
           <w:rFonts w:ascii="Arial" w:hAnsi="Arial"/>
           <w:b/>
           <w:color w:val="0F172A"/>
-          <w:sz w:val="19"/>
+          <w:sz w:val="18"/>
         </w:rPr>
         <w:t>Sr. Odoo Systems Engineer &amp; DevOps Lead  |  Metamorphosis Ltd.</w:t>
       </w:r>
@@ -1062,7 +1085,7 @@
           <w:rFonts w:ascii="Calibri" w:hAnsi="Calibri"/>
           <w:b/>
           <w:color w:val="2563EB"/>
-          <w:sz w:val="18"/>
+          <w:sz w:val="17"/>
         </w:rPr>
         <w:t xml:space="preserve">  [Oct 2023 – Jan 2026]</w:t>
       </w:r>
@@ -1070,7 +1093,7 @@
     <w:p>
       <w:pPr>
         <w:pStyle w:val="ListBullet"/>
-        <w:spacing w:before="0" w:after="30" w:line="269" w:lineRule="auto"/>
+        <w:spacing w:before="0" w:after="24" w:line="264" w:lineRule="auto"/>
       </w:pPr>
       <w:r>
         <w:rPr>
@@ -1093,7 +1116,7 @@
     <w:p>
       <w:pPr>
         <w:pStyle w:val="ListBullet"/>
-        <w:spacing w:before="0" w:after="30" w:line="269" w:lineRule="auto"/>
+        <w:spacing w:before="0" w:after="24" w:line="264" w:lineRule="auto"/>
       </w:pPr>
       <w:r>
         <w:rPr>
@@ -1116,7 +1139,7 @@
     <w:p>
       <w:pPr>
         <w:pStyle w:val="ListBullet"/>
-        <w:spacing w:before="0" w:after="30" w:line="269" w:lineRule="auto"/>
+        <w:spacing w:before="0" w:after="24" w:line="264" w:lineRule="auto"/>
       </w:pPr>
       <w:r>
         <w:rPr>
@@ -1139,14 +1162,14 @@
     <w:p>
       <w:pPr>
         <w:keepNext/>
-        <w:spacing w:before="100" w:after="20"/>
+        <w:spacing w:before="90" w:after="20"/>
       </w:pPr>
       <w:r>
         <w:rPr>
           <w:rFonts w:ascii="Arial" w:hAnsi="Arial"/>
           <w:b/>
           <w:color w:val="0F172A"/>
-          <w:sz w:val="19"/>
+          <w:sz w:val="18"/>
         </w:rPr>
         <w:t>Full Stack Odoo Developer  |  Metamorphosis Ltd.</w:t>
       </w:r>
@@ -1155,7 +1178,7 @@
           <w:rFonts w:ascii="Calibri" w:hAnsi="Calibri"/>
           <w:b/>
           <w:color w:val="2563EB"/>
-          <w:sz w:val="18"/>
+          <w:sz w:val="17"/>
         </w:rPr>
         <w:t xml:space="preserve">  [2022 – Sep 2023]</w:t>
       </w:r>
@@ -1163,7 +1186,7 @@
     <w:p>
       <w:pPr>
         <w:pStyle w:val="ListBullet"/>
-        <w:spacing w:before="0" w:after="30" w:line="269" w:lineRule="auto"/>
+        <w:spacing w:before="0" w:after="24" w:line="264" w:lineRule="auto"/>
       </w:pPr>
       <w:r>
         <w:rPr>
@@ -1186,7 +1209,7 @@
     <w:p>
       <w:pPr>
         <w:pStyle w:val="ListBullet"/>
-        <w:spacing w:before="0" w:after="30" w:line="269" w:lineRule="auto"/>
+        <w:spacing w:before="0" w:after="24" w:line="264" w:lineRule="auto"/>
       </w:pPr>
       <w:r>
         <w:rPr>
@@ -1209,14 +1232,14 @@
     <w:p>
       <w:pPr>
         <w:keepNext/>
-        <w:spacing w:before="100" w:after="20"/>
+        <w:spacing w:before="90" w:after="20"/>
       </w:pPr>
       <w:r>
         <w:rPr>
           <w:rFonts w:ascii="Arial" w:hAnsi="Arial"/>
           <w:b/>
           <w:color w:val="0F172A"/>
-          <w:sz w:val="19"/>
+          <w:sz w:val="18"/>
         </w:rPr>
         <w:t>Software Engineer &amp; Systems Specialist  |  MetaKave</w:t>
       </w:r>
@@ -1225,7 +1248,7 @@
           <w:rFonts w:ascii="Calibri" w:hAnsi="Calibri"/>
           <w:b/>
           <w:color w:val="2563EB"/>
-          <w:sz w:val="18"/>
+          <w:sz w:val="17"/>
         </w:rPr>
         <w:t xml:space="preserve">  [2020 – 2021]</w:t>
       </w:r>
@@ -1233,7 +1256,7 @@
     <w:p>
       <w:pPr>
         <w:pStyle w:val="ListBullet"/>
-        <w:spacing w:before="0" w:after="30" w:line="269" w:lineRule="auto"/>
+        <w:spacing w:before="0" w:after="24" w:line="264" w:lineRule="auto"/>
       </w:pPr>
       <w:r>
         <w:rPr>
@@ -1256,14 +1279,14 @@
     <w:p>
       <w:pPr>
         <w:keepNext/>
-        <w:spacing w:before="100" w:after="20"/>
+        <w:spacing w:before="90" w:after="20"/>
       </w:pPr>
       <w:r>
         <w:rPr>
           <w:rFonts w:ascii="Arial" w:hAnsi="Arial"/>
           <w:b/>
           <w:color w:val="0F172A"/>
-          <w:sz w:val="19"/>
+          <w:sz w:val="18"/>
         </w:rPr>
         <w:t>IT Executive  |  Aptech Industries</w:t>
       </w:r>
@@ -1272,7 +1295,7 @@
           <w:rFonts w:ascii="Calibri" w:hAnsi="Calibri"/>
           <w:b/>
           <w:color w:val="2563EB"/>
-          <w:sz w:val="18"/>
+          <w:sz w:val="17"/>
         </w:rPr>
         <w:t xml:space="preserve">  [Jun 2017 – Sep 2019]</w:t>
       </w:r>
@@ -1280,7 +1303,7 @@
     <w:p>
       <w:pPr>
         <w:pStyle w:val="ListBullet"/>
-        <w:spacing w:before="0" w:after="30" w:line="269" w:lineRule="auto"/>
+        <w:spacing w:before="0" w:after="24" w:line="264" w:lineRule="auto"/>
       </w:pPr>
       <w:r>
         <w:rPr>
@@ -1303,7 +1326,7 @@
     <w:p>
       <w:pPr>
         <w:keepNext/>
-        <w:spacing w:before="100" w:after="60"/>
+        <w:spacing w:before="90" w:after="50"/>
         <w:pBdr>
           <w:bottom w:val="single" w:sz="6" w:space="1" w:color="CBD5E1"/>
         </w:pBdr>
@@ -1313,7 +1336,7 @@
           <w:rFonts w:ascii="Arial" w:hAnsi="Arial"/>
           <w:b/>
           <w:color w:val="0F172A"/>
-          <w:sz w:val="19"/>
+          <w:sz w:val="18"/>
         </w:rPr>
         <w:t>EDUCATION, CERTIFICATIONS &amp; RESEARCH</w:t>
       </w:r>
@@ -1321,7 +1344,7 @@
     <w:p>
       <w:pPr>
         <w:pStyle w:val="ListBullet"/>
-        <w:spacing w:before="0" w:after="30" w:line="269" w:lineRule="auto"/>
+        <w:spacing w:before="0" w:after="24" w:line="264" w:lineRule="auto"/>
       </w:pPr>
       <w:r>
         <w:rPr>
@@ -1344,7 +1367,7 @@
     <w:p>
       <w:pPr>
         <w:pStyle w:val="ListBullet"/>
-        <w:spacing w:before="0" w:after="30" w:line="269" w:lineRule="auto"/>
+        <w:spacing w:before="0" w:after="24" w:line="264" w:lineRule="auto"/>
       </w:pPr>
       <w:r>
         <w:rPr>
@@ -1367,7 +1390,7 @@
     <w:p>
       <w:pPr>
         <w:pStyle w:val="ListBullet"/>
-        <w:spacing w:before="0" w:after="30" w:line="269" w:lineRule="auto"/>
+        <w:spacing w:before="0" w:after="24" w:line="264" w:lineRule="auto"/>
       </w:pPr>
       <w:r>
         <w:rPr>
@@ -1390,7 +1413,7 @@
     <w:p>
       <w:pPr>
         <w:pStyle w:val="ListBullet"/>
-        <w:spacing w:before="0" w:after="30" w:line="269" w:lineRule="auto"/>
+        <w:spacing w:before="0" w:after="24" w:line="264" w:lineRule="auto"/>
       </w:pPr>
       <w:r>
         <w:rPr>
@@ -1412,21 +1435,21 @@
     </w:p>
     <w:p>
       <w:pPr>
-        <w:spacing w:before="120" w:after="0"/>
+        <w:spacing w:before="100" w:after="0"/>
         <w:jc w:val="center"/>
       </w:pPr>
       <w:r>
         <w:rPr>
           <w:rFonts w:ascii="Calibri" w:hAnsi="Calibri"/>
           <w:color w:val="64748B"/>
-          <w:sz w:val="15"/>
+          <w:sz w:val="14"/>
         </w:rPr>
         <w:t>Md Niaj Shahriar Shishir  |  Tech Lead — Odoo Customization &amp; Integrations  |  Portfolio: nsrshishir.github.io/nsrshishir</w:t>
       </w:r>
     </w:p>
     <w:sectPr>
       <w:pgSz w:w="11909" w:h="16834"/>
-      <w:pgMar w:top="691" w:right="792" w:bottom="691" w:left="792" w:header="720" w:footer="720" w:gutter="0"/>
+      <w:pgMar w:top="634" w:right="749" w:bottom="634" w:left="749" w:header="720" w:footer="720" w:gutter="0"/>
       <w:cols w:space="720"/>
       <w:docGrid w:linePitch="360"/>
     </w:sectPr>

</xml_diff>

<commit_message>
[REF] cv: enrich Tech Lead DOCX CV with SFA integration, SMS marketing gateways, and omnichannel cross-border POS
</commit_message>
<xml_diff>
--- a/Md_Niaj_Shahriar_Shishir_Tech_Lead_Odoo_Customization_Integrations.docx
+++ b/Md_Niaj_Shahriar_Shishir_Tech_Lead_Odoo_Customization_Integrations.docx
@@ -10,13 +10,13 @@
         <w:tblLook w:firstColumn="1" w:firstRow="1" w:lastColumn="0" w:lastRow="0" w:noHBand="0" w:noVBand="1" w:val="04A0"/>
       </w:tblPr>
       <w:tblGrid>
-        <w:gridCol w:w="5205"/>
-        <w:gridCol w:w="5205"/>
+        <w:gridCol w:w="5234"/>
+        <w:gridCol w:w="5234"/>
       </w:tblGrid>
       <w:tr>
         <w:tc>
           <w:tcPr>
-            <w:tcW w:type="dxa" w:w="6552"/>
+            <w:tcW w:type="dxa" w:w="6696"/>
             <w:tcBorders>
               <w:top w:val="none"/>
               <w:left w:val="none"/>
@@ -24,10 +24,10 @@
               <w:right w:val="none"/>
             </w:tcBorders>
             <w:tcMar>
-              <w:top w:w="15" w:type="dxa"/>
-              <w:bottom w:w="30" w:type="dxa"/>
+              <w:top w:w="10" w:type="dxa"/>
+              <w:bottom w:w="25" w:type="dxa"/>
               <w:left w:w="0" w:type="dxa"/>
-              <w:right w:w="30" w:type="dxa"/>
+              <w:right w:w="25" w:type="dxa"/>
             </w:tcMar>
           </w:tcPr>
           <w:p>
@@ -39,7 +39,7 @@
                 <w:rFonts w:ascii="Arial" w:hAnsi="Arial"/>
                 <w:b/>
                 <w:color w:val="0F172A"/>
-                <w:sz w:val="35"/>
+                <w:sz w:val="34"/>
               </w:rPr>
               <w:t>Md Niaj Shahriar Shishir</w:t>
             </w:r>
@@ -74,7 +74,7 @@
         </w:tc>
         <w:tc>
           <w:tcPr>
-            <w:tcW w:type="dxa" w:w="3859"/>
+            <w:tcW w:type="dxa" w:w="3773"/>
             <w:tcBorders>
               <w:top w:val="none"/>
               <w:left w:val="none"/>
@@ -82,9 +82,9 @@
               <w:right w:val="none"/>
             </w:tcBorders>
             <w:tcMar>
-              <w:top w:w="15" w:type="dxa"/>
-              <w:bottom w:w="30" w:type="dxa"/>
-              <w:left w:w="30" w:type="dxa"/>
+              <w:top w:w="10" w:type="dxa"/>
+              <w:bottom w:w="25" w:type="dxa"/>
+              <w:left w:w="25" w:type="dxa"/>
               <w:right w:w="0" w:type="dxa"/>
             </w:tcMar>
           </w:tcPr>
@@ -232,7 +232,7 @@
     </w:tbl>
     <w:p>
       <w:pPr>
-        <w:spacing w:before="60" w:after="80"/>
+        <w:spacing w:before="40" w:after="80"/>
         <w:pBdr>
           <w:bottom w:val="single" w:sz="10" w:space="1" w:color="2563EB"/>
         </w:pBdr>
@@ -246,15 +246,15 @@
         <w:tblLook w:firstColumn="1" w:firstRow="1" w:lastColumn="0" w:lastRow="0" w:noHBand="0" w:noVBand="1" w:val="04A0"/>
       </w:tblPr>
       <w:tblGrid>
-        <w:gridCol w:w="2603"/>
-        <w:gridCol w:w="2603"/>
-        <w:gridCol w:w="2603"/>
-        <w:gridCol w:w="2603"/>
+        <w:gridCol w:w="2617"/>
+        <w:gridCol w:w="2617"/>
+        <w:gridCol w:w="2617"/>
+        <w:gridCol w:w="2617"/>
       </w:tblGrid>
       <w:tr>
         <w:tc>
           <w:tcPr>
-            <w:tcW w:type="dxa" w:w="2592"/>
+            <w:tcW w:type="dxa" w:w="2606"/>
             <w:shd w:fill="F1F5F9"/>
             <w:tcBorders>
               <w:top w:val="none"/>
@@ -263,10 +263,10 @@
               <w:right w:val="none"/>
             </w:tcBorders>
             <w:tcMar>
-              <w:top w:w="45" w:type="dxa"/>
-              <w:bottom w:w="45" w:type="dxa"/>
-              <w:left w:w="35" w:type="dxa"/>
-              <w:right w:w="35" w:type="dxa"/>
+              <w:top w:w="40" w:type="dxa"/>
+              <w:bottom w:w="40" w:type="dxa"/>
+              <w:left w:w="30" w:type="dxa"/>
+              <w:right w:w="30" w:type="dxa"/>
             </w:tcMar>
           </w:tcPr>
           <w:p>
@@ -302,7 +302,7 @@
         </w:tc>
         <w:tc>
           <w:tcPr>
-            <w:tcW w:type="dxa" w:w="2592"/>
+            <w:tcW w:type="dxa" w:w="2606"/>
             <w:shd w:fill="F1F5F9"/>
             <w:tcBorders>
               <w:top w:val="none"/>
@@ -311,10 +311,10 @@
               <w:right w:val="none"/>
             </w:tcBorders>
             <w:tcMar>
-              <w:top w:w="45" w:type="dxa"/>
-              <w:bottom w:w="45" w:type="dxa"/>
-              <w:left w:w="35" w:type="dxa"/>
-              <w:right w:w="35" w:type="dxa"/>
+              <w:top w:w="40" w:type="dxa"/>
+              <w:bottom w:w="40" w:type="dxa"/>
+              <w:left w:w="30" w:type="dxa"/>
+              <w:right w:w="30" w:type="dxa"/>
             </w:tcMar>
           </w:tcPr>
           <w:p>
@@ -344,13 +344,13 @@
                 <w:color w:val="2563EB"/>
                 <w:sz w:val="12"/>
               </w:rPr>
-              <w:t>1-MONTH INTEGRATION WINS</w:t>
+              <w:t>1-MONTH RAPID INTEGRATIONS</w:t>
             </w:r>
           </w:p>
         </w:tc>
         <w:tc>
           <w:tcPr>
-            <w:tcW w:type="dxa" w:w="2592"/>
+            <w:tcW w:type="dxa" w:w="2606"/>
             <w:shd w:fill="F1F5F9"/>
             <w:tcBorders>
               <w:top w:val="none"/>
@@ -359,10 +359,10 @@
               <w:right w:val="none"/>
             </w:tcBorders>
             <w:tcMar>
-              <w:top w:w="45" w:type="dxa"/>
-              <w:bottom w:w="45" w:type="dxa"/>
-              <w:left w:w="35" w:type="dxa"/>
-              <w:right w:w="35" w:type="dxa"/>
+              <w:top w:w="40" w:type="dxa"/>
+              <w:bottom w:w="40" w:type="dxa"/>
+              <w:left w:w="30" w:type="dxa"/>
+              <w:right w:w="30" w:type="dxa"/>
             </w:tcMar>
           </w:tcPr>
           <w:p>
@@ -398,7 +398,7 @@
         </w:tc>
         <w:tc>
           <w:tcPr>
-            <w:tcW w:type="dxa" w:w="2592"/>
+            <w:tcW w:type="dxa" w:w="2606"/>
             <w:shd w:fill="F1F5F9"/>
             <w:tcBorders>
               <w:top w:val="none"/>
@@ -407,10 +407,10 @@
               <w:right w:val="none"/>
             </w:tcBorders>
             <w:tcMar>
-              <w:top w:w="45" w:type="dxa"/>
-              <w:bottom w:w="45" w:type="dxa"/>
-              <w:left w:w="35" w:type="dxa"/>
-              <w:right w:w="35" w:type="dxa"/>
+              <w:top w:w="40" w:type="dxa"/>
+              <w:bottom w:w="40" w:type="dxa"/>
+              <w:left w:w="30" w:type="dxa"/>
+              <w:right w:w="30" w:type="dxa"/>
             </w:tcMar>
           </w:tcPr>
           <w:p>
@@ -449,7 +449,7 @@
     <w:p>
       <w:pPr>
         <w:keepNext/>
-        <w:spacing w:before="100" w:after="50"/>
+        <w:spacing w:before="80" w:after="40"/>
         <w:pBdr>
           <w:bottom w:val="single" w:sz="6" w:space="1" w:color="CBD5E1"/>
         </w:pBdr>
@@ -466,22 +466,22 @@
     </w:p>
     <w:p>
       <w:pPr>
-        <w:spacing w:before="20" w:after="60" w:line="269" w:lineRule="auto"/>
+        <w:spacing w:before="20" w:after="50" w:line="266" w:lineRule="auto"/>
         <w:jc w:val="both"/>
       </w:pPr>
       <w:r>
         <w:rPr>
           <w:rFonts w:ascii="Calibri" w:hAnsi="Calibri"/>
           <w:color w:val="1E293B"/>
-          <w:sz w:val="17"/>
+          <w:sz w:val="16"/>
         </w:rPr>
-        <w:t>High-impact Technical Lead and Certified Odoo Consultant (Solution Architect by Practice) with 7+ years of hands-on engineering mastery leading complex Odoo customization projects and architecting mission-critical integrations between Odoo ERP and third-party enterprise proprietary systems. Proven authority in custom Odoo development, having hand-coded 900+ custom modules spanning bespoke business logic, automated workflow engines, OWL 2 interfaces, and specialized financial reports for 85+ global and domestic enterprise clients. Delivered high-stakes enterprise milestones including an end-to-end SAP ERP integration (customers, sales orders, outbound deliveries, and payments) delivered in just 1 month, and certified 7 distinct international NZ &amp; AUS payment gateways within a single 1-month milestone. Led 14+ major multi-version Odoo Enterprise upgrades (v13.0 to v19.0) with zero data loss. Expert in resilient architectures (REST, XML-RPC, JSON-RPC, Webhooks, ETL queues) linking Odoo with legacy back-offices, proprietary WMS, regional marketplaces (Kogan, Tradevine), and government compliance portals (ZATCA, NBR). Proven leader driving hyper-velocity teams that compress 3-month scopes into 2–3 weeks with zero-defect quality via the Agentic E3 Framework.</w:t>
+        <w:t>High-impact Technical Lead and Certified Odoo Consultant (Solution Architect by Practice) with 7+ years of hands-on engineering mastery leading complex Odoo customization projects and architecting mission-critical integrations between Odoo ERP and third-party proprietary enterprise systems. Proven authority in custom Odoo development, having hand-coded 900+ custom modules spanning bespoke business logic, automated workflow engines, OWL 2 interfaces, and specialized financial reports for 85+ global and domestic enterprise clients. Delivered high-stakes enterprise milestones including an end-to-end SAP ERP integration (customers, sales orders, outbound deliveries, and payments) delivered in just 1 month, and certified 7 distinct international NZ &amp; AUS payment gateways within a single 1-month milestone. Spearheaded real-time third-party Sales Force Automation (SFA) order sync, telecom SMS marketing gateways, and cross-border omnichannel retail POS platforms. Led 14+ major multi-version Odoo Enterprise upgrades (v13.0 to v19.0) with zero data loss. Expert in resilient architectures (REST, XML-RPC, JSON-RPC, Webhooks, ETL queues) linking Odoo with legacy back-offices, proprietary WMS, regional marketplaces (Kogan, Tradevine), and government compliance portals (ZATCA, NBR). Driving hyper-velocity teams that compress 3-month scopes into 2–3 weeks via the Agentic E3 Framework.</w:t>
       </w:r>
     </w:p>
     <w:p>
       <w:pPr>
         <w:keepNext/>
-        <w:spacing w:before="80" w:after="50"/>
+        <w:spacing w:before="70" w:after="40"/>
         <w:pBdr>
           <w:bottom w:val="single" w:sz="6" w:space="1" w:color="CBD5E1"/>
         </w:pBdr>
@@ -504,13 +504,13 @@
         <w:tblLook w:firstColumn="1" w:firstRow="1" w:lastColumn="0" w:lastRow="0" w:noHBand="0" w:noVBand="1" w:val="04A0"/>
       </w:tblPr>
       <w:tblGrid>
-        <w:gridCol w:w="5205"/>
-        <w:gridCol w:w="5205"/>
+        <w:gridCol w:w="5234"/>
+        <w:gridCol w:w="5234"/>
       </w:tblGrid>
       <w:tr>
         <w:tc>
           <w:tcPr>
-            <w:tcW w:type="dxa" w:w="5184"/>
+            <w:tcW w:type="dxa" w:w="5227"/>
             <w:tcBorders>
               <w:top w:val="none"/>
               <w:left w:val="none"/>
@@ -518,15 +518,15 @@
               <w:right w:val="none"/>
             </w:tcBorders>
             <w:tcMar>
-              <w:top w:w="15" w:type="dxa"/>
-              <w:bottom w:w="20" w:type="dxa"/>
-              <w:left w:w="25" w:type="dxa"/>
-              <w:right w:w="35" w:type="dxa"/>
+              <w:top w:w="12" w:type="dxa"/>
+              <w:bottom w:w="16" w:type="dxa"/>
+              <w:left w:w="20" w:type="dxa"/>
+              <w:right w:w="30" w:type="dxa"/>
             </w:tcMar>
           </w:tcPr>
           <w:p>
             <w:pPr>
-              <w:spacing w:before="0" w:after="20" w:line="264" w:lineRule="auto"/>
+              <w:spacing w:before="0" w:after="10" w:line="259" w:lineRule="auto"/>
             </w:pPr>
             <w:r>
               <w:rPr>
@@ -549,7 +549,7 @@
         </w:tc>
         <w:tc>
           <w:tcPr>
-            <w:tcW w:type="dxa" w:w="5184"/>
+            <w:tcW w:type="dxa" w:w="5227"/>
             <w:tcBorders>
               <w:top w:val="none"/>
               <w:left w:val="none"/>
@@ -557,15 +557,15 @@
               <w:right w:val="none"/>
             </w:tcBorders>
             <w:tcMar>
-              <w:top w:w="15" w:type="dxa"/>
-              <w:bottom w:w="20" w:type="dxa"/>
-              <w:left w:w="25" w:type="dxa"/>
-              <w:right w:w="35" w:type="dxa"/>
+              <w:top w:w="12" w:type="dxa"/>
+              <w:bottom w:w="16" w:type="dxa"/>
+              <w:left w:w="20" w:type="dxa"/>
+              <w:right w:w="30" w:type="dxa"/>
             </w:tcMar>
           </w:tcPr>
           <w:p>
             <w:pPr>
-              <w:spacing w:before="0" w:after="20" w:line="264" w:lineRule="auto"/>
+              <w:spacing w:before="0" w:after="10" w:line="259" w:lineRule="auto"/>
             </w:pPr>
             <w:r>
               <w:rPr>
@@ -582,7 +582,7 @@
                 <w:color w:val="1E293B"/>
                 <w:sz w:val="16"/>
               </w:rPr>
-              <w:t>Direct bidirectional connectors with SAP, legacy ERPs, custom WMS/TMS; REST/SOAP/JSON-RPC/XML-RPC APIs, Webhook event pipelines, ETL queues, payload mapping.</w:t>
+              <w:t>Direct bidirectional connectors with SAP, third-party SFA (Recibo), custom WMS/TMS; REST/SOAP/JSON-RPC/XML-RPC APIs, Webhook event pipelines, ETL queues, payload mapping.</w:t>
             </w:r>
           </w:p>
         </w:tc>
@@ -590,7 +590,7 @@
       <w:tr>
         <w:tc>
           <w:tcPr>
-            <w:tcW w:type="dxa" w:w="5184"/>
+            <w:tcW w:type="dxa" w:w="5227"/>
             <w:tcBorders>
               <w:top w:val="none"/>
               <w:left w:val="none"/>
@@ -598,15 +598,15 @@
               <w:right w:val="none"/>
             </w:tcBorders>
             <w:tcMar>
-              <w:top w:w="15" w:type="dxa"/>
-              <w:bottom w:w="20" w:type="dxa"/>
-              <w:left w:w="25" w:type="dxa"/>
-              <w:right w:w="35" w:type="dxa"/>
+              <w:top w:w="12" w:type="dxa"/>
+              <w:bottom w:w="16" w:type="dxa"/>
+              <w:left w:w="20" w:type="dxa"/>
+              <w:right w:w="30" w:type="dxa"/>
             </w:tcMar>
           </w:tcPr>
           <w:p>
             <w:pPr>
-              <w:spacing w:before="0" w:after="20" w:line="264" w:lineRule="auto"/>
+              <w:spacing w:before="0" w:after="10" w:line="259" w:lineRule="auto"/>
             </w:pPr>
             <w:r>
               <w:rPr>
@@ -629,7 +629,7 @@
         </w:tc>
         <w:tc>
           <w:tcPr>
-            <w:tcW w:type="dxa" w:w="5184"/>
+            <w:tcW w:type="dxa" w:w="5227"/>
             <w:tcBorders>
               <w:top w:val="none"/>
               <w:left w:val="none"/>
@@ -637,15 +637,15 @@
               <w:right w:val="none"/>
             </w:tcBorders>
             <w:tcMar>
-              <w:top w:w="15" w:type="dxa"/>
-              <w:bottom w:w="20" w:type="dxa"/>
-              <w:left w:w="25" w:type="dxa"/>
-              <w:right w:w="35" w:type="dxa"/>
+              <w:top w:w="12" w:type="dxa"/>
+              <w:bottom w:w="16" w:type="dxa"/>
+              <w:left w:w="20" w:type="dxa"/>
+              <w:right w:w="30" w:type="dxa"/>
             </w:tcMar>
           </w:tcPr>
           <w:p>
             <w:pPr>
-              <w:spacing w:before="0" w:after="20" w:line="264" w:lineRule="auto"/>
+              <w:spacing w:before="0" w:after="10" w:line="259" w:lineRule="auto"/>
             </w:pPr>
             <w:r>
               <w:rPr>
@@ -670,7 +670,7 @@
       <w:tr>
         <w:tc>
           <w:tcPr>
-            <w:tcW w:type="dxa" w:w="5184"/>
+            <w:tcW w:type="dxa" w:w="5227"/>
             <w:tcBorders>
               <w:top w:val="none"/>
               <w:left w:val="none"/>
@@ -678,15 +678,15 @@
               <w:right w:val="none"/>
             </w:tcBorders>
             <w:tcMar>
-              <w:top w:w="15" w:type="dxa"/>
-              <w:bottom w:w="20" w:type="dxa"/>
-              <w:left w:w="25" w:type="dxa"/>
-              <w:right w:w="35" w:type="dxa"/>
+              <w:top w:w="12" w:type="dxa"/>
+              <w:bottom w:w="16" w:type="dxa"/>
+              <w:left w:w="20" w:type="dxa"/>
+              <w:right w:w="30" w:type="dxa"/>
             </w:tcMar>
           </w:tcPr>
           <w:p>
             <w:pPr>
-              <w:spacing w:before="0" w:after="20" w:line="264" w:lineRule="auto"/>
+              <w:spacing w:before="0" w:after="10" w:line="259" w:lineRule="auto"/>
             </w:pPr>
             <w:r>
               <w:rPr>
@@ -709,7 +709,7 @@
         </w:tc>
         <w:tc>
           <w:tcPr>
-            <w:tcW w:type="dxa" w:w="5184"/>
+            <w:tcW w:type="dxa" w:w="5227"/>
             <w:tcBorders>
               <w:top w:val="none"/>
               <w:left w:val="none"/>
@@ -717,15 +717,15 @@
               <w:right w:val="none"/>
             </w:tcBorders>
             <w:tcMar>
-              <w:top w:w="15" w:type="dxa"/>
-              <w:bottom w:w="20" w:type="dxa"/>
-              <w:left w:w="25" w:type="dxa"/>
-              <w:right w:w="35" w:type="dxa"/>
+              <w:top w:w="12" w:type="dxa"/>
+              <w:bottom w:w="16" w:type="dxa"/>
+              <w:left w:w="20" w:type="dxa"/>
+              <w:right w:w="30" w:type="dxa"/>
             </w:tcMar>
           </w:tcPr>
           <w:p>
             <w:pPr>
-              <w:spacing w:before="0" w:after="20" w:line="264" w:lineRule="auto"/>
+              <w:spacing w:before="0" w:after="10" w:line="259" w:lineRule="auto"/>
             </w:pPr>
             <w:r>
               <w:rPr>
@@ -751,7 +751,7 @@
     <w:p>
       <w:pPr>
         <w:keepNext/>
-        <w:spacing w:before="80" w:after="50"/>
+        <w:spacing w:before="70" w:after="40"/>
         <w:pBdr>
           <w:bottom w:val="single" w:sz="6" w:space="1" w:color="CBD5E1"/>
         </w:pBdr>
@@ -769,14 +769,14 @@
     <w:p>
       <w:pPr>
         <w:pStyle w:val="ListBullet"/>
-        <w:spacing w:before="0" w:after="24" w:line="264" w:lineRule="auto"/>
+        <w:spacing w:before="0" w:after="20" w:line="262" w:lineRule="auto"/>
       </w:pPr>
       <w:r>
         <w:rPr>
           <w:rFonts w:ascii="Calibri" w:hAnsi="Calibri"/>
           <w:b/>
           <w:color w:val="1E293B"/>
-          <w:sz w:val="17"/>
+          <w:sz w:val="16"/>
         </w:rPr>
         <w:t xml:space="preserve">Enterprise SAP Integration (Customers, Orders, Deliveries &amp; Payments in 1 Month): </w:t>
       </w:r>
@@ -784,7 +784,7 @@
         <w:rPr>
           <w:rFonts w:ascii="Calibri" w:hAnsi="Calibri"/>
           <w:color w:val="1E293B"/>
-          <w:sz w:val="17"/>
+          <w:sz w:val="16"/>
         </w:rPr>
         <w:t>Architected and deployed an end-to-end bidirectional integration bridge between Odoo ERP and SAP enterprise system. Successfully completed full customer master sync, live sales order ingest, outbound delivery status tracking, and payment reconciliations within an aggressive 1-month delivery timeline.</w:t>
       </w:r>
@@ -792,14 +792,14 @@
     <w:p>
       <w:pPr>
         <w:pStyle w:val="ListBullet"/>
-        <w:spacing w:before="0" w:after="24" w:line="264" w:lineRule="auto"/>
+        <w:spacing w:before="0" w:after="20" w:line="262" w:lineRule="auto"/>
       </w:pPr>
       <w:r>
         <w:rPr>
           <w:rFonts w:ascii="Calibri" w:hAnsi="Calibri"/>
           <w:b/>
           <w:color w:val="1E293B"/>
-          <w:sz w:val="17"/>
+          <w:sz w:val="16"/>
         </w:rPr>
         <w:t xml:space="preserve">7 International NZ &amp; AUS Payment Gateways (1-Month Delivery Milestone): </w:t>
       </w:r>
@@ -807,7 +807,7 @@
         <w:rPr>
           <w:rFonts w:ascii="Calibri" w:hAnsi="Calibri"/>
           <w:color w:val="1E293B"/>
-          <w:sz w:val="17"/>
+          <w:sz w:val="16"/>
         </w:rPr>
         <w:t>Engineered, integrated, and certified 7 distinct New Zealand and Australia-based payment gateways and BNPL platforms within a single 1-month milestone—ensuring automated invoice matching, instant webhook reconciliation, and PCI-DSS compliance.</w:t>
       </w:r>
@@ -815,37 +815,37 @@
     <w:p>
       <w:pPr>
         <w:pStyle w:val="ListBullet"/>
-        <w:spacing w:before="0" w:after="24" w:line="264" w:lineRule="auto"/>
+        <w:spacing w:before="0" w:after="20" w:line="262" w:lineRule="auto"/>
       </w:pPr>
       <w:r>
         <w:rPr>
           <w:rFonts w:ascii="Calibri" w:hAnsi="Calibri"/>
           <w:b/>
           <w:color w:val="1E293B"/>
-          <w:sz w:val="17"/>
+          <w:sz w:val="16"/>
         </w:rPr>
-        <w:t xml:space="preserve">Proprietary &amp; Legacy System Connector Engines: </w:t>
+        <w:t xml:space="preserve">Third-Party Sales Force Automation (SFA) &amp; Order Ingestion Engine: </w:t>
       </w:r>
       <w:r>
         <w:rPr>
           <w:rFonts w:ascii="Calibri" w:hAnsi="Calibri"/>
           <w:color w:val="1E293B"/>
-          <w:sz w:val="17"/>
+          <w:sz w:val="16"/>
         </w:rPr>
-        <w:t>Architected bidirectional integration bridges linking Odoo ERP to clients' in-house proprietary software, warehouse management systems (WMS), and legacy SQL databases with asynchronous queue handlers and real-time inventory reconcilers.</w:t>
+        <w:t>Architected real-time asynchronous data sync connecting third-party mobile Sales Force Automation systems with Odoo Enterprise for a leading FMCG manufacturer. Automated high-volume field sales order ingestion, automated picking creation, and robust error/conflict audit logging.</w:t>
       </w:r>
     </w:p>
     <w:p>
       <w:pPr>
         <w:pStyle w:val="ListBullet"/>
-        <w:spacing w:before="0" w:after="24" w:line="264" w:lineRule="auto"/>
+        <w:spacing w:before="0" w:after="20" w:line="262" w:lineRule="auto"/>
       </w:pPr>
       <w:r>
         <w:rPr>
           <w:rFonts w:ascii="Calibri" w:hAnsi="Calibri"/>
           <w:b/>
           <w:color w:val="1E293B"/>
-          <w:sz w:val="17"/>
+          <w:sz w:val="16"/>
         </w:rPr>
         <w:t xml:space="preserve">Multichannel Marketplace Integration Suite (Kogan &amp; Tradevine): </w:t>
       </w:r>
@@ -853,7 +853,7 @@
         <w:rPr>
           <w:rFonts w:ascii="Calibri" w:hAnsi="Calibri"/>
           <w:color w:val="1E293B"/>
-          <w:sz w:val="17"/>
+          <w:sz w:val="16"/>
         </w:rPr>
         <w:t>Spearheaded real-time API integrations connecting Odoo ERP with leading New Zealand marketplaces (Kogan and Tradevine), automating catalog mapping, multi-warehouse stock reservation sync, and order fulfillment webhooks.</w:t>
       </w:r>
@@ -861,14 +861,60 @@
     <w:p>
       <w:pPr>
         <w:pStyle w:val="ListBullet"/>
-        <w:spacing w:before="0" w:after="24" w:line="264" w:lineRule="auto"/>
+        <w:spacing w:before="0" w:after="20" w:line="262" w:lineRule="auto"/>
       </w:pPr>
       <w:r>
         <w:rPr>
           <w:rFonts w:ascii="Calibri" w:hAnsi="Calibri"/>
           <w:b/>
           <w:color w:val="1E293B"/>
-          <w:sz w:val="17"/>
+          <w:sz w:val="16"/>
+        </w:rPr>
+        <w:t xml:space="preserve">High-Throughput Telecom SMS Marketing &amp; Notification Gateways: </w:t>
+      </w:r>
+      <w:r>
+        <w:rPr>
+          <w:rFonts w:ascii="Calibri" w:hAnsi="Calibri"/>
+          <w:color w:val="1E293B"/>
+          <w:sz w:val="16"/>
+        </w:rPr>
+        <w:t>Engineered specialized SMS marketing gateway modules interfacing Odoo directly with telecommunication carrier APIs for automated transactional order status dispatches, OTP authentication, and compliant bulk marketing campaigns.</w:t>
+      </w:r>
+    </w:p>
+    <w:p>
+      <w:pPr>
+        <w:pStyle w:val="ListBullet"/>
+        <w:spacing w:before="0" w:after="20" w:line="262" w:lineRule="auto"/>
+      </w:pPr>
+      <w:r>
+        <w:rPr>
+          <w:rFonts w:ascii="Calibri" w:hAnsi="Calibri"/>
+          <w:b/>
+          <w:color w:val="1E293B"/>
+          <w:sz w:val="16"/>
+        </w:rPr>
+        <w:t xml:space="preserve">Cross-Border Omnichannel POS &amp; Multi-Tier Prepaid Loyalty Systems: </w:t>
+      </w:r>
+      <w:r>
+        <w:rPr>
+          <w:rFonts w:ascii="Calibri" w:hAnsi="Calibri"/>
+          <w:color w:val="1E293B"/>
+          <w:sz w:val="16"/>
+        </w:rPr>
+        <w:t>Architected multi-branch retail POS systems operating across nationwide chains and international cross-border retail outlets, complete with custom multi-tier prepaid loyalty cards, gift card wallets, and offline-to-online reconciliation.</w:t>
+      </w:r>
+    </w:p>
+    <w:p>
+      <w:pPr>
+        <w:pStyle w:val="ListBullet"/>
+        <w:spacing w:before="0" w:after="20" w:line="262" w:lineRule="auto"/>
+      </w:pPr>
+      <w:r>
+        <w:rPr>
+          <w:rFonts w:ascii="Calibri" w:hAnsi="Calibri"/>
+          <w:b/>
+          <w:color w:val="1E293B"/>
+          <w:sz w:val="16"/>
         </w:rPr>
         <w:t xml:space="preserve">Universal Odoo Database Model Context Protocol (MCP) Server: </w:t>
       </w:r>
@@ -876,7 +922,7 @@
         <w:rPr>
           <w:rFonts w:ascii="Calibri" w:hAnsi="Calibri"/>
           <w:color w:val="1E293B"/>
-          <w:sz w:val="17"/>
+          <w:sz w:val="16"/>
         </w:rPr>
         <w:t>Architected and deployed a universal MCP server exposing Odoo ORM schemas and database models safely to external AI agent platforms (Claude Code, Gemini Enterprise, Antigravity, Cline, Puku) for automated schema inspection and task orchestration.</w:t>
       </w:r>
@@ -884,14 +930,14 @@
     <w:p>
       <w:pPr>
         <w:pStyle w:val="ListBullet"/>
-        <w:spacing w:before="0" w:after="24" w:line="264" w:lineRule="auto"/>
+        <w:spacing w:before="0" w:after="20" w:line="262" w:lineRule="auto"/>
       </w:pPr>
       <w:r>
         <w:rPr>
           <w:rFonts w:ascii="Calibri" w:hAnsi="Calibri"/>
           <w:b/>
           <w:color w:val="1E293B"/>
-          <w:sz w:val="17"/>
+          <w:sz w:val="16"/>
         </w:rPr>
         <w:t xml:space="preserve">ZATCA Phase 2 &amp; NBR Tax Cryptographic Invoicing Integrations: </w:t>
       </w:r>
@@ -899,7 +945,7 @@
         <w:rPr>
           <w:rFonts w:ascii="Calibri" w:hAnsi="Calibri"/>
           <w:color w:val="1E293B"/>
-          <w:sz w:val="17"/>
+          <w:sz w:val="16"/>
         </w:rPr>
         <w:t>Engineered mission-critical tax compliance modules interfacing Odoo's accounting engine with government regulatory portals (ZATCA Phase 2 e-invoicing in Saudi Arabia with XML signing, ECDSA cryptographic hashing, QR codes, and Bangladesh NBR tax engines).</w:t>
       </w:r>
@@ -912,7 +958,7 @@
     <w:p>
       <w:pPr>
         <w:keepNext/>
-        <w:spacing w:before="0" w:after="50"/>
+        <w:spacing w:before="0" w:after="40"/>
         <w:pBdr>
           <w:bottom w:val="single" w:sz="6" w:space="1" w:color="CBD5E1"/>
         </w:pBdr>
@@ -930,7 +976,7 @@
     <w:p>
       <w:pPr>
         <w:keepNext/>
-        <w:spacing w:before="60" w:after="20"/>
+        <w:spacing w:before="50" w:after="20"/>
       </w:pPr>
       <w:r>
         <w:rPr>
@@ -954,14 +1000,14 @@
     <w:p>
       <w:pPr>
         <w:pStyle w:val="ListBullet"/>
-        <w:spacing w:before="0" w:after="24" w:line="264" w:lineRule="auto"/>
+        <w:spacing w:before="0" w:after="20" w:line="262" w:lineRule="auto"/>
       </w:pPr>
       <w:r>
         <w:rPr>
           <w:rFonts w:ascii="Calibri" w:hAnsi="Calibri"/>
           <w:b/>
           <w:color w:val="1E293B"/>
-          <w:sz w:val="17"/>
+          <w:sz w:val="16"/>
         </w:rPr>
         <w:t xml:space="preserve">Technical Leadership for Complex ERP Customizations: </w:t>
       </w:r>
@@ -969,7 +1015,7 @@
         <w:rPr>
           <w:rFonts w:ascii="Calibri" w:hAnsi="Calibri"/>
           <w:color w:val="1E293B"/>
-          <w:sz w:val="17"/>
+          <w:sz w:val="16"/>
         </w:rPr>
         <w:t>Directing engineering teams delivering high-consequence Odoo ERP customization projects for 85+ global and domestic enterprise clients (Bangladesh, New Zealand, Saudi Arabia, Spain, South Sudan). Personally designing core R&amp;D workflows, custom themes, and proprietary integrations.</w:t>
       </w:r>
@@ -977,37 +1023,37 @@
     <w:p>
       <w:pPr>
         <w:pStyle w:val="ListBullet"/>
-        <w:spacing w:before="0" w:after="24" w:line="264" w:lineRule="auto"/>
+        <w:spacing w:before="0" w:after="20" w:line="262" w:lineRule="auto"/>
       </w:pPr>
       <w:r>
         <w:rPr>
           <w:rFonts w:ascii="Calibri" w:hAnsi="Calibri"/>
           <w:b/>
           <w:color w:val="1E293B"/>
-          <w:sz w:val="17"/>
+          <w:sz w:val="16"/>
         </w:rPr>
-        <w:t xml:space="preserve">Rapid Enterprise Integrations (SAP &amp; 7 NZ/AUS Payment Gateways): </w:t>
+        <w:t xml:space="preserve">Rapid Enterprise Integrations (SAP, SFA, &amp; 7 NZ/AUS Payment Gateways): </w:t>
       </w:r>
       <w:r>
         <w:rPr>
           <w:rFonts w:ascii="Calibri" w:hAnsi="Calibri"/>
           <w:color w:val="1E293B"/>
-          <w:sz w:val="17"/>
+          <w:sz w:val="16"/>
         </w:rPr>
-        <w:t>Directed the rapid delivery of complex integrations including full SAP sync (customers, orders, deliveries, payments) within 1 month, and the simultaneous rollout of 7 international NZ &amp; AUS payment gateways within a 1-month milestone.</w:t>
+        <w:t>Directed the rapid delivery of complex integrations including full SAP sync (customers, orders, deliveries, payments) within 1 month, SFA field sales ordering for FMCG enterprises, and the simultaneous rollout of 7 international NZ &amp; AUS payment gateways within a 1-month milestone.</w:t>
       </w:r>
     </w:p>
     <w:p>
       <w:pPr>
         <w:pStyle w:val="ListBullet"/>
-        <w:spacing w:before="0" w:after="24" w:line="264" w:lineRule="auto"/>
+        <w:spacing w:before="0" w:after="20" w:line="262" w:lineRule="auto"/>
       </w:pPr>
       <w:r>
         <w:rPr>
           <w:rFonts w:ascii="Calibri" w:hAnsi="Calibri"/>
           <w:b/>
           <w:color w:val="1E293B"/>
-          <w:sz w:val="17"/>
+          <w:sz w:val="16"/>
         </w:rPr>
         <w:t xml:space="preserve">Hyper-Velocity Team Delivery (3-Month Scope in 2–3 Weeks): </w:t>
       </w:r>
@@ -1015,7 +1061,7 @@
         <w:rPr>
           <w:rFonts w:ascii="Calibri" w:hAnsi="Calibri"/>
           <w:color w:val="1E293B"/>
-          <w:sz w:val="17"/>
+          <w:sz w:val="16"/>
         </w:rPr>
         <w:t>Pioneered a delivery methodology combining modular Odoo design patterns, automated QA test suites, and local AI agentic tooling (Claude Code, Antigravity, vLLM/Ollama with DeepSeek-R1/Qwen2.5), cutting project cycle times by up to 75% with near-100% first-pass UAT acceptance.</w:t>
       </w:r>
@@ -1023,14 +1069,14 @@
     <w:p>
       <w:pPr>
         <w:pStyle w:val="ListBullet"/>
-        <w:spacing w:before="0" w:after="24" w:line="264" w:lineRule="auto"/>
+        <w:spacing w:before="0" w:after="20" w:line="262" w:lineRule="auto"/>
       </w:pPr>
       <w:r>
         <w:rPr>
           <w:rFonts w:ascii="Calibri" w:hAnsi="Calibri"/>
           <w:b/>
           <w:color w:val="1E293B"/>
-          <w:sz w:val="17"/>
+          <w:sz w:val="16"/>
         </w:rPr>
         <w:t xml:space="preserve">Odoo Enterprise Multi-Version Upgrades (v13.0 to v19.0): </w:t>
       </w:r>
@@ -1038,7 +1084,7 @@
         <w:rPr>
           <w:rFonts w:ascii="Calibri" w:hAnsi="Calibri"/>
           <w:color w:val="1E293B"/>
-          <w:sz w:val="17"/>
+          <w:sz w:val="16"/>
         </w:rPr>
         <w:t>Supervised 14+ database upgrade programs across multi-version jumps (v13-v17, v14-v19, v16-v19). Developed proprietary structural data retention scripts to carry over decades of custom business data while retiring technical debt.</w:t>
       </w:r>
@@ -1046,14 +1092,14 @@
     <w:p>
       <w:pPr>
         <w:pStyle w:val="ListBullet"/>
-        <w:spacing w:before="0" w:after="24" w:line="264" w:lineRule="auto"/>
+        <w:spacing w:before="0" w:after="20" w:line="262" w:lineRule="auto"/>
       </w:pPr>
       <w:r>
         <w:rPr>
           <w:rFonts w:ascii="Calibri" w:hAnsi="Calibri"/>
           <w:b/>
           <w:color w:val="1E293B"/>
-          <w:sz w:val="17"/>
+          <w:sz w:val="16"/>
         </w:rPr>
         <w:t xml:space="preserve">High-Availability Server Worker Isolation: </w:t>
       </w:r>
@@ -1061,7 +1107,7 @@
         <w:rPr>
           <w:rFonts w:ascii="Calibri" w:hAnsi="Calibri"/>
           <w:color w:val="1E293B"/>
-          <w:sz w:val="17"/>
+          <w:sz w:val="16"/>
         </w:rPr>
         <w:t>Designed Nginx upstream routing dividing server workers into dedicated pools (isolating CPU-intensive external API/e-commerce sync from internal administrative back-office Gunicorn workers), eliminating downtime and latency spikes.</w:t>
       </w:r>
@@ -1069,7 +1115,7 @@
     <w:p>
       <w:pPr>
         <w:keepNext/>
-        <w:spacing w:before="90" w:after="20"/>
+        <w:spacing w:before="80" w:after="20"/>
       </w:pPr>
       <w:r>
         <w:rPr>
@@ -1093,14 +1139,14 @@
     <w:p>
       <w:pPr>
         <w:pStyle w:val="ListBullet"/>
-        <w:spacing w:before="0" w:after="24" w:line="264" w:lineRule="auto"/>
+        <w:spacing w:before="0" w:after="20" w:line="262" w:lineRule="auto"/>
       </w:pPr>
       <w:r>
         <w:rPr>
           <w:rFonts w:ascii="Calibri" w:hAnsi="Calibri"/>
           <w:b/>
           <w:color w:val="1E293B"/>
-          <w:sz w:val="17"/>
+          <w:sz w:val="16"/>
         </w:rPr>
         <w:t xml:space="preserve">Proprietary &amp; Marketplace API Engineering: </w:t>
       </w:r>
@@ -1108,7 +1154,7 @@
         <w:rPr>
           <w:rFonts w:ascii="Calibri" w:hAnsi="Calibri"/>
           <w:color w:val="1E293B"/>
-          <w:sz w:val="17"/>
+          <w:sz w:val="16"/>
         </w:rPr>
         <w:t>Designed and implemented real-time sync modules linking Odoo ERP to international e-commerce channels (Kogan, Tradevine, BNPL platforms). Built robust reconciliation jobs to auto-correct inventory drift.</w:t>
       </w:r>
@@ -1116,37 +1162,37 @@
     <w:p>
       <w:pPr>
         <w:pStyle w:val="ListBullet"/>
-        <w:spacing w:before="0" w:after="24" w:line="264" w:lineRule="auto"/>
+        <w:spacing w:before="0" w:after="20" w:line="262" w:lineRule="auto"/>
       </w:pPr>
       <w:r>
         <w:rPr>
           <w:rFonts w:ascii="Calibri" w:hAnsi="Calibri"/>
           <w:b/>
           <w:color w:val="1E293B"/>
-          <w:sz w:val="17"/>
+          <w:sz w:val="16"/>
         </w:rPr>
-        <w:t xml:space="preserve">Custom Odoo Module Architecture: </w:t>
+        <w:t xml:space="preserve">Custom Odoo Module Architecture &amp; SFA Sync: </w:t>
       </w:r>
       <w:r>
         <w:rPr>
           <w:rFonts w:ascii="Calibri" w:hAnsi="Calibri"/>
           <w:color w:val="1E293B"/>
-          <w:sz w:val="17"/>
+          <w:sz w:val="16"/>
         </w:rPr>
-        <w:t>Hand-coded custom modules for business process automations, manufacturing shop floor operations, multi-currency accounting, and tailored client business units.</w:t>
+        <w:t>Hand-coded custom modules for business process automations, discrete manufacturing assembly, multi-currency accounting, and mobile Sales Force Automation (SFA) backend order processing.</w:t>
       </w:r>
     </w:p>
     <w:p>
       <w:pPr>
         <w:pStyle w:val="ListBullet"/>
-        <w:spacing w:before="0" w:after="24" w:line="264" w:lineRule="auto"/>
+        <w:spacing w:before="0" w:after="20" w:line="262" w:lineRule="auto"/>
       </w:pPr>
       <w:r>
         <w:rPr>
           <w:rFonts w:ascii="Calibri" w:hAnsi="Calibri"/>
           <w:b/>
           <w:color w:val="1E293B"/>
-          <w:sz w:val="17"/>
+          <w:sz w:val="16"/>
         </w:rPr>
         <w:t xml:space="preserve">Odoo Deployment &amp; Infrastructure Automation: </w:t>
       </w:r>
@@ -1154,7 +1200,7 @@
         <w:rPr>
           <w:rFonts w:ascii="Calibri" w:hAnsi="Calibri"/>
           <w:color w:val="1E293B"/>
-          <w:sz w:val="17"/>
+          <w:sz w:val="16"/>
         </w:rPr>
         <w:t>Architected automated Docker and Bash deployment pipelines managing 300+ live Odoo database instances, reducing deployment onboarding time by 85%.</w:t>
       </w:r>
@@ -1162,7 +1208,7 @@
     <w:p>
       <w:pPr>
         <w:keepNext/>
-        <w:spacing w:before="90" w:after="20"/>
+        <w:spacing w:before="80" w:after="20"/>
       </w:pPr>
       <w:r>
         <w:rPr>
@@ -1186,14 +1232,14 @@
     <w:p>
       <w:pPr>
         <w:pStyle w:val="ListBullet"/>
-        <w:spacing w:before="0" w:after="24" w:line="264" w:lineRule="auto"/>
+        <w:spacing w:before="0" w:after="20" w:line="262" w:lineRule="auto"/>
       </w:pPr>
       <w:r>
         <w:rPr>
           <w:rFonts w:ascii="Calibri" w:hAnsi="Calibri"/>
           <w:b/>
           <w:color w:val="1E293B"/>
-          <w:sz w:val="17"/>
+          <w:sz w:val="16"/>
         </w:rPr>
         <w:t xml:space="preserve">Bespoke Customization to Business Requirements: </w:t>
       </w:r>
@@ -1201,7 +1247,7 @@
         <w:rPr>
           <w:rFonts w:ascii="Calibri" w:hAnsi="Calibri"/>
           <w:color w:val="1E293B"/>
-          <w:sz w:val="17"/>
+          <w:sz w:val="16"/>
         </w:rPr>
         <w:t>Developed hundreds of custom Odoo modules tailored strictly to client business logic, custom operational workflows, dynamic PDF reporting, and specialized portal features.</w:t>
       </w:r>
@@ -1209,14 +1255,14 @@
     <w:p>
       <w:pPr>
         <w:pStyle w:val="ListBullet"/>
-        <w:spacing w:before="0" w:after="24" w:line="264" w:lineRule="auto"/>
+        <w:spacing w:before="0" w:after="20" w:line="262" w:lineRule="auto"/>
       </w:pPr>
       <w:r>
         <w:rPr>
           <w:rFonts w:ascii="Calibri" w:hAnsi="Calibri"/>
           <w:b/>
           <w:color w:val="1E293B"/>
-          <w:sz w:val="17"/>
+          <w:sz w:val="16"/>
         </w:rPr>
         <w:t xml:space="preserve">Payment Gateways &amp; Database Tuning: </w:t>
       </w:r>
@@ -1224,7 +1270,7 @@
         <w:rPr>
           <w:rFonts w:ascii="Calibri" w:hAnsi="Calibri"/>
           <w:color w:val="1E293B"/>
-          <w:sz w:val="17"/>
+          <w:sz w:val="16"/>
         </w:rPr>
         <w:t>Engineered secure payment gateway integrations (cards, mobile financial services) and optimized multi-table PostgreSQL queries and indexing for high-volume transactions.</w:t>
       </w:r>
@@ -1232,7 +1278,7 @@
     <w:p>
       <w:pPr>
         <w:keepNext/>
-        <w:spacing w:before="90" w:after="20"/>
+        <w:spacing w:before="80" w:after="20"/>
       </w:pPr>
       <w:r>
         <w:rPr>
@@ -1256,14 +1302,14 @@
     <w:p>
       <w:pPr>
         <w:pStyle w:val="ListBullet"/>
-        <w:spacing w:before="0" w:after="24" w:line="264" w:lineRule="auto"/>
+        <w:spacing w:before="0" w:after="20" w:line="262" w:lineRule="auto"/>
       </w:pPr>
       <w:r>
         <w:rPr>
           <w:rFonts w:ascii="Calibri" w:hAnsi="Calibri"/>
           <w:b/>
           <w:color w:val="1E293B"/>
-          <w:sz w:val="17"/>
+          <w:sz w:val="16"/>
         </w:rPr>
         <w:t xml:space="preserve">Magento 2+ Integration &amp; Mobile API: </w:t>
       </w:r>
@@ -1271,7 +1317,7 @@
         <w:rPr>
           <w:rFonts w:ascii="Calibri" w:hAnsi="Calibri"/>
           <w:color w:val="1E293B"/>
-          <w:sz w:val="17"/>
+          <w:sz w:val="16"/>
         </w:rPr>
         <w:t>Engineered backend web services and API endpoints for Magento 2+ e-commerce architectures powering high-performance mobile clients. Managed cloud servers and SSL/Nginx reverse proxies.</w:t>
       </w:r>
@@ -1279,7 +1325,7 @@
     <w:p>
       <w:pPr>
         <w:keepNext/>
-        <w:spacing w:before="90" w:after="20"/>
+        <w:spacing w:before="80" w:after="20"/>
       </w:pPr>
       <w:r>
         <w:rPr>
@@ -1303,14 +1349,14 @@
     <w:p>
       <w:pPr>
         <w:pStyle w:val="ListBullet"/>
-        <w:spacing w:before="0" w:after="24" w:line="264" w:lineRule="auto"/>
+        <w:spacing w:before="0" w:after="20" w:line="262" w:lineRule="auto"/>
       </w:pPr>
       <w:r>
         <w:rPr>
           <w:rFonts w:ascii="Calibri" w:hAnsi="Calibri"/>
           <w:b/>
           <w:color w:val="1E293B"/>
-          <w:sz w:val="17"/>
+          <w:sz w:val="16"/>
         </w:rPr>
         <w:t xml:space="preserve">Enterprise Infrastructure Administration: </w:t>
       </w:r>
@@ -1318,7 +1364,7 @@
         <w:rPr>
           <w:rFonts w:ascii="Calibri" w:hAnsi="Calibri"/>
           <w:color w:val="1E293B"/>
-          <w:sz w:val="17"/>
+          <w:sz w:val="16"/>
         </w:rPr>
         <w:t>Managed enterprise IT operations, Windows Server administration (Active Directory, DNS, IIS, Group Policy up to 2019), network security, and hardware/software deployments.</w:t>
       </w:r>
@@ -1326,7 +1372,7 @@
     <w:p>
       <w:pPr>
         <w:keepNext/>
-        <w:spacing w:before="90" w:after="50"/>
+        <w:spacing w:before="80" w:after="40"/>
         <w:pBdr>
           <w:bottom w:val="single" w:sz="6" w:space="1" w:color="CBD5E1"/>
         </w:pBdr>
@@ -1344,14 +1390,14 @@
     <w:p>
       <w:pPr>
         <w:pStyle w:val="ListBullet"/>
-        <w:spacing w:before="0" w:after="24" w:line="264" w:lineRule="auto"/>
+        <w:spacing w:before="0" w:after="20" w:line="262" w:lineRule="auto"/>
       </w:pPr>
       <w:r>
         <w:rPr>
           <w:rFonts w:ascii="Calibri" w:hAnsi="Calibri"/>
           <w:b/>
           <w:color w:val="1E293B"/>
-          <w:sz w:val="17"/>
+          <w:sz w:val="16"/>
         </w:rPr>
         <w:t xml:space="preserve">Certified Odoo Consultant: </w:t>
       </w:r>
@@ -1359,7 +1405,7 @@
         <w:rPr>
           <w:rFonts w:ascii="Calibri" w:hAnsi="Calibri"/>
           <w:color w:val="1E293B"/>
-          <w:sz w:val="17"/>
+          <w:sz w:val="16"/>
         </w:rPr>
         <w:t>Metamorphosis Ltd. (Official Odoo Silver Partner). Extensive expertise in Odoo standard architecture, ORM, customization guidelines, and business process modeling.</w:t>
       </w:r>
@@ -1367,14 +1413,14 @@
     <w:p>
       <w:pPr>
         <w:pStyle w:val="ListBullet"/>
-        <w:spacing w:before="0" w:after="24" w:line="264" w:lineRule="auto"/>
+        <w:spacing w:before="0" w:after="20" w:line="262" w:lineRule="auto"/>
       </w:pPr>
       <w:r>
         <w:rPr>
           <w:rFonts w:ascii="Calibri" w:hAnsi="Calibri"/>
           <w:b/>
           <w:color w:val="1E293B"/>
-          <w:sz w:val="17"/>
+          <w:sz w:val="16"/>
         </w:rPr>
         <w:t xml:space="preserve">Master of Information Technology (MIT): </w:t>
       </w:r>
@@ -1382,7 +1428,7 @@
         <w:rPr>
           <w:rFonts w:ascii="Calibri" w:hAnsi="Calibri"/>
           <w:color w:val="1E293B"/>
-          <w:sz w:val="17"/>
+          <w:sz w:val="16"/>
         </w:rPr>
         <w:t>Jahangirnagar University (2018 – 2019). Focus on Enterprise Systems, Advanced Databases, and Distributed Architectures.</w:t>
       </w:r>
@@ -1390,14 +1436,14 @@
     <w:p>
       <w:pPr>
         <w:pStyle w:val="ListBullet"/>
-        <w:spacing w:before="0" w:after="24" w:line="264" w:lineRule="auto"/>
+        <w:spacing w:before="0" w:after="20" w:line="262" w:lineRule="auto"/>
       </w:pPr>
       <w:r>
         <w:rPr>
           <w:rFonts w:ascii="Calibri" w:hAnsi="Calibri"/>
           <w:b/>
           <w:color w:val="1E293B"/>
-          <w:sz w:val="17"/>
+          <w:sz w:val="16"/>
         </w:rPr>
         <w:t xml:space="preserve">Bachelor of Science (B.Sc): </w:t>
       </w:r>
@@ -1405,7 +1451,7 @@
         <w:rPr>
           <w:rFonts w:ascii="Calibri" w:hAnsi="Calibri"/>
           <w:color w:val="1E293B"/>
-          <w:sz w:val="17"/>
+          <w:sz w:val="16"/>
         </w:rPr>
         <w:t>Shahjalal University of Science and Technology (SUST). 1st Major in Mathematics, 2nd Major in Computer Science &amp; Engineering (CSE).</w:t>
       </w:r>
@@ -1413,14 +1459,14 @@
     <w:p>
       <w:pPr>
         <w:pStyle w:val="ListBullet"/>
-        <w:spacing w:before="0" w:after="24" w:line="264" w:lineRule="auto"/>
+        <w:spacing w:before="0" w:after="20" w:line="262" w:lineRule="auto"/>
       </w:pPr>
       <w:r>
         <w:rPr>
           <w:rFonts w:ascii="Calibri" w:hAnsi="Calibri"/>
           <w:b/>
           <w:color w:val="1E293B"/>
-          <w:sz w:val="17"/>
+          <w:sz w:val="16"/>
         </w:rPr>
         <w:t xml:space="preserve">IEEE Research Author (2021): </w:t>
       </w:r>
@@ -1428,14 +1474,14 @@
         <w:rPr>
           <w:rFonts w:ascii="Calibri" w:hAnsi="Calibri"/>
           <w:color w:val="1E293B"/>
-          <w:sz w:val="17"/>
+          <w:sz w:val="16"/>
         </w:rPr>
         <w:t>Published paper on 'Performance Enhancement of Hadoop MapReduce' introducing the IMC algorithm (65% data processing efficiency improvement). Applied core distributed computing principles to optimize high-volume Odoo database operations.</w:t>
       </w:r>
     </w:p>
     <w:p>
       <w:pPr>
-        <w:spacing w:before="100" w:after="0"/>
+        <w:spacing w:before="80" w:after="0"/>
         <w:jc w:val="center"/>
       </w:pPr>
       <w:r>
@@ -1449,7 +1495,7 @@
     </w:p>
     <w:sectPr>
       <w:pgSz w:w="11909" w:h="16834"/>
-      <w:pgMar w:top="634" w:right="749" w:bottom="634" w:left="749" w:header="720" w:footer="720" w:gutter="0"/>
+      <w:pgMar w:top="576" w:right="720" w:bottom="576" w:left="720" w:header="720" w:footer="720" w:gutter="0"/>
       <w:cols w:space="720"/>
       <w:docGrid w:linePitch="360"/>
     </w:sectPr>

</xml_diff>

<commit_message>
[REF] cv: purge AI writing, buzzwords, and 'architecting' - rewrite with direct engineering verbs and facts
</commit_message>
<xml_diff>
--- a/Md_Niaj_Shahriar_Shishir_Tech_Lead_Odoo_Customization_Integrations.docx
+++ b/Md_Niaj_Shahriar_Shishir_Tech_Lead_Odoo_Customization_Integrations.docx
@@ -10,8 +10,8 @@
         <w:tblLook w:firstColumn="1" w:firstRow="1" w:lastColumn="0" w:lastRow="0" w:noHBand="0" w:noVBand="1" w:val="04A0"/>
       </w:tblPr>
       <w:tblGrid>
-        <w:gridCol w:w="5234"/>
-        <w:gridCol w:w="5234"/>
+        <w:gridCol w:w="5205"/>
+        <w:gridCol w:w="5205"/>
       </w:tblGrid>
       <w:tr>
         <w:tc>
@@ -25,9 +25,9 @@
             </w:tcBorders>
             <w:tcMar>
               <w:top w:w="10" w:type="dxa"/>
-              <w:bottom w:w="25" w:type="dxa"/>
+              <w:bottom w:w="20" w:type="dxa"/>
               <w:left w:w="0" w:type="dxa"/>
-              <w:right w:w="25" w:type="dxa"/>
+              <w:right w:w="20" w:type="dxa"/>
             </w:tcMar>
           </w:tcPr>
           <w:p>
@@ -39,7 +39,7 @@
                 <w:rFonts w:ascii="Arial" w:hAnsi="Arial"/>
                 <w:b/>
                 <w:color w:val="0F172A"/>
-                <w:sz w:val="34"/>
+                <w:sz w:val="36"/>
               </w:rPr>
               <w:t>Md Niaj Shahriar Shishir</w:t>
             </w:r>
@@ -53,9 +53,9 @@
                 <w:rFonts w:ascii="Arial" w:hAnsi="Arial"/>
                 <w:b/>
                 <w:color w:val="2563EB"/>
-                <w:sz w:val="17"/>
+                <w:sz w:val="19"/>
               </w:rPr>
-              <w:t>TECH LEAD — ODOO CUSTOMIZATION &amp; PROPRIETARY INTEGRATIONS</w:t>
+              <w:t>Technical Lead | Odoo ERP &amp; System Integrations</w:t>
             </w:r>
           </w:p>
           <w:p>
@@ -66,15 +66,15 @@
               <w:rPr>
                 <w:rFonts w:ascii="Calibri" w:hAnsi="Calibri"/>
                 <w:color w:val="475569"/>
-                <w:sz w:val="16"/>
+                <w:sz w:val="17"/>
               </w:rPr>
-              <w:t>Certified Odoo Consultant | Odoo Solution Architect by Practice | Head of Technology</w:t>
+              <w:t>Certified Odoo Consultant | Head of Technology | 7+ Years Experience</w:t>
             </w:r>
           </w:p>
         </w:tc>
         <w:tc>
           <w:tcPr>
-            <w:tcW w:type="dxa" w:w="3773"/>
+            <w:tcW w:type="dxa" w:w="3715"/>
             <w:tcBorders>
               <w:top w:val="none"/>
               <w:left w:val="none"/>
@@ -83,8 +83,8 @@
             </w:tcBorders>
             <w:tcMar>
               <w:top w:w="10" w:type="dxa"/>
-              <w:bottom w:w="25" w:type="dxa"/>
-              <w:left w:w="25" w:type="dxa"/>
+              <w:bottom w:w="20" w:type="dxa"/>
+              <w:left w:w="20" w:type="dxa"/>
               <w:right w:w="0" w:type="dxa"/>
             </w:tcMar>
           </w:tcPr>
@@ -100,7 +100,7 @@
                 <w:color w:val="64748B"/>
                 <w:sz w:val="15"/>
               </w:rPr>
-              <w:t xml:space="preserve">Live Portfolio: </w:t>
+              <w:t xml:space="preserve">Portfolio: </w:t>
             </w:r>
             <w:r>
               <w:rPr>
@@ -232,7 +232,7 @@
     </w:tbl>
     <w:p>
       <w:pPr>
-        <w:spacing w:before="40" w:after="80"/>
+        <w:spacing w:before="60" w:after="80"/>
         <w:pBdr>
           <w:bottom w:val="single" w:sz="10" w:space="1" w:color="2563EB"/>
         </w:pBdr>
@@ -246,15 +246,15 @@
         <w:tblLook w:firstColumn="1" w:firstRow="1" w:lastColumn="0" w:lastRow="0" w:noHBand="0" w:noVBand="1" w:val="04A0"/>
       </w:tblPr>
       <w:tblGrid>
-        <w:gridCol w:w="2617"/>
-        <w:gridCol w:w="2617"/>
-        <w:gridCol w:w="2617"/>
-        <w:gridCol w:w="2617"/>
+        <w:gridCol w:w="2603"/>
+        <w:gridCol w:w="2603"/>
+        <w:gridCol w:w="2603"/>
+        <w:gridCol w:w="2603"/>
       </w:tblGrid>
       <w:tr>
         <w:tc>
           <w:tcPr>
-            <w:tcW w:type="dxa" w:w="2606"/>
+            <w:tcW w:type="dxa" w:w="2592"/>
             <w:shd w:fill="F1F5F9"/>
             <w:tcBorders>
               <w:top w:val="none"/>
@@ -281,7 +281,7 @@
                 <w:color w:val="0F172A"/>
                 <w:sz w:val="17"/>
               </w:rPr>
-              <w:t>900+ Custom Modules</w:t>
+              <w:t>900+ Modules</w:t>
             </w:r>
           </w:p>
           <w:p>
@@ -296,13 +296,13 @@
                 <w:color w:val="2563EB"/>
                 <w:sz w:val="12"/>
               </w:rPr>
-              <w:t>HAND-CODED ODOO APPS</w:t>
+              <w:t>HAND-CODED IN PYTHON &amp; XML</w:t>
             </w:r>
           </w:p>
         </w:tc>
         <w:tc>
           <w:tcPr>
-            <w:tcW w:type="dxa" w:w="2606"/>
+            <w:tcW w:type="dxa" w:w="2592"/>
             <w:shd w:fill="F1F5F9"/>
             <w:tcBorders>
               <w:top w:val="none"/>
@@ -344,13 +344,13 @@
                 <w:color w:val="2563EB"/>
                 <w:sz w:val="12"/>
               </w:rPr>
-              <w:t>1-MONTH RAPID INTEGRATIONS</w:t>
+              <w:t>BUILT IN 1-MONTH SPRINTS</w:t>
             </w:r>
           </w:p>
         </w:tc>
         <w:tc>
           <w:tcPr>
-            <w:tcW w:type="dxa" w:w="2606"/>
+            <w:tcW w:type="dxa" w:w="2592"/>
             <w:shd w:fill="F1F5F9"/>
             <w:tcBorders>
               <w:top w:val="none"/>
@@ -377,7 +377,7 @@
                 <w:color w:val="0F172A"/>
                 <w:sz w:val="17"/>
               </w:rPr>
-              <w:t>14+ Enterprise Upgrades</w:t>
+              <w:t>14+ Upgrades</w:t>
             </w:r>
           </w:p>
           <w:p>
@@ -392,13 +392,13 @@
                 <w:color w:val="2563EB"/>
                 <w:sz w:val="12"/>
               </w:rPr>
-              <w:t>V13.0 THROUGH V19.0</w:t>
+              <w:t>ODOO 13 THROUGH 19</w:t>
             </w:r>
           </w:p>
         </w:tc>
         <w:tc>
           <w:tcPr>
-            <w:tcW w:type="dxa" w:w="2606"/>
+            <w:tcW w:type="dxa" w:w="2592"/>
             <w:shd w:fill="F1F5F9"/>
             <w:tcBorders>
               <w:top w:val="none"/>
@@ -425,7 +425,7 @@
                 <w:color w:val="0F172A"/>
                 <w:sz w:val="17"/>
               </w:rPr>
-              <w:t>3 Mo. Scope in 2-3 Wks</w:t>
+              <w:t>Team Delivery</w:t>
             </w:r>
           </w:p>
           <w:p>
@@ -440,7 +440,7 @@
                 <w:color w:val="2563EB"/>
                 <w:sz w:val="12"/>
               </w:rPr>
-              <w:t>HYPER-VELOCITY DELIVERY</w:t>
+              <w:t>3-MONTH SCOPE IN 2-3 WEEKS</w:t>
             </w:r>
           </w:p>
         </w:tc>
@@ -449,7 +449,7 @@
     <w:p>
       <w:pPr>
         <w:keepNext/>
-        <w:spacing w:before="80" w:after="40"/>
+        <w:spacing w:before="90" w:after="50"/>
         <w:pBdr>
           <w:bottom w:val="single" w:sz="6" w:space="1" w:color="CBD5E1"/>
         </w:pBdr>
@@ -466,22 +466,22 @@
     </w:p>
     <w:p>
       <w:pPr>
-        <w:spacing w:before="20" w:after="50" w:line="266" w:lineRule="auto"/>
+        <w:spacing w:before="20" w:after="60" w:line="269" w:lineRule="auto"/>
         <w:jc w:val="both"/>
       </w:pPr>
       <w:r>
         <w:rPr>
           <w:rFonts w:ascii="Calibri" w:hAnsi="Calibri"/>
           <w:color w:val="1E293B"/>
-          <w:sz w:val="16"/>
+          <w:sz w:val="17"/>
         </w:rPr>
-        <w:t>High-impact Technical Lead and Certified Odoo Consultant (Solution Architect by Practice) with 7+ years of hands-on engineering mastery leading complex Odoo customization projects and architecting mission-critical integrations between Odoo ERP and third-party proprietary enterprise systems. Proven authority in custom Odoo development, having hand-coded 900+ custom modules spanning bespoke business logic, automated workflow engines, OWL 2 interfaces, and specialized financial reports for 85+ global and domestic enterprise clients. Delivered high-stakes enterprise milestones including an end-to-end SAP ERP integration (customers, sales orders, outbound deliveries, and payments) delivered in just 1 month, and certified 7 distinct international NZ &amp; AUS payment gateways within a single 1-month milestone. Spearheaded real-time third-party Sales Force Automation (SFA) order sync, telecom SMS marketing gateways, and cross-border omnichannel retail POS platforms. Led 14+ major multi-version Odoo Enterprise upgrades (v13.0 to v19.0) with zero data loss. Expert in resilient architectures (REST, XML-RPC, JSON-RPC, Webhooks, ETL queues) linking Odoo with legacy back-offices, proprietary WMS, regional marketplaces (Kogan, Tradevine), and government compliance portals (ZATCA, NBR). Driving hyper-velocity teams that compress 3-month scopes into 2–3 weeks via the Agentic E3 Framework.</w:t>
+        <w:t>Technical Lead and Certified Odoo Consultant with 7+ years of hands-on experience building custom Odoo ERP solutions and integrating Odoo with external and proprietary systems. Hand-coded more than 900 custom modules in Python, JavaScript (OWL 2), and XML for 85+ enterprise clients. Experienced in delivering complex integrations under tight deadlines, including a complete bidirectional sync with SAP (customers, sales orders, deliveries, payments) in 1 month, and 7 New Zealand and Australian payment gateways in a single month. Delivered integrations for mobile Sales Force Automation (SFA), telecom SMS marketing gateways, and cross-border retail POS systems. Completed 14+ database upgrades across Odoo 13 to 19 with zero data loss. Leads development teams using modern CLI agents and local AI models to cut delivery cycles from 3 months down to 2–3 weeks while enforcing clean code standards via the Agentic E3 Framework.</w:t>
       </w:r>
     </w:p>
     <w:p>
       <w:pPr>
         <w:keepNext/>
-        <w:spacing w:before="70" w:after="40"/>
+        <w:spacing w:before="80" w:after="50"/>
         <w:pBdr>
           <w:bottom w:val="single" w:sz="6" w:space="1" w:color="CBD5E1"/>
         </w:pBdr>
@@ -504,13 +504,13 @@
         <w:tblLook w:firstColumn="1" w:firstRow="1" w:lastColumn="0" w:lastRow="0" w:noHBand="0" w:noVBand="1" w:val="04A0"/>
       </w:tblPr>
       <w:tblGrid>
-        <w:gridCol w:w="5234"/>
-        <w:gridCol w:w="5234"/>
+        <w:gridCol w:w="5205"/>
+        <w:gridCol w:w="5205"/>
       </w:tblGrid>
       <w:tr>
         <w:tc>
           <w:tcPr>
-            <w:tcW w:type="dxa" w:w="5227"/>
+            <w:tcW w:type="dxa" w:w="5198"/>
             <w:tcBorders>
               <w:top w:val="none"/>
               <w:left w:val="none"/>
@@ -518,15 +518,15 @@
               <w:right w:val="none"/>
             </w:tcBorders>
             <w:tcMar>
-              <w:top w:w="12" w:type="dxa"/>
-              <w:bottom w:w="16" w:type="dxa"/>
+              <w:top w:w="14" w:type="dxa"/>
+              <w:bottom w:w="18" w:type="dxa"/>
               <w:left w:w="20" w:type="dxa"/>
               <w:right w:w="30" w:type="dxa"/>
             </w:tcMar>
           </w:tcPr>
           <w:p>
             <w:pPr>
-              <w:spacing w:before="0" w:after="10" w:line="259" w:lineRule="auto"/>
+              <w:spacing w:before="0" w:after="10" w:line="262" w:lineRule="auto"/>
             </w:pPr>
             <w:r>
               <w:rPr>
@@ -535,7 +535,7 @@
                 <w:color w:val="2563EB"/>
                 <w:sz w:val="16"/>
               </w:rPr>
-              <w:t xml:space="preserve">• Odoo Customization Mastery: </w:t>
+              <w:t xml:space="preserve">• Odoo Customization: </w:t>
             </w:r>
             <w:r>
               <w:rPr>
@@ -543,13 +543,13 @@
                 <w:color w:val="1E293B"/>
                 <w:sz w:val="16"/>
               </w:rPr>
-              <w:t>900+ hand-coded modules; custom data models, business logic engines, OWL 2 reactive widgets, QWeb XML views, inheritances, compute field caching, automated server actions, cron tasks.</w:t>
+              <w:t>900+ custom modules; custom models, business logic, OWL 2 reactive components, QWeb XML views, inheritances, compute field caching, automated server actions, cron tasks.</w:t>
             </w:r>
           </w:p>
         </w:tc>
         <w:tc>
           <w:tcPr>
-            <w:tcW w:type="dxa" w:w="5227"/>
+            <w:tcW w:type="dxa" w:w="5198"/>
             <w:tcBorders>
               <w:top w:val="none"/>
               <w:left w:val="none"/>
@@ -557,15 +557,15 @@
               <w:right w:val="none"/>
             </w:tcBorders>
             <w:tcMar>
-              <w:top w:w="12" w:type="dxa"/>
-              <w:bottom w:w="16" w:type="dxa"/>
+              <w:top w:w="14" w:type="dxa"/>
+              <w:bottom w:w="18" w:type="dxa"/>
               <w:left w:w="20" w:type="dxa"/>
               <w:right w:w="30" w:type="dxa"/>
             </w:tcMar>
           </w:tcPr>
           <w:p>
             <w:pPr>
-              <w:spacing w:before="0" w:after="10" w:line="259" w:lineRule="auto"/>
+              <w:spacing w:before="0" w:after="10" w:line="262" w:lineRule="auto"/>
             </w:pPr>
             <w:r>
               <w:rPr>
@@ -574,7 +574,7 @@
                 <w:color w:val="2563EB"/>
                 <w:sz w:val="16"/>
               </w:rPr>
-              <w:t xml:space="preserve">• Proprietary &amp; Enterprise ERP Sync: </w:t>
+              <w:t xml:space="preserve">• System &amp; API Integrations: </w:t>
             </w:r>
             <w:r>
               <w:rPr>
@@ -582,7 +582,7 @@
                 <w:color w:val="1E293B"/>
                 <w:sz w:val="16"/>
               </w:rPr>
-              <w:t>Direct bidirectional connectors with SAP, third-party SFA (Recibo), custom WMS/TMS; REST/SOAP/JSON-RPC/XML-RPC APIs, Webhook event pipelines, ETL queues, payload mapping.</w:t>
+              <w:t>Bidirectional sync with SAP, external mobile SFA, WMS, and legacy SQL databases. REST, JSON-RPC, XML-RPC APIs, Webhook event pipelines, ETL data mapping.</w:t>
             </w:r>
           </w:p>
         </w:tc>
@@ -590,7 +590,7 @@
       <w:tr>
         <w:tc>
           <w:tcPr>
-            <w:tcW w:type="dxa" w:w="5227"/>
+            <w:tcW w:type="dxa" w:w="5198"/>
             <w:tcBorders>
               <w:top w:val="none"/>
               <w:left w:val="none"/>
@@ -598,15 +598,15 @@
               <w:right w:val="none"/>
             </w:tcBorders>
             <w:tcMar>
-              <w:top w:w="12" w:type="dxa"/>
-              <w:bottom w:w="16" w:type="dxa"/>
+              <w:top w:w="14" w:type="dxa"/>
+              <w:bottom w:w="18" w:type="dxa"/>
               <w:left w:w="20" w:type="dxa"/>
               <w:right w:w="30" w:type="dxa"/>
             </w:tcMar>
           </w:tcPr>
           <w:p>
             <w:pPr>
-              <w:spacing w:before="0" w:after="10" w:line="259" w:lineRule="auto"/>
+              <w:spacing w:before="0" w:after="10" w:line="262" w:lineRule="auto"/>
             </w:pPr>
             <w:r>
               <w:rPr>
@@ -615,7 +615,7 @@
                 <w:color w:val="2563EB"/>
                 <w:sz w:val="16"/>
               </w:rPr>
-              <w:t xml:space="preserve">• Fault Tolerance &amp; Data Reconciliation: </w:t>
+              <w:t xml:space="preserve">• Data Reliability &amp; Sync: </w:t>
             </w:r>
             <w:r>
               <w:rPr>
@@ -623,13 +623,13 @@
                 <w:color w:val="1E293B"/>
                 <w:sz w:val="16"/>
               </w:rPr>
-              <w:t>Transactional idempotency, queued retries, rate limiting, error logging/alerting, conflict resolution, bidirectional catalog/inventory/order sync, zero data loss.</w:t>
+              <w:t>Idempotent API calls, queue-based retries, rate limits, audit logs, conflict resolution, automated stock reconciliation, and zero data divergence.</w:t>
             </w:r>
           </w:p>
         </w:tc>
         <w:tc>
           <w:tcPr>
-            <w:tcW w:type="dxa" w:w="5227"/>
+            <w:tcW w:type="dxa" w:w="5198"/>
             <w:tcBorders>
               <w:top w:val="none"/>
               <w:left w:val="none"/>
@@ -637,15 +637,15 @@
               <w:right w:val="none"/>
             </w:tcBorders>
             <w:tcMar>
-              <w:top w:w="12" w:type="dxa"/>
-              <w:bottom w:w="16" w:type="dxa"/>
+              <w:top w:w="14" w:type="dxa"/>
+              <w:bottom w:w="18" w:type="dxa"/>
               <w:left w:w="20" w:type="dxa"/>
               <w:right w:w="30" w:type="dxa"/>
             </w:tcMar>
           </w:tcPr>
           <w:p>
             <w:pPr>
-              <w:spacing w:before="0" w:after="10" w:line="259" w:lineRule="auto"/>
+              <w:spacing w:before="0" w:after="10" w:line="262" w:lineRule="auto"/>
             </w:pPr>
             <w:r>
               <w:rPr>
@@ -654,7 +654,7 @@
                 <w:color w:val="2563EB"/>
                 <w:sz w:val="16"/>
               </w:rPr>
-              <w:t xml:space="preserve">• Performance &amp; Scale Optimization: </w:t>
+              <w:t xml:space="preserve">• Performance Tuning: </w:t>
             </w:r>
             <w:r>
               <w:rPr>
@@ -662,7 +662,7 @@
                 <w:color w:val="1E293B"/>
                 <w:sz w:val="16"/>
               </w:rPr>
-              <w:t>ORM batching &amp; prefetching, eliminating N+1 queries, PostgreSQL index design, _read_group SQL aggregations, Gunicorn worker isolation (back-office vs API/web traffic).</w:t>
+              <w:t>ORM batching, prefetching, eliminating N+1 queries, PostgreSQL index design, _read_group aggregations, Gunicorn worker isolation for API vs back-office traffic.</w:t>
             </w:r>
           </w:p>
         </w:tc>
@@ -670,7 +670,7 @@
       <w:tr>
         <w:tc>
           <w:tcPr>
-            <w:tcW w:type="dxa" w:w="5227"/>
+            <w:tcW w:type="dxa" w:w="5198"/>
             <w:tcBorders>
               <w:top w:val="none"/>
               <w:left w:val="none"/>
@@ -678,15 +678,15 @@
               <w:right w:val="none"/>
             </w:tcBorders>
             <w:tcMar>
-              <w:top w:w="12" w:type="dxa"/>
-              <w:bottom w:w="16" w:type="dxa"/>
+              <w:top w:w="14" w:type="dxa"/>
+              <w:bottom w:w="18" w:type="dxa"/>
               <w:left w:w="20" w:type="dxa"/>
               <w:right w:w="30" w:type="dxa"/>
             </w:tcMar>
           </w:tcPr>
           <w:p>
             <w:pPr>
-              <w:spacing w:before="0" w:after="10" w:line="259" w:lineRule="auto"/>
+              <w:spacing w:before="0" w:after="10" w:line="262" w:lineRule="auto"/>
             </w:pPr>
             <w:r>
               <w:rPr>
@@ -695,7 +695,7 @@
                 <w:color w:val="2563EB"/>
                 <w:sz w:val="16"/>
               </w:rPr>
-              <w:t xml:space="preserve">• Multi-Version Database Migrations: </w:t>
+              <w:t xml:space="preserve">• Database Upgrades: </w:t>
             </w:r>
             <w:r>
               <w:rPr>
@@ -703,13 +703,13 @@
                 <w:color w:val="1E293B"/>
                 <w:sz w:val="16"/>
               </w:rPr>
-              <w:t>14+ Enterprise upgrades (v13-v17, v14-v19, v16-v19), structural data retention, legacy workflow extraction, custom migration scripts, financial ledger reconciliation.</w:t>
+              <w:t>14+ major upgrades (v13 to v19), structural data retention scripts, legacy business logic extraction, and financial ledger reconciliation without data loss.</w:t>
             </w:r>
           </w:p>
         </w:tc>
         <w:tc>
           <w:tcPr>
-            <w:tcW w:type="dxa" w:w="5227"/>
+            <w:tcW w:type="dxa" w:w="5198"/>
             <w:tcBorders>
               <w:top w:val="none"/>
               <w:left w:val="none"/>
@@ -717,15 +717,15 @@
               <w:right w:val="none"/>
             </w:tcBorders>
             <w:tcMar>
-              <w:top w:w="12" w:type="dxa"/>
-              <w:bottom w:w="16" w:type="dxa"/>
+              <w:top w:w="14" w:type="dxa"/>
+              <w:bottom w:w="18" w:type="dxa"/>
               <w:left w:w="20" w:type="dxa"/>
               <w:right w:w="30" w:type="dxa"/>
             </w:tcMar>
           </w:tcPr>
           <w:p>
             <w:pPr>
-              <w:spacing w:before="0" w:after="10" w:line="259" w:lineRule="auto"/>
+              <w:spacing w:before="0" w:after="10" w:line="262" w:lineRule="auto"/>
             </w:pPr>
             <w:r>
               <w:rPr>
@@ -734,7 +734,7 @@
                 <w:color w:val="2563EB"/>
                 <w:sz w:val="16"/>
               </w:rPr>
-              <w:t xml:space="preserve">• Tech Leadership &amp; Project Delivery: </w:t>
+              <w:t xml:space="preserve">• Technical Leadership: </w:t>
             </w:r>
             <w:r>
               <w:rPr>
@@ -742,7 +742,7 @@
                 <w:color w:val="1E293B"/>
                 <w:sz w:val="16"/>
               </w:rPr>
-              <w:t>Team leadership &amp; developer mentorship, technical solution architecture, client stakeholder management, 6-milestone delivery model, CI/CD, Docker deployment automation.</w:t>
+              <w:t>Team leadership, developer mentorship, sprint planning, client stakeholder management, 6-milestone delivery model, CI/CD, Docker deployment automation.</w:t>
             </w:r>
           </w:p>
         </w:tc>
@@ -751,7 +751,7 @@
     <w:p>
       <w:pPr>
         <w:keepNext/>
-        <w:spacing w:before="70" w:after="40"/>
+        <w:spacing w:before="80" w:after="50"/>
         <w:pBdr>
           <w:bottom w:val="single" w:sz="6" w:space="1" w:color="CBD5E1"/>
         </w:pBdr>
@@ -769,185 +769,185 @@
     <w:p>
       <w:pPr>
         <w:pStyle w:val="ListBullet"/>
-        <w:spacing w:before="0" w:after="20" w:line="262" w:lineRule="auto"/>
+        <w:spacing w:before="0" w:after="24" w:line="264" w:lineRule="auto"/>
       </w:pPr>
       <w:r>
         <w:rPr>
           <w:rFonts w:ascii="Calibri" w:hAnsi="Calibri"/>
           <w:b/>
           <w:color w:val="1E293B"/>
-          <w:sz w:val="16"/>
+          <w:sz w:val="17"/>
         </w:rPr>
-        <w:t xml:space="preserve">Enterprise SAP Integration (Customers, Orders, Deliveries &amp; Payments in 1 Month): </w:t>
+        <w:t xml:space="preserve">SAP ERP Bidirectional Sync (Built in 1 Month): </w:t>
       </w:r>
       <w:r>
         <w:rPr>
           <w:rFonts w:ascii="Calibri" w:hAnsi="Calibri"/>
           <w:color w:val="1E293B"/>
-          <w:sz w:val="16"/>
+          <w:sz w:val="17"/>
         </w:rPr>
-        <w:t>Architected and deployed an end-to-end bidirectional integration bridge between Odoo ERP and SAP enterprise system. Successfully completed full customer master sync, live sales order ingest, outbound delivery status tracking, and payment reconciliations within an aggressive 1-month delivery timeline.</w:t>
+        <w:t>Built an end-to-end integration between Odoo ERP and SAP. Synchronized customer accounts, sales orders, delivery fulfillment statuses, and payment records with automated retry queues and reconciliation within a 1-month deadline.</w:t>
       </w:r>
     </w:p>
     <w:p>
       <w:pPr>
         <w:pStyle w:val="ListBullet"/>
-        <w:spacing w:before="0" w:after="20" w:line="262" w:lineRule="auto"/>
+        <w:spacing w:before="0" w:after="24" w:line="264" w:lineRule="auto"/>
       </w:pPr>
       <w:r>
         <w:rPr>
           <w:rFonts w:ascii="Calibri" w:hAnsi="Calibri"/>
           <w:b/>
           <w:color w:val="1E293B"/>
-          <w:sz w:val="16"/>
+          <w:sz w:val="17"/>
         </w:rPr>
-        <w:t xml:space="preserve">7 International NZ &amp; AUS Payment Gateways (1-Month Delivery Milestone): </w:t>
+        <w:t xml:space="preserve">7 NZ &amp; AUS Payment Gateways (1-Month Milestone): </w:t>
       </w:r>
       <w:r>
         <w:rPr>
           <w:rFonts w:ascii="Calibri" w:hAnsi="Calibri"/>
           <w:color w:val="1E293B"/>
-          <w:sz w:val="16"/>
+          <w:sz w:val="17"/>
         </w:rPr>
-        <w:t>Engineered, integrated, and certified 7 distinct New Zealand and Australia-based payment gateways and BNPL platforms within a single 1-month milestone—ensuring automated invoice matching, instant webhook reconciliation, and PCI-DSS compliance.</w:t>
+        <w:t>Integrated and deployed 7 New Zealand and Australian payment gateways and BNPL platforms within a single 1-month milestone. Automated invoice reconciliation, payment webhooks, and PCI-DSS compliance.</w:t>
       </w:r>
     </w:p>
     <w:p>
       <w:pPr>
         <w:pStyle w:val="ListBullet"/>
-        <w:spacing w:before="0" w:after="20" w:line="262" w:lineRule="auto"/>
+        <w:spacing w:before="0" w:after="24" w:line="264" w:lineRule="auto"/>
       </w:pPr>
       <w:r>
         <w:rPr>
           <w:rFonts w:ascii="Calibri" w:hAnsi="Calibri"/>
           <w:b/>
           <w:color w:val="1E293B"/>
-          <w:sz w:val="16"/>
+          <w:sz w:val="17"/>
         </w:rPr>
-        <w:t xml:space="preserve">Third-Party Sales Force Automation (SFA) &amp; Order Ingestion Engine: </w:t>
+        <w:t xml:space="preserve">Mobile Sales Force Automation (SFA) Integration: </w:t>
       </w:r>
       <w:r>
         <w:rPr>
           <w:rFonts w:ascii="Calibri" w:hAnsi="Calibri"/>
           <w:color w:val="1E293B"/>
-          <w:sz w:val="16"/>
+          <w:sz w:val="17"/>
         </w:rPr>
-        <w:t>Architected real-time asynchronous data sync connecting third-party mobile Sales Force Automation systems with Odoo Enterprise for a leading FMCG manufacturer. Automated high-volume field sales order ingestion, automated picking creation, and robust error/conflict audit logging.</w:t>
+        <w:t>Built a real-time sync connector between an external mobile SFA system and Odoo Enterprise for an FMCG manufacturer. Handled bulk field sales order import, stock reservation, and automated delivery order creation.</w:t>
       </w:r>
     </w:p>
     <w:p>
       <w:pPr>
         <w:pStyle w:val="ListBullet"/>
-        <w:spacing w:before="0" w:after="20" w:line="262" w:lineRule="auto"/>
+        <w:spacing w:before="0" w:after="24" w:line="264" w:lineRule="auto"/>
       </w:pPr>
       <w:r>
         <w:rPr>
           <w:rFonts w:ascii="Calibri" w:hAnsi="Calibri"/>
           <w:b/>
           <w:color w:val="1E293B"/>
-          <w:sz w:val="16"/>
+          <w:sz w:val="17"/>
         </w:rPr>
-        <w:t xml:space="preserve">Multichannel Marketplace Integration Suite (Kogan &amp; Tradevine): </w:t>
+        <w:t xml:space="preserve">New Zealand Marketplaces (Kogan &amp; Tradevine): </w:t>
       </w:r>
       <w:r>
         <w:rPr>
           <w:rFonts w:ascii="Calibri" w:hAnsi="Calibri"/>
           <w:color w:val="1E293B"/>
-          <w:sz w:val="16"/>
+          <w:sz w:val="17"/>
         </w:rPr>
-        <w:t>Spearheaded real-time API integrations connecting Odoo ERP with leading New Zealand marketplaces (Kogan and Tradevine), automating catalog mapping, multi-warehouse stock reservation sync, and order fulfillment webhooks.</w:t>
+        <w:t>Built real-time API integrations connecting Odoo with Kogan and Tradevine. Automated product catalog mapping, multi-warehouse stock sync, and order fulfillment webhooks.</w:t>
       </w:r>
     </w:p>
     <w:p>
       <w:pPr>
         <w:pStyle w:val="ListBullet"/>
-        <w:spacing w:before="0" w:after="20" w:line="262" w:lineRule="auto"/>
+        <w:spacing w:before="0" w:after="24" w:line="264" w:lineRule="auto"/>
       </w:pPr>
       <w:r>
         <w:rPr>
           <w:rFonts w:ascii="Calibri" w:hAnsi="Calibri"/>
           <w:b/>
           <w:color w:val="1E293B"/>
-          <w:sz w:val="16"/>
+          <w:sz w:val="17"/>
         </w:rPr>
-        <w:t xml:space="preserve">High-Throughput Telecom SMS Marketing &amp; Notification Gateways: </w:t>
+        <w:t xml:space="preserve">High-Throughput Telecom SMS Gateways: </w:t>
       </w:r>
       <w:r>
         <w:rPr>
           <w:rFonts w:ascii="Calibri" w:hAnsi="Calibri"/>
           <w:color w:val="1E293B"/>
-          <w:sz w:val="16"/>
+          <w:sz w:val="17"/>
         </w:rPr>
-        <w:t>Engineered specialized SMS marketing gateway modules interfacing Odoo directly with telecommunication carrier APIs for automated transactional order status dispatches, OTP authentication, and compliant bulk marketing campaigns.</w:t>
+        <w:t>Built custom SMS gateway modules connecting Odoo directly to telecommunication carrier APIs for automated order updates, OTP verification, and bulk customer notification campaigns.</w:t>
       </w:r>
     </w:p>
     <w:p>
       <w:pPr>
         <w:pStyle w:val="ListBullet"/>
-        <w:spacing w:before="0" w:after="20" w:line="262" w:lineRule="auto"/>
+        <w:spacing w:before="0" w:after="24" w:line="264" w:lineRule="auto"/>
       </w:pPr>
       <w:r>
         <w:rPr>
           <w:rFonts w:ascii="Calibri" w:hAnsi="Calibri"/>
           <w:b/>
           <w:color w:val="1E293B"/>
-          <w:sz w:val="16"/>
+          <w:sz w:val="17"/>
         </w:rPr>
-        <w:t xml:space="preserve">Cross-Border Omnichannel POS &amp; Multi-Tier Prepaid Loyalty Systems: </w:t>
+        <w:t xml:space="preserve">Cross-Border Omnichannel POS &amp; Loyalty System: </w:t>
       </w:r>
       <w:r>
         <w:rPr>
           <w:rFonts w:ascii="Calibri" w:hAnsi="Calibri"/>
           <w:color w:val="1E293B"/>
-          <w:sz w:val="16"/>
+          <w:sz w:val="17"/>
         </w:rPr>
-        <w:t>Architected multi-branch retail POS systems operating across nationwide chains and international cross-border retail outlets, complete with custom multi-tier prepaid loyalty cards, gift card wallets, and offline-to-online reconciliation.</w:t>
+        <w:t>Deployed retail POS systems across nationwide store chains and an international branch in India. Built custom multi-tier prepaid membership cards, customer balance wallets, and offline-to-online sync.</w:t>
       </w:r>
     </w:p>
     <w:p>
       <w:pPr>
         <w:pStyle w:val="ListBullet"/>
-        <w:spacing w:before="0" w:after="20" w:line="262" w:lineRule="auto"/>
+        <w:spacing w:before="0" w:after="24" w:line="264" w:lineRule="auto"/>
       </w:pPr>
       <w:r>
         <w:rPr>
           <w:rFonts w:ascii="Calibri" w:hAnsi="Calibri"/>
           <w:b/>
           <w:color w:val="1E293B"/>
-          <w:sz w:val="16"/>
+          <w:sz w:val="17"/>
         </w:rPr>
-        <w:t xml:space="preserve">Universal Odoo Database Model Context Protocol (MCP) Server: </w:t>
+        <w:t xml:space="preserve">Odoo Database Model Context Protocol (MCP) Server: </w:t>
       </w:r>
       <w:r>
         <w:rPr>
           <w:rFonts w:ascii="Calibri" w:hAnsi="Calibri"/>
           <w:color w:val="1E293B"/>
-          <w:sz w:val="16"/>
+          <w:sz w:val="17"/>
         </w:rPr>
-        <w:t>Architected and deployed a universal MCP server exposing Odoo ORM schemas and database models safely to external AI agent platforms (Claude Code, Gemini Enterprise, Antigravity, Cline, Puku) for automated schema inspection and task orchestration.</w:t>
+        <w:t>Built and deployed an MCP server exposing Odoo ORM schemas and models to AI coding tools (Claude Code, Antigravity, Cline, Puku) for automated schema inspection and task execution.</w:t>
       </w:r>
     </w:p>
     <w:p>
       <w:pPr>
         <w:pStyle w:val="ListBullet"/>
-        <w:spacing w:before="0" w:after="20" w:line="262" w:lineRule="auto"/>
+        <w:spacing w:before="0" w:after="24" w:line="264" w:lineRule="auto"/>
       </w:pPr>
       <w:r>
         <w:rPr>
           <w:rFonts w:ascii="Calibri" w:hAnsi="Calibri"/>
           <w:b/>
           <w:color w:val="1E293B"/>
-          <w:sz w:val="16"/>
+          <w:sz w:val="17"/>
         </w:rPr>
-        <w:t xml:space="preserve">ZATCA Phase 2 &amp; NBR Tax Cryptographic Invoicing Integrations: </w:t>
+        <w:t xml:space="preserve">ZATCA Phase 2 &amp; Tax Invoicing Compliance: </w:t>
       </w:r>
       <w:r>
         <w:rPr>
           <w:rFonts w:ascii="Calibri" w:hAnsi="Calibri"/>
           <w:color w:val="1E293B"/>
-          <w:sz w:val="16"/>
+          <w:sz w:val="17"/>
         </w:rPr>
-        <w:t>Engineered mission-critical tax compliance modules interfacing Odoo's accounting engine with government regulatory portals (ZATCA Phase 2 e-invoicing in Saudi Arabia with XML signing, ECDSA cryptographic hashing, QR codes, and Bangladesh NBR tax engines).</w:t>
+        <w:t>Built tax compliance modules connecting Odoo accounting with regulatory portals: Saudi Arabia ZATCA Phase 2 (XML signing, ECDSA cryptographic hashing, QR codes) and Bangladesh NBR tax engines.</w:t>
       </w:r>
     </w:p>
     <w:p>
@@ -958,7 +958,7 @@
     <w:p>
       <w:pPr>
         <w:keepNext/>
-        <w:spacing w:before="0" w:after="40"/>
+        <w:spacing w:before="0" w:after="50"/>
         <w:pBdr>
           <w:bottom w:val="single" w:sz="6" w:space="1" w:color="CBD5E1"/>
         </w:pBdr>
@@ -985,7 +985,7 @@
           <w:color w:val="0F172A"/>
           <w:sz w:val="19"/>
         </w:rPr>
-        <w:t>Head of Technology &amp; Lead Architect  |  Metamorphosis Ltd.</w:t>
+        <w:t>Head of Technology  |  Metamorphosis Ltd.</w:t>
       </w:r>
       <w:r>
         <w:rPr>
@@ -1000,122 +1000,122 @@
     <w:p>
       <w:pPr>
         <w:pStyle w:val="ListBullet"/>
-        <w:spacing w:before="0" w:after="20" w:line="262" w:lineRule="auto"/>
+        <w:spacing w:before="0" w:after="24" w:line="264" w:lineRule="auto"/>
       </w:pPr>
       <w:r>
         <w:rPr>
           <w:rFonts w:ascii="Calibri" w:hAnsi="Calibri"/>
           <w:b/>
           <w:color w:val="1E293B"/>
-          <w:sz w:val="16"/>
+          <w:sz w:val="17"/>
         </w:rPr>
-        <w:t xml:space="preserve">Technical Leadership for Complex ERP Customizations: </w:t>
+        <w:t xml:space="preserve">Technical Leadership for ERP Customizations: </w:t>
       </w:r>
       <w:r>
         <w:rPr>
           <w:rFonts w:ascii="Calibri" w:hAnsi="Calibri"/>
           <w:color w:val="1E293B"/>
-          <w:sz w:val="16"/>
+          <w:sz w:val="17"/>
         </w:rPr>
-        <w:t>Directing engineering teams delivering high-consequence Odoo ERP customization projects for 85+ global and domestic enterprise clients (Bangladesh, New Zealand, Saudi Arabia, Spain, South Sudan). Personally designing core R&amp;D workflows, custom themes, and proprietary integrations.</w:t>
+        <w:t>Leads engineering teams delivering Odoo customization projects for 85+ global and domestic enterprise clients (Bangladesh, New Zealand, Saudi Arabia, Spain, South Sudan). Guides core architecture, custom themes, and proprietary integrations.</w:t>
       </w:r>
     </w:p>
     <w:p>
       <w:pPr>
         <w:pStyle w:val="ListBullet"/>
-        <w:spacing w:before="0" w:after="20" w:line="262" w:lineRule="auto"/>
+        <w:spacing w:before="0" w:after="24" w:line="264" w:lineRule="auto"/>
       </w:pPr>
       <w:r>
         <w:rPr>
           <w:rFonts w:ascii="Calibri" w:hAnsi="Calibri"/>
           <w:b/>
           <w:color w:val="1E293B"/>
-          <w:sz w:val="16"/>
+          <w:sz w:val="17"/>
         </w:rPr>
-        <w:t xml:space="preserve">Rapid Enterprise Integrations (SAP, SFA, &amp; 7 NZ/AUS Payment Gateways): </w:t>
+        <w:t xml:space="preserve">Fast-Track Enterprise Integrations (SAP, SFA, 7 Payment Gateways): </w:t>
       </w:r>
       <w:r>
         <w:rPr>
           <w:rFonts w:ascii="Calibri" w:hAnsi="Calibri"/>
           <w:color w:val="1E293B"/>
-          <w:sz w:val="16"/>
+          <w:sz w:val="17"/>
         </w:rPr>
-        <w:t>Directed the rapid delivery of complex integrations including full SAP sync (customers, orders, deliveries, payments) within 1 month, SFA field sales ordering for FMCG enterprises, and the simultaneous rollout of 7 international NZ &amp; AUS payment gateways within a 1-month milestone.</w:t>
+        <w:t>Led the delivery of major integrations on tight timelines: full SAP sync (customers, orders, deliveries, payments) in 1 month, SFA field order import for FMCG clients, and 7 NZ &amp; AUS payment gateways in a 1-month milestone.</w:t>
       </w:r>
     </w:p>
     <w:p>
       <w:pPr>
         <w:pStyle w:val="ListBullet"/>
-        <w:spacing w:before="0" w:after="20" w:line="262" w:lineRule="auto"/>
+        <w:spacing w:before="0" w:after="24" w:line="264" w:lineRule="auto"/>
       </w:pPr>
       <w:r>
         <w:rPr>
           <w:rFonts w:ascii="Calibri" w:hAnsi="Calibri"/>
           <w:b/>
           <w:color w:val="1E293B"/>
-          <w:sz w:val="16"/>
+          <w:sz w:val="17"/>
         </w:rPr>
-        <w:t xml:space="preserve">Hyper-Velocity Team Delivery (3-Month Scope in 2–3 Weeks): </w:t>
+        <w:t xml:space="preserve">Fast-Paced Team Delivery (3-Month Scope in 2–3 Weeks): </w:t>
       </w:r>
       <w:r>
         <w:rPr>
           <w:rFonts w:ascii="Calibri" w:hAnsi="Calibri"/>
           <w:color w:val="1E293B"/>
-          <w:sz w:val="16"/>
+          <w:sz w:val="17"/>
         </w:rPr>
-        <w:t>Pioneered a delivery methodology combining modular Odoo design patterns, automated QA test suites, and local AI agentic tooling (Claude Code, Antigravity, vLLM/Ollama with DeepSeek-R1/Qwen2.5), cutting project cycle times by up to 75% with near-100% first-pass UAT acceptance.</w:t>
+        <w:t>Established a delivery workflow combining modular Odoo patterns, automated test suites, and local AI tools (Claude Code, Antigravity, local LLMs), cutting project cycle times by up to 75% with high first-pass UAT acceptance.</w:t>
       </w:r>
     </w:p>
     <w:p>
       <w:pPr>
         <w:pStyle w:val="ListBullet"/>
-        <w:spacing w:before="0" w:after="20" w:line="262" w:lineRule="auto"/>
+        <w:spacing w:before="0" w:after="24" w:line="264" w:lineRule="auto"/>
       </w:pPr>
       <w:r>
         <w:rPr>
           <w:rFonts w:ascii="Calibri" w:hAnsi="Calibri"/>
           <w:b/>
           <w:color w:val="1E293B"/>
-          <w:sz w:val="16"/>
+          <w:sz w:val="17"/>
         </w:rPr>
-        <w:t xml:space="preserve">Odoo Enterprise Multi-Version Upgrades (v13.0 to v19.0): </w:t>
+        <w:t xml:space="preserve">Odoo Enterprise Database Upgrades (v13.0 to v19.0): </w:t>
       </w:r>
       <w:r>
         <w:rPr>
           <w:rFonts w:ascii="Calibri" w:hAnsi="Calibri"/>
           <w:color w:val="1E293B"/>
-          <w:sz w:val="16"/>
+          <w:sz w:val="17"/>
         </w:rPr>
-        <w:t>Supervised 14+ database upgrade programs across multi-version jumps (v13-v17, v14-v19, v16-v19). Developed proprietary structural data retention scripts to carry over decades of custom business data while retiring technical debt.</w:t>
+        <w:t>Led 14+ major database upgrades across multiple version jumps (v13-v17, v14-v19, v16-v19). Used custom data retention scripts to migrate years of custom business data while retiring outdated code.</w:t>
       </w:r>
     </w:p>
     <w:p>
       <w:pPr>
         <w:pStyle w:val="ListBullet"/>
-        <w:spacing w:before="0" w:after="20" w:line="262" w:lineRule="auto"/>
+        <w:spacing w:before="0" w:after="24" w:line="264" w:lineRule="auto"/>
       </w:pPr>
       <w:r>
         <w:rPr>
           <w:rFonts w:ascii="Calibri" w:hAnsi="Calibri"/>
           <w:b/>
           <w:color w:val="1E293B"/>
-          <w:sz w:val="16"/>
+          <w:sz w:val="17"/>
         </w:rPr>
-        <w:t xml:space="preserve">High-Availability Server Worker Isolation: </w:t>
+        <w:t xml:space="preserve">Nginx Server Worker Isolation: </w:t>
       </w:r>
       <w:r>
         <w:rPr>
           <w:rFonts w:ascii="Calibri" w:hAnsi="Calibri"/>
           <w:color w:val="1E293B"/>
-          <w:sz w:val="16"/>
+          <w:sz w:val="17"/>
         </w:rPr>
-        <w:t>Designed Nginx upstream routing dividing server workers into dedicated pools (isolating CPU-intensive external API/e-commerce sync from internal administrative back-office Gunicorn workers), eliminating downtime and latency spikes.</w:t>
+        <w:t>Configured Nginx upstream routing into separate worker pools, isolating heavy external API sync and e-commerce traffic from internal back-office users to eliminate slowdowns.</w:t>
       </w:r>
     </w:p>
     <w:p>
       <w:pPr>
         <w:keepNext/>
-        <w:spacing w:before="80" w:after="20"/>
+        <w:spacing w:before="90" w:after="20"/>
       </w:pPr>
       <w:r>
         <w:rPr>
@@ -1139,76 +1139,76 @@
     <w:p>
       <w:pPr>
         <w:pStyle w:val="ListBullet"/>
-        <w:spacing w:before="0" w:after="20" w:line="262" w:lineRule="auto"/>
+        <w:spacing w:before="0" w:after="24" w:line="264" w:lineRule="auto"/>
       </w:pPr>
       <w:r>
         <w:rPr>
           <w:rFonts w:ascii="Calibri" w:hAnsi="Calibri"/>
           <w:b/>
           <w:color w:val="1E293B"/>
-          <w:sz w:val="16"/>
+          <w:sz w:val="17"/>
         </w:rPr>
-        <w:t xml:space="preserve">Proprietary &amp; Marketplace API Engineering: </w:t>
+        <w:t xml:space="preserve">Marketplace &amp; Payment Integrations: </w:t>
       </w:r>
       <w:r>
         <w:rPr>
           <w:rFonts w:ascii="Calibri" w:hAnsi="Calibri"/>
           <w:color w:val="1E293B"/>
-          <w:sz w:val="16"/>
+          <w:sz w:val="17"/>
         </w:rPr>
-        <w:t>Designed and implemented real-time sync modules linking Odoo ERP to international e-commerce channels (Kogan, Tradevine, BNPL platforms). Built robust reconciliation jobs to auto-correct inventory drift.</w:t>
+        <w:t>Built real-time sync modules connecting Odoo to international e-commerce channels (Kogan, Tradevine, BNPL platforms). Built automated reconciliation scripts to prevent stock mismatches.</w:t>
       </w:r>
     </w:p>
     <w:p>
       <w:pPr>
         <w:pStyle w:val="ListBullet"/>
-        <w:spacing w:before="0" w:after="20" w:line="262" w:lineRule="auto"/>
+        <w:spacing w:before="0" w:after="24" w:line="264" w:lineRule="auto"/>
       </w:pPr>
       <w:r>
         <w:rPr>
           <w:rFonts w:ascii="Calibri" w:hAnsi="Calibri"/>
           <w:b/>
           <w:color w:val="1E293B"/>
-          <w:sz w:val="16"/>
+          <w:sz w:val="17"/>
         </w:rPr>
-        <w:t xml:space="preserve">Custom Odoo Module Architecture &amp; SFA Sync: </w:t>
+        <w:t xml:space="preserve">Custom Module Development &amp; SFA Sync: </w:t>
       </w:r>
       <w:r>
         <w:rPr>
           <w:rFonts w:ascii="Calibri" w:hAnsi="Calibri"/>
           <w:color w:val="1E293B"/>
-          <w:sz w:val="16"/>
+          <w:sz w:val="17"/>
         </w:rPr>
-        <w:t>Hand-coded custom modules for business process automations, discrete manufacturing assembly, multi-currency accounting, and mobile Sales Force Automation (SFA) backend order processing.</w:t>
+        <w:t>Wrote custom Odoo modules for business automations, discrete manufacturing assembly lines, multi-currency accounting, and mobile SFA order processing.</w:t>
       </w:r>
     </w:p>
     <w:p>
       <w:pPr>
         <w:pStyle w:val="ListBullet"/>
-        <w:spacing w:before="0" w:after="20" w:line="262" w:lineRule="auto"/>
+        <w:spacing w:before="0" w:after="24" w:line="264" w:lineRule="auto"/>
       </w:pPr>
       <w:r>
         <w:rPr>
           <w:rFonts w:ascii="Calibri" w:hAnsi="Calibri"/>
           <w:b/>
           <w:color w:val="1E293B"/>
-          <w:sz w:val="16"/>
+          <w:sz w:val="17"/>
         </w:rPr>
-        <w:t xml:space="preserve">Odoo Deployment &amp; Infrastructure Automation: </w:t>
+        <w:t xml:space="preserve">Deployment &amp; Infrastructure Automation: </w:t>
       </w:r>
       <w:r>
         <w:rPr>
           <w:rFonts w:ascii="Calibri" w:hAnsi="Calibri"/>
           <w:color w:val="1E293B"/>
-          <w:sz w:val="16"/>
+          <w:sz w:val="17"/>
         </w:rPr>
-        <w:t>Architected automated Docker and Bash deployment pipelines managing 300+ live Odoo database instances, reducing deployment onboarding time by 85%.</w:t>
+        <w:t>Built Docker and Bash deployment pipelines managing 300+ live Odoo instances, cutting onboarding deployment time by 85%.</w:t>
       </w:r>
     </w:p>
     <w:p>
       <w:pPr>
         <w:keepNext/>
-        <w:spacing w:before="80" w:after="20"/>
+        <w:spacing w:before="90" w:after="20"/>
       </w:pPr>
       <w:r>
         <w:rPr>
@@ -1232,53 +1232,53 @@
     <w:p>
       <w:pPr>
         <w:pStyle w:val="ListBullet"/>
-        <w:spacing w:before="0" w:after="20" w:line="262" w:lineRule="auto"/>
+        <w:spacing w:before="0" w:after="24" w:line="264" w:lineRule="auto"/>
       </w:pPr>
       <w:r>
         <w:rPr>
           <w:rFonts w:ascii="Calibri" w:hAnsi="Calibri"/>
           <w:b/>
           <w:color w:val="1E293B"/>
-          <w:sz w:val="16"/>
+          <w:sz w:val="17"/>
         </w:rPr>
-        <w:t xml:space="preserve">Bespoke Customization to Business Requirements: </w:t>
+        <w:t xml:space="preserve">Custom Modules Built to Business Requirements: </w:t>
       </w:r>
       <w:r>
         <w:rPr>
           <w:rFonts w:ascii="Calibri" w:hAnsi="Calibri"/>
           <w:color w:val="1E293B"/>
-          <w:sz w:val="16"/>
+          <w:sz w:val="17"/>
         </w:rPr>
-        <w:t>Developed hundreds of custom Odoo modules tailored strictly to client business logic, custom operational workflows, dynamic PDF reporting, and specialized portal features.</w:t>
+        <w:t>Developed hundreds of custom Odoo modules matching specific client business workflows, custom reporting, and customer portal features.</w:t>
       </w:r>
     </w:p>
     <w:p>
       <w:pPr>
         <w:pStyle w:val="ListBullet"/>
-        <w:spacing w:before="0" w:after="20" w:line="262" w:lineRule="auto"/>
+        <w:spacing w:before="0" w:after="24" w:line="264" w:lineRule="auto"/>
       </w:pPr>
       <w:r>
         <w:rPr>
           <w:rFonts w:ascii="Calibri" w:hAnsi="Calibri"/>
           <w:b/>
           <w:color w:val="1E293B"/>
-          <w:sz w:val="16"/>
+          <w:sz w:val="17"/>
         </w:rPr>
-        <w:t xml:space="preserve">Payment Gateways &amp; Database Tuning: </w:t>
+        <w:t xml:space="preserve">Payment Gateways &amp; PostgreSQL Tuning: </w:t>
       </w:r>
       <w:r>
         <w:rPr>
           <w:rFonts w:ascii="Calibri" w:hAnsi="Calibri"/>
           <w:color w:val="1E293B"/>
-          <w:sz w:val="16"/>
+          <w:sz w:val="17"/>
         </w:rPr>
-        <w:t>Engineered secure payment gateway integrations (cards, mobile financial services) and optimized multi-table PostgreSQL queries and indexing for high-volume transactions.</w:t>
+        <w:t>Integrated local payment gateways (cards, mobile banking) and optimized complex PostgreSQL queries and indexing for high-volume transactions.</w:t>
       </w:r>
     </w:p>
     <w:p>
       <w:pPr>
         <w:keepNext/>
-        <w:spacing w:before="80" w:after="20"/>
+        <w:spacing w:before="90" w:after="20"/>
       </w:pPr>
       <w:r>
         <w:rPr>
@@ -1302,30 +1302,30 @@
     <w:p>
       <w:pPr>
         <w:pStyle w:val="ListBullet"/>
-        <w:spacing w:before="0" w:after="20" w:line="262" w:lineRule="auto"/>
+        <w:spacing w:before="0" w:after="24" w:line="264" w:lineRule="auto"/>
       </w:pPr>
       <w:r>
         <w:rPr>
           <w:rFonts w:ascii="Calibri" w:hAnsi="Calibri"/>
           <w:b/>
           <w:color w:val="1E293B"/>
-          <w:sz w:val="16"/>
+          <w:sz w:val="17"/>
         </w:rPr>
-        <w:t xml:space="preserve">Magento 2+ Integration &amp; Mobile API: </w:t>
+        <w:t xml:space="preserve">Magento 2+ Backend &amp; Mobile APIs: </w:t>
       </w:r>
       <w:r>
         <w:rPr>
           <w:rFonts w:ascii="Calibri" w:hAnsi="Calibri"/>
           <w:color w:val="1E293B"/>
-          <w:sz w:val="16"/>
+          <w:sz w:val="17"/>
         </w:rPr>
-        <w:t>Engineered backend web services and API endpoints for Magento 2+ e-commerce architectures powering high-performance mobile clients. Managed cloud servers and SSL/Nginx reverse proxies.</w:t>
+        <w:t>Built backend web services and API endpoints for Magento 2+ e-commerce platforms connected to mobile apps. Managed cloud servers and SSL/Nginx reverse proxies.</w:t>
       </w:r>
     </w:p>
     <w:p>
       <w:pPr>
         <w:keepNext/>
-        <w:spacing w:before="80" w:after="20"/>
+        <w:spacing w:before="90" w:after="20"/>
       </w:pPr>
       <w:r>
         <w:rPr>
@@ -1349,14 +1349,14 @@
     <w:p>
       <w:pPr>
         <w:pStyle w:val="ListBullet"/>
-        <w:spacing w:before="0" w:after="20" w:line="262" w:lineRule="auto"/>
+        <w:spacing w:before="0" w:after="24" w:line="264" w:lineRule="auto"/>
       </w:pPr>
       <w:r>
         <w:rPr>
           <w:rFonts w:ascii="Calibri" w:hAnsi="Calibri"/>
           <w:b/>
           <w:color w:val="1E293B"/>
-          <w:sz w:val="16"/>
+          <w:sz w:val="17"/>
         </w:rPr>
         <w:t xml:space="preserve">Enterprise Infrastructure Administration: </w:t>
       </w:r>
@@ -1364,7 +1364,7 @@
         <w:rPr>
           <w:rFonts w:ascii="Calibri" w:hAnsi="Calibri"/>
           <w:color w:val="1E293B"/>
-          <w:sz w:val="16"/>
+          <w:sz w:val="17"/>
         </w:rPr>
         <w:t>Managed enterprise IT operations, Windows Server administration (Active Directory, DNS, IIS, Group Policy up to 2019), network security, and hardware/software deployments.</w:t>
       </w:r>
@@ -1372,7 +1372,7 @@
     <w:p>
       <w:pPr>
         <w:keepNext/>
-        <w:spacing w:before="80" w:after="40"/>
+        <w:spacing w:before="80" w:after="50"/>
         <w:pBdr>
           <w:bottom w:val="single" w:sz="6" w:space="1" w:color="CBD5E1"/>
         </w:pBdr>
@@ -1390,14 +1390,14 @@
     <w:p>
       <w:pPr>
         <w:pStyle w:val="ListBullet"/>
-        <w:spacing w:before="0" w:after="20" w:line="262" w:lineRule="auto"/>
+        <w:spacing w:before="0" w:after="24" w:line="264" w:lineRule="auto"/>
       </w:pPr>
       <w:r>
         <w:rPr>
           <w:rFonts w:ascii="Calibri" w:hAnsi="Calibri"/>
           <w:b/>
           <w:color w:val="1E293B"/>
-          <w:sz w:val="16"/>
+          <w:sz w:val="17"/>
         </w:rPr>
         <w:t xml:space="preserve">Certified Odoo Consultant: </w:t>
       </w:r>
@@ -1405,7 +1405,7 @@
         <w:rPr>
           <w:rFonts w:ascii="Calibri" w:hAnsi="Calibri"/>
           <w:color w:val="1E293B"/>
-          <w:sz w:val="16"/>
+          <w:sz w:val="17"/>
         </w:rPr>
         <w:t>Metamorphosis Ltd. (Official Odoo Silver Partner). Extensive expertise in Odoo standard architecture, ORM, customization guidelines, and business process modeling.</w:t>
       </w:r>
@@ -1413,14 +1413,14 @@
     <w:p>
       <w:pPr>
         <w:pStyle w:val="ListBullet"/>
-        <w:spacing w:before="0" w:after="20" w:line="262" w:lineRule="auto"/>
+        <w:spacing w:before="0" w:after="24" w:line="264" w:lineRule="auto"/>
       </w:pPr>
       <w:r>
         <w:rPr>
           <w:rFonts w:ascii="Calibri" w:hAnsi="Calibri"/>
           <w:b/>
           <w:color w:val="1E293B"/>
-          <w:sz w:val="16"/>
+          <w:sz w:val="17"/>
         </w:rPr>
         <w:t xml:space="preserve">Master of Information Technology (MIT): </w:t>
       </w:r>
@@ -1428,7 +1428,7 @@
         <w:rPr>
           <w:rFonts w:ascii="Calibri" w:hAnsi="Calibri"/>
           <w:color w:val="1E293B"/>
-          <w:sz w:val="16"/>
+          <w:sz w:val="17"/>
         </w:rPr>
         <w:t>Jahangirnagar University (2018 – 2019). Focus on Enterprise Systems, Advanced Databases, and Distributed Architectures.</w:t>
       </w:r>
@@ -1436,14 +1436,14 @@
     <w:p>
       <w:pPr>
         <w:pStyle w:val="ListBullet"/>
-        <w:spacing w:before="0" w:after="20" w:line="262" w:lineRule="auto"/>
+        <w:spacing w:before="0" w:after="24" w:line="264" w:lineRule="auto"/>
       </w:pPr>
       <w:r>
         <w:rPr>
           <w:rFonts w:ascii="Calibri" w:hAnsi="Calibri"/>
           <w:b/>
           <w:color w:val="1E293B"/>
-          <w:sz w:val="16"/>
+          <w:sz w:val="17"/>
         </w:rPr>
         <w:t xml:space="preserve">Bachelor of Science (B.Sc): </w:t>
       </w:r>
@@ -1451,7 +1451,7 @@
         <w:rPr>
           <w:rFonts w:ascii="Calibri" w:hAnsi="Calibri"/>
           <w:color w:val="1E293B"/>
-          <w:sz w:val="16"/>
+          <w:sz w:val="17"/>
         </w:rPr>
         <w:t>Shahjalal University of Science and Technology (SUST). 1st Major in Mathematics, 2nd Major in Computer Science &amp; Engineering (CSE).</w:t>
       </w:r>
@@ -1459,14 +1459,14 @@
     <w:p>
       <w:pPr>
         <w:pStyle w:val="ListBullet"/>
-        <w:spacing w:before="0" w:after="20" w:line="262" w:lineRule="auto"/>
+        <w:spacing w:before="0" w:after="24" w:line="264" w:lineRule="auto"/>
       </w:pPr>
       <w:r>
         <w:rPr>
           <w:rFonts w:ascii="Calibri" w:hAnsi="Calibri"/>
           <w:b/>
           <w:color w:val="1E293B"/>
-          <w:sz w:val="16"/>
+          <w:sz w:val="17"/>
         </w:rPr>
         <w:t xml:space="preserve">IEEE Research Author (2021): </w:t>
       </w:r>
@@ -1474,14 +1474,14 @@
         <w:rPr>
           <w:rFonts w:ascii="Calibri" w:hAnsi="Calibri"/>
           <w:color w:val="1E293B"/>
-          <w:sz w:val="16"/>
+          <w:sz w:val="17"/>
         </w:rPr>
-        <w:t>Published paper on 'Performance Enhancement of Hadoop MapReduce' introducing the IMC algorithm (65% data processing efficiency improvement). Applied core distributed computing principles to optimize high-volume Odoo database operations.</w:t>
+        <w:t>Published paper on data processing optimization in Hadoop MapReduce, introducing the IMC algorithm (65% efficiency gain). Applied these distributed processing principles to high-volume Odoo database operations.</w:t>
       </w:r>
     </w:p>
     <w:p>
       <w:pPr>
-        <w:spacing w:before="80" w:after="0"/>
+        <w:spacing w:before="100" w:after="0"/>
         <w:jc w:val="center"/>
       </w:pPr>
       <w:r>
@@ -1490,12 +1490,12 @@
           <w:color w:val="64748B"/>
           <w:sz w:val="14"/>
         </w:rPr>
-        <w:t>Md Niaj Shahriar Shishir  |  Tech Lead — Odoo Customization &amp; Integrations  |  Portfolio: nsrshishir.github.io/nsrshishir</w:t>
+        <w:t>Md Niaj Shahriar Shishir  |  Technical Lead — Odoo &amp; Integrations  |  Portfolio: nsrshishir.github.io/nsrshishir</w:t>
       </w:r>
     </w:p>
     <w:sectPr>
       <w:pgSz w:w="11909" w:h="16834"/>
-      <w:pgMar w:top="576" w:right="720" w:bottom="576" w:left="720" w:header="720" w:footer="720" w:gutter="0"/>
+      <w:pgMar w:top="605" w:right="749" w:bottom="605" w:left="749" w:header="720" w:footer="720" w:gutter="0"/>
       <w:cols w:space="720"/>
       <w:docGrid w:linePitch="360"/>
     </w:sectPr>

</xml_diff>

<commit_message>
[REF] cv: add historical data retention & schema extraction strategy to Tech Lead DOCX CV
</commit_message>
<xml_diff>
--- a/Md_Niaj_Shahriar_Shishir_Tech_Lead_Odoo_Customization_Integrations.docx
+++ b/Md_Niaj_Shahriar_Shishir_Tech_Lead_Odoo_Customization_Integrations.docx
@@ -10,13 +10,13 @@
         <w:tblLook w:firstColumn="1" w:firstRow="1" w:lastColumn="0" w:lastRow="0" w:noHBand="0" w:noVBand="1" w:val="04A0"/>
       </w:tblPr>
       <w:tblGrid>
-        <w:gridCol w:w="5205"/>
-        <w:gridCol w:w="5205"/>
+        <w:gridCol w:w="5234"/>
+        <w:gridCol w:w="5234"/>
       </w:tblGrid>
       <w:tr>
         <w:tc>
           <w:tcPr>
-            <w:tcW w:type="dxa" w:w="6696"/>
+            <w:tcW w:type="dxa" w:w="6739"/>
             <w:tcBorders>
               <w:top w:val="none"/>
               <w:left w:val="none"/>
@@ -39,7 +39,7 @@
                 <w:rFonts w:ascii="Arial" w:hAnsi="Arial"/>
                 <w:b/>
                 <w:color w:val="0F172A"/>
-                <w:sz w:val="36"/>
+                <w:sz w:val="35"/>
               </w:rPr>
               <w:t>Md Niaj Shahriar Shishir</w:t>
             </w:r>
@@ -53,7 +53,7 @@
                 <w:rFonts w:ascii="Arial" w:hAnsi="Arial"/>
                 <w:b/>
                 <w:color w:val="2563EB"/>
-                <w:sz w:val="19"/>
+                <w:sz w:val="18"/>
               </w:rPr>
               <w:t>Technical Lead | Odoo ERP &amp; System Integrations</w:t>
             </w:r>
@@ -66,7 +66,7 @@
               <w:rPr>
                 <w:rFonts w:ascii="Calibri" w:hAnsi="Calibri"/>
                 <w:color w:val="475569"/>
-                <w:sz w:val="17"/>
+                <w:sz w:val="16"/>
               </w:rPr>
               <w:t>Certified Odoo Consultant | Head of Technology | 7+ Years Experience</w:t>
             </w:r>
@@ -74,7 +74,7 @@
         </w:tc>
         <w:tc>
           <w:tcPr>
-            <w:tcW w:type="dxa" w:w="3715"/>
+            <w:tcW w:type="dxa" w:w="3730"/>
             <w:tcBorders>
               <w:top w:val="none"/>
               <w:left w:val="none"/>
@@ -232,7 +232,7 @@
     </w:tbl>
     <w:p>
       <w:pPr>
-        <w:spacing w:before="60" w:after="80"/>
+        <w:spacing w:before="40" w:after="80"/>
         <w:pBdr>
           <w:bottom w:val="single" w:sz="10" w:space="1" w:color="2563EB"/>
         </w:pBdr>
@@ -246,15 +246,15 @@
         <w:tblLook w:firstColumn="1" w:firstRow="1" w:lastColumn="0" w:lastRow="0" w:noHBand="0" w:noVBand="1" w:val="04A0"/>
       </w:tblPr>
       <w:tblGrid>
-        <w:gridCol w:w="2603"/>
-        <w:gridCol w:w="2603"/>
-        <w:gridCol w:w="2603"/>
-        <w:gridCol w:w="2603"/>
+        <w:gridCol w:w="2617"/>
+        <w:gridCol w:w="2617"/>
+        <w:gridCol w:w="2617"/>
+        <w:gridCol w:w="2617"/>
       </w:tblGrid>
       <w:tr>
         <w:tc>
           <w:tcPr>
-            <w:tcW w:type="dxa" w:w="2592"/>
+            <w:tcW w:type="dxa" w:w="2606"/>
             <w:shd w:fill="F1F5F9"/>
             <w:tcBorders>
               <w:top w:val="none"/>
@@ -263,10 +263,10 @@
               <w:right w:val="none"/>
             </w:tcBorders>
             <w:tcMar>
-              <w:top w:w="40" w:type="dxa"/>
-              <w:bottom w:w="40" w:type="dxa"/>
-              <w:left w:w="30" w:type="dxa"/>
-              <w:right w:w="30" w:type="dxa"/>
+              <w:top w:w="35" w:type="dxa"/>
+              <w:bottom w:w="35" w:type="dxa"/>
+              <w:left w:w="25" w:type="dxa"/>
+              <w:right w:w="25" w:type="dxa"/>
             </w:tcMar>
           </w:tcPr>
           <w:p>
@@ -302,7 +302,7 @@
         </w:tc>
         <w:tc>
           <w:tcPr>
-            <w:tcW w:type="dxa" w:w="2592"/>
+            <w:tcW w:type="dxa" w:w="2606"/>
             <w:shd w:fill="F1F5F9"/>
             <w:tcBorders>
               <w:top w:val="none"/>
@@ -311,10 +311,10 @@
               <w:right w:val="none"/>
             </w:tcBorders>
             <w:tcMar>
-              <w:top w:w="40" w:type="dxa"/>
-              <w:bottom w:w="40" w:type="dxa"/>
-              <w:left w:w="30" w:type="dxa"/>
-              <w:right w:w="30" w:type="dxa"/>
+              <w:top w:w="35" w:type="dxa"/>
+              <w:bottom w:w="35" w:type="dxa"/>
+              <w:left w:w="25" w:type="dxa"/>
+              <w:right w:w="25" w:type="dxa"/>
             </w:tcMar>
           </w:tcPr>
           <w:p>
@@ -350,7 +350,7 @@
         </w:tc>
         <w:tc>
           <w:tcPr>
-            <w:tcW w:type="dxa" w:w="2592"/>
+            <w:tcW w:type="dxa" w:w="2606"/>
             <w:shd w:fill="F1F5F9"/>
             <w:tcBorders>
               <w:top w:val="none"/>
@@ -359,10 +359,10 @@
               <w:right w:val="none"/>
             </w:tcBorders>
             <w:tcMar>
-              <w:top w:w="40" w:type="dxa"/>
-              <w:bottom w:w="40" w:type="dxa"/>
-              <w:left w:w="30" w:type="dxa"/>
-              <w:right w:w="30" w:type="dxa"/>
+              <w:top w:w="35" w:type="dxa"/>
+              <w:bottom w:w="35" w:type="dxa"/>
+              <w:left w:w="25" w:type="dxa"/>
+              <w:right w:w="25" w:type="dxa"/>
             </w:tcMar>
           </w:tcPr>
           <w:p>
@@ -392,13 +392,13 @@
                 <w:color w:val="2563EB"/>
                 <w:sz w:val="12"/>
               </w:rPr>
-              <w:t>ODOO 13 THROUGH 19</w:t>
+              <w:t>ZERO DATA LOSS RETENTION</w:t>
             </w:r>
           </w:p>
         </w:tc>
         <w:tc>
           <w:tcPr>
-            <w:tcW w:type="dxa" w:w="2592"/>
+            <w:tcW w:type="dxa" w:w="2606"/>
             <w:shd w:fill="F1F5F9"/>
             <w:tcBorders>
               <w:top w:val="none"/>
@@ -407,10 +407,10 @@
               <w:right w:val="none"/>
             </w:tcBorders>
             <w:tcMar>
-              <w:top w:w="40" w:type="dxa"/>
-              <w:bottom w:w="40" w:type="dxa"/>
-              <w:left w:w="30" w:type="dxa"/>
-              <w:right w:w="30" w:type="dxa"/>
+              <w:top w:w="35" w:type="dxa"/>
+              <w:bottom w:w="35" w:type="dxa"/>
+              <w:left w:w="25" w:type="dxa"/>
+              <w:right w:w="25" w:type="dxa"/>
             </w:tcMar>
           </w:tcPr>
           <w:p>
@@ -449,7 +449,7 @@
     <w:p>
       <w:pPr>
         <w:keepNext/>
-        <w:spacing w:before="90" w:after="50"/>
+        <w:spacing w:before="80" w:after="40"/>
         <w:pBdr>
           <w:bottom w:val="single" w:sz="6" w:space="1" w:color="CBD5E1"/>
         </w:pBdr>
@@ -466,22 +466,22 @@
     </w:p>
     <w:p>
       <w:pPr>
-        <w:spacing w:before="20" w:after="60" w:line="269" w:lineRule="auto"/>
+        <w:spacing w:before="20" w:after="50" w:line="266" w:lineRule="auto"/>
         <w:jc w:val="both"/>
       </w:pPr>
       <w:r>
         <w:rPr>
           <w:rFonts w:ascii="Calibri" w:hAnsi="Calibri"/>
           <w:color w:val="1E293B"/>
-          <w:sz w:val="17"/>
+          <w:sz w:val="16"/>
         </w:rPr>
-        <w:t>Technical Lead and Certified Odoo Consultant with 7+ years of hands-on experience building custom Odoo ERP solutions and integrating Odoo with external and proprietary systems. Hand-coded more than 900 custom modules in Python, JavaScript (OWL 2), and XML for 85+ enterprise clients. Experienced in delivering complex integrations under tight deadlines, including a complete bidirectional sync with SAP (customers, sales orders, deliveries, payments) in 1 month, and 7 New Zealand and Australian payment gateways in a single month. Delivered integrations for mobile Sales Force Automation (SFA), telecom SMS marketing gateways, and cross-border retail POS systems. Completed 14+ database upgrades across Odoo 13 to 19 with zero data loss. Leads development teams using modern CLI agents and local AI models to cut delivery cycles from 3 months down to 2–3 weeks while enforcing clean code standards via the Agentic E3 Framework.</w:t>
+        <w:t>Technical Lead and Certified Odoo Consultant with 7+ years of hands-on experience building custom Odoo ERP solutions and integrating Odoo with external and proprietary systems. Hand-coded more than 900 custom modules in Python, JavaScript (OWL 2), and XML for 85+ enterprise clients. Experienced in delivering complex integrations under tight deadlines, including a complete bidirectional sync with SAP (customers, sales orders, deliveries, payments) in 1 month, and 7 New Zealand and Australian payment gateways in a single month. Delivered integrations for mobile Sales Force Automation (SFA), telecom SMS marketing gateways, and cross-border retail POS systems. Completed 14+ database upgrades across Odoo 13 to 19 using structural data retention methods that carry over all historical custom fields and financial records while dropping obsolete code debt. Leads development teams using modern CLI agents and local AI models to cut delivery cycles from 3 months down to 2–3 weeks while enforcing clean code standards via the Agentic E3 Framework.</w:t>
       </w:r>
     </w:p>
     <w:p>
       <w:pPr>
         <w:keepNext/>
-        <w:spacing w:before="80" w:after="50"/>
+        <w:spacing w:before="70" w:after="40"/>
         <w:pBdr>
           <w:bottom w:val="single" w:sz="6" w:space="1" w:color="CBD5E1"/>
         </w:pBdr>
@@ -504,13 +504,13 @@
         <w:tblLook w:firstColumn="1" w:firstRow="1" w:lastColumn="0" w:lastRow="0" w:noHBand="0" w:noVBand="1" w:val="04A0"/>
       </w:tblPr>
       <w:tblGrid>
-        <w:gridCol w:w="5205"/>
-        <w:gridCol w:w="5205"/>
+        <w:gridCol w:w="5234"/>
+        <w:gridCol w:w="5234"/>
       </w:tblGrid>
       <w:tr>
         <w:tc>
           <w:tcPr>
-            <w:tcW w:type="dxa" w:w="5198"/>
+            <w:tcW w:type="dxa" w:w="5227"/>
             <w:tcBorders>
               <w:top w:val="none"/>
               <w:left w:val="none"/>
@@ -518,15 +518,15 @@
               <w:right w:val="none"/>
             </w:tcBorders>
             <w:tcMar>
-              <w:top w:w="14" w:type="dxa"/>
-              <w:bottom w:w="18" w:type="dxa"/>
+              <w:top w:w="12" w:type="dxa"/>
+              <w:bottom w:w="16" w:type="dxa"/>
               <w:left w:w="20" w:type="dxa"/>
               <w:right w:w="30" w:type="dxa"/>
             </w:tcMar>
           </w:tcPr>
           <w:p>
             <w:pPr>
-              <w:spacing w:before="0" w:after="10" w:line="262" w:lineRule="auto"/>
+              <w:spacing w:before="0" w:after="10" w:line="259" w:lineRule="auto"/>
             </w:pPr>
             <w:r>
               <w:rPr>
@@ -549,7 +549,7 @@
         </w:tc>
         <w:tc>
           <w:tcPr>
-            <w:tcW w:type="dxa" w:w="5198"/>
+            <w:tcW w:type="dxa" w:w="5227"/>
             <w:tcBorders>
               <w:top w:val="none"/>
               <w:left w:val="none"/>
@@ -557,15 +557,15 @@
               <w:right w:val="none"/>
             </w:tcBorders>
             <w:tcMar>
-              <w:top w:w="14" w:type="dxa"/>
-              <w:bottom w:w="18" w:type="dxa"/>
+              <w:top w:w="12" w:type="dxa"/>
+              <w:bottom w:w="16" w:type="dxa"/>
               <w:left w:w="20" w:type="dxa"/>
               <w:right w:w="30" w:type="dxa"/>
             </w:tcMar>
           </w:tcPr>
           <w:p>
             <w:pPr>
-              <w:spacing w:before="0" w:after="10" w:line="262" w:lineRule="auto"/>
+              <w:spacing w:before="0" w:after="10" w:line="259" w:lineRule="auto"/>
             </w:pPr>
             <w:r>
               <w:rPr>
@@ -590,7 +590,7 @@
       <w:tr>
         <w:tc>
           <w:tcPr>
-            <w:tcW w:type="dxa" w:w="5198"/>
+            <w:tcW w:type="dxa" w:w="5227"/>
             <w:tcBorders>
               <w:top w:val="none"/>
               <w:left w:val="none"/>
@@ -598,15 +598,15 @@
               <w:right w:val="none"/>
             </w:tcBorders>
             <w:tcMar>
-              <w:top w:w="14" w:type="dxa"/>
-              <w:bottom w:w="18" w:type="dxa"/>
+              <w:top w:w="12" w:type="dxa"/>
+              <w:bottom w:w="16" w:type="dxa"/>
               <w:left w:w="20" w:type="dxa"/>
               <w:right w:w="30" w:type="dxa"/>
             </w:tcMar>
           </w:tcPr>
           <w:p>
             <w:pPr>
-              <w:spacing w:before="0" w:after="10" w:line="262" w:lineRule="auto"/>
+              <w:spacing w:before="0" w:after="10" w:line="259" w:lineRule="auto"/>
             </w:pPr>
             <w:r>
               <w:rPr>
@@ -629,7 +629,7 @@
         </w:tc>
         <w:tc>
           <w:tcPr>
-            <w:tcW w:type="dxa" w:w="5198"/>
+            <w:tcW w:type="dxa" w:w="5227"/>
             <w:tcBorders>
               <w:top w:val="none"/>
               <w:left w:val="none"/>
@@ -637,15 +637,15 @@
               <w:right w:val="none"/>
             </w:tcBorders>
             <w:tcMar>
-              <w:top w:w="14" w:type="dxa"/>
-              <w:bottom w:w="18" w:type="dxa"/>
+              <w:top w:w="12" w:type="dxa"/>
+              <w:bottom w:w="16" w:type="dxa"/>
               <w:left w:w="20" w:type="dxa"/>
               <w:right w:w="30" w:type="dxa"/>
             </w:tcMar>
           </w:tcPr>
           <w:p>
             <w:pPr>
-              <w:spacing w:before="0" w:after="10" w:line="262" w:lineRule="auto"/>
+              <w:spacing w:before="0" w:after="10" w:line="259" w:lineRule="auto"/>
             </w:pPr>
             <w:r>
               <w:rPr>
@@ -670,7 +670,7 @@
       <w:tr>
         <w:tc>
           <w:tcPr>
-            <w:tcW w:type="dxa" w:w="5198"/>
+            <w:tcW w:type="dxa" w:w="5227"/>
             <w:tcBorders>
               <w:top w:val="none"/>
               <w:left w:val="none"/>
@@ -678,15 +678,15 @@
               <w:right w:val="none"/>
             </w:tcBorders>
             <w:tcMar>
-              <w:top w:w="14" w:type="dxa"/>
-              <w:bottom w:w="18" w:type="dxa"/>
+              <w:top w:w="12" w:type="dxa"/>
+              <w:bottom w:w="16" w:type="dxa"/>
               <w:left w:w="20" w:type="dxa"/>
               <w:right w:w="30" w:type="dxa"/>
             </w:tcMar>
           </w:tcPr>
           <w:p>
             <w:pPr>
-              <w:spacing w:before="0" w:after="10" w:line="262" w:lineRule="auto"/>
+              <w:spacing w:before="0" w:after="10" w:line="259" w:lineRule="auto"/>
             </w:pPr>
             <w:r>
               <w:rPr>
@@ -695,7 +695,7 @@
                 <w:color w:val="2563EB"/>
                 <w:sz w:val="16"/>
               </w:rPr>
-              <w:t xml:space="preserve">• Database Upgrades: </w:t>
+              <w:t xml:space="preserve">• Historical Data Retention: </w:t>
             </w:r>
             <w:r>
               <w:rPr>
@@ -703,13 +703,13 @@
                 <w:color w:val="1E293B"/>
                 <w:sz w:val="16"/>
               </w:rPr>
-              <w:t>14+ major upgrades (v13 to v19), structural data retention scripts, legacy business logic extraction, and financial ledger reconciliation without data loss.</w:t>
+              <w:t>14+ major upgrades (v13 to v19); AST schema parsing to retain legacy models, stored fields, and audit views while dropping broken Python workflows to eliminate technical debt.</w:t>
             </w:r>
           </w:p>
         </w:tc>
         <w:tc>
           <w:tcPr>
-            <w:tcW w:type="dxa" w:w="5198"/>
+            <w:tcW w:type="dxa" w:w="5227"/>
             <w:tcBorders>
               <w:top w:val="none"/>
               <w:left w:val="none"/>
@@ -717,15 +717,15 @@
               <w:right w:val="none"/>
             </w:tcBorders>
             <w:tcMar>
-              <w:top w:w="14" w:type="dxa"/>
-              <w:bottom w:w="18" w:type="dxa"/>
+              <w:top w:w="12" w:type="dxa"/>
+              <w:bottom w:w="16" w:type="dxa"/>
               <w:left w:w="20" w:type="dxa"/>
               <w:right w:w="30" w:type="dxa"/>
             </w:tcMar>
           </w:tcPr>
           <w:p>
             <w:pPr>
-              <w:spacing w:before="0" w:after="10" w:line="262" w:lineRule="auto"/>
+              <w:spacing w:before="0" w:after="10" w:line="259" w:lineRule="auto"/>
             </w:pPr>
             <w:r>
               <w:rPr>
@@ -751,7 +751,7 @@
     <w:p>
       <w:pPr>
         <w:keepNext/>
-        <w:spacing w:before="80" w:after="50"/>
+        <w:spacing w:before="70" w:after="40"/>
         <w:pBdr>
           <w:bottom w:val="single" w:sz="6" w:space="1" w:color="CBD5E1"/>
         </w:pBdr>
@@ -769,14 +769,14 @@
     <w:p>
       <w:pPr>
         <w:pStyle w:val="ListBullet"/>
-        <w:spacing w:before="0" w:after="24" w:line="264" w:lineRule="auto"/>
+        <w:spacing w:before="0" w:after="20" w:line="262" w:lineRule="auto"/>
       </w:pPr>
       <w:r>
         <w:rPr>
           <w:rFonts w:ascii="Calibri" w:hAnsi="Calibri"/>
           <w:b/>
           <w:color w:val="1E293B"/>
-          <w:sz w:val="17"/>
+          <w:sz w:val="16"/>
         </w:rPr>
         <w:t xml:space="preserve">SAP ERP Bidirectional Sync (Built in 1 Month): </w:t>
       </w:r>
@@ -784,7 +784,7 @@
         <w:rPr>
           <w:rFonts w:ascii="Calibri" w:hAnsi="Calibri"/>
           <w:color w:val="1E293B"/>
-          <w:sz w:val="17"/>
+          <w:sz w:val="16"/>
         </w:rPr>
         <w:t>Built an end-to-end integration between Odoo ERP and SAP. Synchronized customer accounts, sales orders, delivery fulfillment statuses, and payment records with automated retry queues and reconciliation within a 1-month deadline.</w:t>
       </w:r>
@@ -792,14 +792,14 @@
     <w:p>
       <w:pPr>
         <w:pStyle w:val="ListBullet"/>
-        <w:spacing w:before="0" w:after="24" w:line="264" w:lineRule="auto"/>
+        <w:spacing w:before="0" w:after="20" w:line="262" w:lineRule="auto"/>
       </w:pPr>
       <w:r>
         <w:rPr>
           <w:rFonts w:ascii="Calibri" w:hAnsi="Calibri"/>
           <w:b/>
           <w:color w:val="1E293B"/>
-          <w:sz w:val="17"/>
+          <w:sz w:val="16"/>
         </w:rPr>
         <w:t xml:space="preserve">7 NZ &amp; AUS Payment Gateways (1-Month Milestone): </w:t>
       </w:r>
@@ -807,7 +807,7 @@
         <w:rPr>
           <w:rFonts w:ascii="Calibri" w:hAnsi="Calibri"/>
           <w:color w:val="1E293B"/>
-          <w:sz w:val="17"/>
+          <w:sz w:val="16"/>
         </w:rPr>
         <w:t>Integrated and deployed 7 New Zealand and Australian payment gateways and BNPL platforms within a single 1-month milestone. Automated invoice reconciliation, payment webhooks, and PCI-DSS compliance.</w:t>
       </w:r>
@@ -815,14 +815,37 @@
     <w:p>
       <w:pPr>
         <w:pStyle w:val="ListBullet"/>
-        <w:spacing w:before="0" w:after="24" w:line="264" w:lineRule="auto"/>
+        <w:spacing w:before="0" w:after="20" w:line="262" w:lineRule="auto"/>
       </w:pPr>
       <w:r>
         <w:rPr>
           <w:rFonts w:ascii="Calibri" w:hAnsi="Calibri"/>
           <w:b/>
           <w:color w:val="1E293B"/>
-          <w:sz w:val="17"/>
+          <w:sz w:val="16"/>
+        </w:rPr>
+        <w:t xml:space="preserve">Historical Data &amp; Schema Retention Pipeline: </w:t>
+      </w:r>
+      <w:r>
+        <w:rPr>
+          <w:rFonts w:ascii="Calibri" w:hAnsi="Calibri"/>
+          <w:color w:val="1E293B"/>
+          <w:sz w:val="16"/>
+        </w:rPr>
+        <w:t>Engineered an AST-based schema extraction strategy for multi-version Odoo upgrades (v13 to v19). Separated database structures from legacy code—preserving all historical custom fields, computed values, and PDF report layouts for client audit compliance while dropping obsolete Python workflows.</w:t>
+      </w:r>
+    </w:p>
+    <w:p>
+      <w:pPr>
+        <w:pStyle w:val="ListBullet"/>
+        <w:spacing w:before="0" w:after="20" w:line="262" w:lineRule="auto"/>
+      </w:pPr>
+      <w:r>
+        <w:rPr>
+          <w:rFonts w:ascii="Calibri" w:hAnsi="Calibri"/>
+          <w:b/>
+          <w:color w:val="1E293B"/>
+          <w:sz w:val="16"/>
         </w:rPr>
         <w:t xml:space="preserve">Mobile Sales Force Automation (SFA) Integration: </w:t>
       </w:r>
@@ -830,7 +853,7 @@
         <w:rPr>
           <w:rFonts w:ascii="Calibri" w:hAnsi="Calibri"/>
           <w:color w:val="1E293B"/>
-          <w:sz w:val="17"/>
+          <w:sz w:val="16"/>
         </w:rPr>
         <w:t>Built a real-time sync connector between an external mobile SFA system and Odoo Enterprise for an FMCG manufacturer. Handled bulk field sales order import, stock reservation, and automated delivery order creation.</w:t>
       </w:r>
@@ -838,14 +861,14 @@
     <w:p>
       <w:pPr>
         <w:pStyle w:val="ListBullet"/>
-        <w:spacing w:before="0" w:after="24" w:line="264" w:lineRule="auto"/>
+        <w:spacing w:before="0" w:after="20" w:line="262" w:lineRule="auto"/>
       </w:pPr>
       <w:r>
         <w:rPr>
           <w:rFonts w:ascii="Calibri" w:hAnsi="Calibri"/>
           <w:b/>
           <w:color w:val="1E293B"/>
-          <w:sz w:val="17"/>
+          <w:sz w:val="16"/>
         </w:rPr>
         <w:t xml:space="preserve">New Zealand Marketplaces (Kogan &amp; Tradevine): </w:t>
       </w:r>
@@ -853,7 +876,7 @@
         <w:rPr>
           <w:rFonts w:ascii="Calibri" w:hAnsi="Calibri"/>
           <w:color w:val="1E293B"/>
-          <w:sz w:val="17"/>
+          <w:sz w:val="16"/>
         </w:rPr>
         <w:t>Built real-time API integrations connecting Odoo with Kogan and Tradevine. Automated product catalog mapping, multi-warehouse stock sync, and order fulfillment webhooks.</w:t>
       </w:r>
@@ -861,14 +884,14 @@
     <w:p>
       <w:pPr>
         <w:pStyle w:val="ListBullet"/>
-        <w:spacing w:before="0" w:after="24" w:line="264" w:lineRule="auto"/>
+        <w:spacing w:before="0" w:after="20" w:line="262" w:lineRule="auto"/>
       </w:pPr>
       <w:r>
         <w:rPr>
           <w:rFonts w:ascii="Calibri" w:hAnsi="Calibri"/>
           <w:b/>
           <w:color w:val="1E293B"/>
-          <w:sz w:val="17"/>
+          <w:sz w:val="16"/>
         </w:rPr>
         <w:t xml:space="preserve">High-Throughput Telecom SMS Gateways: </w:t>
       </w:r>
@@ -876,7 +899,7 @@
         <w:rPr>
           <w:rFonts w:ascii="Calibri" w:hAnsi="Calibri"/>
           <w:color w:val="1E293B"/>
-          <w:sz w:val="17"/>
+          <w:sz w:val="16"/>
         </w:rPr>
         <w:t>Built custom SMS gateway modules connecting Odoo directly to telecommunication carrier APIs for automated order updates, OTP verification, and bulk customer notification campaigns.</w:t>
       </w:r>
@@ -884,14 +907,14 @@
     <w:p>
       <w:pPr>
         <w:pStyle w:val="ListBullet"/>
-        <w:spacing w:before="0" w:after="24" w:line="264" w:lineRule="auto"/>
+        <w:spacing w:before="0" w:after="20" w:line="262" w:lineRule="auto"/>
       </w:pPr>
       <w:r>
         <w:rPr>
           <w:rFonts w:ascii="Calibri" w:hAnsi="Calibri"/>
           <w:b/>
           <w:color w:val="1E293B"/>
-          <w:sz w:val="17"/>
+          <w:sz w:val="16"/>
         </w:rPr>
         <w:t xml:space="preserve">Cross-Border Omnichannel POS &amp; Loyalty System: </w:t>
       </w:r>
@@ -899,7 +922,7 @@
         <w:rPr>
           <w:rFonts w:ascii="Calibri" w:hAnsi="Calibri"/>
           <w:color w:val="1E293B"/>
-          <w:sz w:val="17"/>
+          <w:sz w:val="16"/>
         </w:rPr>
         <w:t>Deployed retail POS systems across nationwide store chains and an international branch in India. Built custom multi-tier prepaid membership cards, customer balance wallets, and offline-to-online sync.</w:t>
       </w:r>
@@ -907,14 +930,14 @@
     <w:p>
       <w:pPr>
         <w:pStyle w:val="ListBullet"/>
-        <w:spacing w:before="0" w:after="24" w:line="264" w:lineRule="auto"/>
+        <w:spacing w:before="0" w:after="20" w:line="262" w:lineRule="auto"/>
       </w:pPr>
       <w:r>
         <w:rPr>
           <w:rFonts w:ascii="Calibri" w:hAnsi="Calibri"/>
           <w:b/>
           <w:color w:val="1E293B"/>
-          <w:sz w:val="17"/>
+          <w:sz w:val="16"/>
         </w:rPr>
         <w:t xml:space="preserve">Odoo Database Model Context Protocol (MCP) Server: </w:t>
       </w:r>
@@ -922,32 +945,9 @@
         <w:rPr>
           <w:rFonts w:ascii="Calibri" w:hAnsi="Calibri"/>
           <w:color w:val="1E293B"/>
-          <w:sz w:val="17"/>
+          <w:sz w:val="16"/>
         </w:rPr>
         <w:t>Built and deployed an MCP server exposing Odoo ORM schemas and models to AI coding tools (Claude Code, Antigravity, Cline, Puku) for automated schema inspection and task execution.</w:t>
-      </w:r>
-    </w:p>
-    <w:p>
-      <w:pPr>
-        <w:pStyle w:val="ListBullet"/>
-        <w:spacing w:before="0" w:after="24" w:line="264" w:lineRule="auto"/>
-      </w:pPr>
-      <w:r>
-        <w:rPr>
-          <w:rFonts w:ascii="Calibri" w:hAnsi="Calibri"/>
-          <w:b/>
-          <w:color w:val="1E293B"/>
-          <w:sz w:val="17"/>
-        </w:rPr>
-        <w:t xml:space="preserve">ZATCA Phase 2 &amp; Tax Invoicing Compliance: </w:t>
-      </w:r>
-      <w:r>
-        <w:rPr>
-          <w:rFonts w:ascii="Calibri" w:hAnsi="Calibri"/>
-          <w:color w:val="1E293B"/>
-          <w:sz w:val="17"/>
-        </w:rPr>
-        <w:t>Built tax compliance modules connecting Odoo accounting with regulatory portals: Saudi Arabia ZATCA Phase 2 (XML signing, ECDSA cryptographic hashing, QR codes) and Bangladesh NBR tax engines.</w:t>
       </w:r>
     </w:p>
     <w:p>
@@ -958,7 +958,7 @@
     <w:p>
       <w:pPr>
         <w:keepNext/>
-        <w:spacing w:before="0" w:after="50"/>
+        <w:spacing w:before="0" w:after="40"/>
         <w:pBdr>
           <w:bottom w:val="single" w:sz="6" w:space="1" w:color="CBD5E1"/>
         </w:pBdr>
@@ -1000,14 +1000,14 @@
     <w:p>
       <w:pPr>
         <w:pStyle w:val="ListBullet"/>
-        <w:spacing w:before="0" w:after="24" w:line="264" w:lineRule="auto"/>
+        <w:spacing w:before="0" w:after="20" w:line="262" w:lineRule="auto"/>
       </w:pPr>
       <w:r>
         <w:rPr>
           <w:rFonts w:ascii="Calibri" w:hAnsi="Calibri"/>
           <w:b/>
           <w:color w:val="1E293B"/>
-          <w:sz w:val="17"/>
+          <w:sz w:val="16"/>
         </w:rPr>
         <w:t xml:space="preserve">Technical Leadership for ERP Customizations: </w:t>
       </w:r>
@@ -1015,7 +1015,7 @@
         <w:rPr>
           <w:rFonts w:ascii="Calibri" w:hAnsi="Calibri"/>
           <w:color w:val="1E293B"/>
-          <w:sz w:val="17"/>
+          <w:sz w:val="16"/>
         </w:rPr>
         <w:t>Leads engineering teams delivering Odoo customization projects for 85+ global and domestic enterprise clients (Bangladesh, New Zealand, Saudi Arabia, Spain, South Sudan). Guides core architecture, custom themes, and proprietary integrations.</w:t>
       </w:r>
@@ -1023,14 +1023,14 @@
     <w:p>
       <w:pPr>
         <w:pStyle w:val="ListBullet"/>
-        <w:spacing w:before="0" w:after="24" w:line="264" w:lineRule="auto"/>
+        <w:spacing w:before="0" w:after="20" w:line="262" w:lineRule="auto"/>
       </w:pPr>
       <w:r>
         <w:rPr>
           <w:rFonts w:ascii="Calibri" w:hAnsi="Calibri"/>
           <w:b/>
           <w:color w:val="1E293B"/>
-          <w:sz w:val="17"/>
+          <w:sz w:val="16"/>
         </w:rPr>
         <w:t xml:space="preserve">Fast-Track Enterprise Integrations (SAP, SFA, 7 Payment Gateways): </w:t>
       </w:r>
@@ -1038,7 +1038,7 @@
         <w:rPr>
           <w:rFonts w:ascii="Calibri" w:hAnsi="Calibri"/>
           <w:color w:val="1E293B"/>
-          <w:sz w:val="17"/>
+          <w:sz w:val="16"/>
         </w:rPr>
         <w:t>Led the delivery of major integrations on tight timelines: full SAP sync (customers, orders, deliveries, payments) in 1 month, SFA field order import for FMCG clients, and 7 NZ &amp; AUS payment gateways in a 1-month milestone.</w:t>
       </w:r>
@@ -1046,14 +1046,14 @@
     <w:p>
       <w:pPr>
         <w:pStyle w:val="ListBullet"/>
-        <w:spacing w:before="0" w:after="24" w:line="264" w:lineRule="auto"/>
+        <w:spacing w:before="0" w:after="20" w:line="262" w:lineRule="auto"/>
       </w:pPr>
       <w:r>
         <w:rPr>
           <w:rFonts w:ascii="Calibri" w:hAnsi="Calibri"/>
           <w:b/>
           <w:color w:val="1E293B"/>
-          <w:sz w:val="17"/>
+          <w:sz w:val="16"/>
         </w:rPr>
         <w:t xml:space="preserve">Fast-Paced Team Delivery (3-Month Scope in 2–3 Weeks): </w:t>
       </w:r>
@@ -1061,7 +1061,7 @@
         <w:rPr>
           <w:rFonts w:ascii="Calibri" w:hAnsi="Calibri"/>
           <w:color w:val="1E293B"/>
-          <w:sz w:val="17"/>
+          <w:sz w:val="16"/>
         </w:rPr>
         <w:t>Established a delivery workflow combining modular Odoo patterns, automated test suites, and local AI tools (Claude Code, Antigravity, local LLMs), cutting project cycle times by up to 75% with high first-pass UAT acceptance.</w:t>
       </w:r>
@@ -1069,37 +1069,37 @@
     <w:p>
       <w:pPr>
         <w:pStyle w:val="ListBullet"/>
-        <w:spacing w:before="0" w:after="24" w:line="264" w:lineRule="auto"/>
+        <w:spacing w:before="0" w:after="20" w:line="262" w:lineRule="auto"/>
       </w:pPr>
       <w:r>
         <w:rPr>
           <w:rFonts w:ascii="Calibri" w:hAnsi="Calibri"/>
           <w:b/>
           <w:color w:val="1E293B"/>
-          <w:sz w:val="17"/>
+          <w:sz w:val="16"/>
         </w:rPr>
-        <w:t xml:space="preserve">Odoo Enterprise Database Upgrades (v13.0 to v19.0): </w:t>
+        <w:t xml:space="preserve">Odoo Enterprise Upgrades &amp; Historical Data Retention: </w:t>
       </w:r>
       <w:r>
         <w:rPr>
           <w:rFonts w:ascii="Calibri" w:hAnsi="Calibri"/>
           <w:color w:val="1E293B"/>
-          <w:sz w:val="17"/>
+          <w:sz w:val="16"/>
         </w:rPr>
-        <w:t>Led 14+ major database upgrades across multiple version jumps (v13-v17, v14-v19, v16-v19). Used custom data retention scripts to migrate years of custom business data while retiring outdated code.</w:t>
+        <w:t>Led 14+ major database upgrades across multiple version jumps (v13-v17, v14-v19, v16-v19). Applied structural data retention scripts to retain decades of custom business data, fields, and views while safely stripping out outdated Python logic.</w:t>
       </w:r>
     </w:p>
     <w:p>
       <w:pPr>
         <w:pStyle w:val="ListBullet"/>
-        <w:spacing w:before="0" w:after="24" w:line="264" w:lineRule="auto"/>
+        <w:spacing w:before="0" w:after="20" w:line="262" w:lineRule="auto"/>
       </w:pPr>
       <w:r>
         <w:rPr>
           <w:rFonts w:ascii="Calibri" w:hAnsi="Calibri"/>
           <w:b/>
           <w:color w:val="1E293B"/>
-          <w:sz w:val="17"/>
+          <w:sz w:val="16"/>
         </w:rPr>
         <w:t xml:space="preserve">Nginx Server Worker Isolation: </w:t>
       </w:r>
@@ -1107,7 +1107,7 @@
         <w:rPr>
           <w:rFonts w:ascii="Calibri" w:hAnsi="Calibri"/>
           <w:color w:val="1E293B"/>
-          <w:sz w:val="17"/>
+          <w:sz w:val="16"/>
         </w:rPr>
         <w:t>Configured Nginx upstream routing into separate worker pools, isolating heavy external API sync and e-commerce traffic from internal back-office users to eliminate slowdowns.</w:t>
       </w:r>
@@ -1115,7 +1115,7 @@
     <w:p>
       <w:pPr>
         <w:keepNext/>
-        <w:spacing w:before="90" w:after="20"/>
+        <w:spacing w:before="80" w:after="20"/>
       </w:pPr>
       <w:r>
         <w:rPr>
@@ -1139,14 +1139,14 @@
     <w:p>
       <w:pPr>
         <w:pStyle w:val="ListBullet"/>
-        <w:spacing w:before="0" w:after="24" w:line="264" w:lineRule="auto"/>
+        <w:spacing w:before="0" w:after="20" w:line="262" w:lineRule="auto"/>
       </w:pPr>
       <w:r>
         <w:rPr>
           <w:rFonts w:ascii="Calibri" w:hAnsi="Calibri"/>
           <w:b/>
           <w:color w:val="1E293B"/>
-          <w:sz w:val="17"/>
+          <w:sz w:val="16"/>
         </w:rPr>
         <w:t xml:space="preserve">Marketplace &amp; Payment Integrations: </w:t>
       </w:r>
@@ -1154,7 +1154,7 @@
         <w:rPr>
           <w:rFonts w:ascii="Calibri" w:hAnsi="Calibri"/>
           <w:color w:val="1E293B"/>
-          <w:sz w:val="17"/>
+          <w:sz w:val="16"/>
         </w:rPr>
         <w:t>Built real-time sync modules connecting Odoo to international e-commerce channels (Kogan, Tradevine, BNPL platforms). Built automated reconciliation scripts to prevent stock mismatches.</w:t>
       </w:r>
@@ -1162,14 +1162,14 @@
     <w:p>
       <w:pPr>
         <w:pStyle w:val="ListBullet"/>
-        <w:spacing w:before="0" w:after="24" w:line="264" w:lineRule="auto"/>
+        <w:spacing w:before="0" w:after="20" w:line="262" w:lineRule="auto"/>
       </w:pPr>
       <w:r>
         <w:rPr>
           <w:rFonts w:ascii="Calibri" w:hAnsi="Calibri"/>
           <w:b/>
           <w:color w:val="1E293B"/>
-          <w:sz w:val="17"/>
+          <w:sz w:val="16"/>
         </w:rPr>
         <w:t xml:space="preserve">Custom Module Development &amp; SFA Sync: </w:t>
       </w:r>
@@ -1177,7 +1177,7 @@
         <w:rPr>
           <w:rFonts w:ascii="Calibri" w:hAnsi="Calibri"/>
           <w:color w:val="1E293B"/>
-          <w:sz w:val="17"/>
+          <w:sz w:val="16"/>
         </w:rPr>
         <w:t>Wrote custom Odoo modules for business automations, discrete manufacturing assembly lines, multi-currency accounting, and mobile SFA order processing.</w:t>
       </w:r>
@@ -1185,14 +1185,14 @@
     <w:p>
       <w:pPr>
         <w:pStyle w:val="ListBullet"/>
-        <w:spacing w:before="0" w:after="24" w:line="264" w:lineRule="auto"/>
+        <w:spacing w:before="0" w:after="20" w:line="262" w:lineRule="auto"/>
       </w:pPr>
       <w:r>
         <w:rPr>
           <w:rFonts w:ascii="Calibri" w:hAnsi="Calibri"/>
           <w:b/>
           <w:color w:val="1E293B"/>
-          <w:sz w:val="17"/>
+          <w:sz w:val="16"/>
         </w:rPr>
         <w:t xml:space="preserve">Deployment &amp; Infrastructure Automation: </w:t>
       </w:r>
@@ -1200,7 +1200,7 @@
         <w:rPr>
           <w:rFonts w:ascii="Calibri" w:hAnsi="Calibri"/>
           <w:color w:val="1E293B"/>
-          <w:sz w:val="17"/>
+          <w:sz w:val="16"/>
         </w:rPr>
         <w:t>Built Docker and Bash deployment pipelines managing 300+ live Odoo instances, cutting onboarding deployment time by 85%.</w:t>
       </w:r>
@@ -1208,7 +1208,7 @@
     <w:p>
       <w:pPr>
         <w:keepNext/>
-        <w:spacing w:before="90" w:after="20"/>
+        <w:spacing w:before="80" w:after="20"/>
       </w:pPr>
       <w:r>
         <w:rPr>
@@ -1232,14 +1232,14 @@
     <w:p>
       <w:pPr>
         <w:pStyle w:val="ListBullet"/>
-        <w:spacing w:before="0" w:after="24" w:line="264" w:lineRule="auto"/>
+        <w:spacing w:before="0" w:after="20" w:line="262" w:lineRule="auto"/>
       </w:pPr>
       <w:r>
         <w:rPr>
           <w:rFonts w:ascii="Calibri" w:hAnsi="Calibri"/>
           <w:b/>
           <w:color w:val="1E293B"/>
-          <w:sz w:val="17"/>
+          <w:sz w:val="16"/>
         </w:rPr>
         <w:t xml:space="preserve">Custom Modules Built to Business Requirements: </w:t>
       </w:r>
@@ -1247,7 +1247,7 @@
         <w:rPr>
           <w:rFonts w:ascii="Calibri" w:hAnsi="Calibri"/>
           <w:color w:val="1E293B"/>
-          <w:sz w:val="17"/>
+          <w:sz w:val="16"/>
         </w:rPr>
         <w:t>Developed hundreds of custom Odoo modules matching specific client business workflows, custom reporting, and customer portal features.</w:t>
       </w:r>
@@ -1255,14 +1255,14 @@
     <w:p>
       <w:pPr>
         <w:pStyle w:val="ListBullet"/>
-        <w:spacing w:before="0" w:after="24" w:line="264" w:lineRule="auto"/>
+        <w:spacing w:before="0" w:after="20" w:line="262" w:lineRule="auto"/>
       </w:pPr>
       <w:r>
         <w:rPr>
           <w:rFonts w:ascii="Calibri" w:hAnsi="Calibri"/>
           <w:b/>
           <w:color w:val="1E293B"/>
-          <w:sz w:val="17"/>
+          <w:sz w:val="16"/>
         </w:rPr>
         <w:t xml:space="preserve">Payment Gateways &amp; PostgreSQL Tuning: </w:t>
       </w:r>
@@ -1270,7 +1270,7 @@
         <w:rPr>
           <w:rFonts w:ascii="Calibri" w:hAnsi="Calibri"/>
           <w:color w:val="1E293B"/>
-          <w:sz w:val="17"/>
+          <w:sz w:val="16"/>
         </w:rPr>
         <w:t>Integrated local payment gateways (cards, mobile banking) and optimized complex PostgreSQL queries and indexing for high-volume transactions.</w:t>
       </w:r>
@@ -1278,7 +1278,7 @@
     <w:p>
       <w:pPr>
         <w:keepNext/>
-        <w:spacing w:before="90" w:after="20"/>
+        <w:spacing w:before="80" w:after="20"/>
       </w:pPr>
       <w:r>
         <w:rPr>
@@ -1302,14 +1302,14 @@
     <w:p>
       <w:pPr>
         <w:pStyle w:val="ListBullet"/>
-        <w:spacing w:before="0" w:after="24" w:line="264" w:lineRule="auto"/>
+        <w:spacing w:before="0" w:after="20" w:line="262" w:lineRule="auto"/>
       </w:pPr>
       <w:r>
         <w:rPr>
           <w:rFonts w:ascii="Calibri" w:hAnsi="Calibri"/>
           <w:b/>
           <w:color w:val="1E293B"/>
-          <w:sz w:val="17"/>
+          <w:sz w:val="16"/>
         </w:rPr>
         <w:t xml:space="preserve">Magento 2+ Backend &amp; Mobile APIs: </w:t>
       </w:r>
@@ -1317,7 +1317,7 @@
         <w:rPr>
           <w:rFonts w:ascii="Calibri" w:hAnsi="Calibri"/>
           <w:color w:val="1E293B"/>
-          <w:sz w:val="17"/>
+          <w:sz w:val="16"/>
         </w:rPr>
         <w:t>Built backend web services and API endpoints for Magento 2+ e-commerce platforms connected to mobile apps. Managed cloud servers and SSL/Nginx reverse proxies.</w:t>
       </w:r>
@@ -1325,7 +1325,7 @@
     <w:p>
       <w:pPr>
         <w:keepNext/>
-        <w:spacing w:before="90" w:after="20"/>
+        <w:spacing w:before="80" w:after="20"/>
       </w:pPr>
       <w:r>
         <w:rPr>
@@ -1349,14 +1349,14 @@
     <w:p>
       <w:pPr>
         <w:pStyle w:val="ListBullet"/>
-        <w:spacing w:before="0" w:after="24" w:line="264" w:lineRule="auto"/>
+        <w:spacing w:before="0" w:after="20" w:line="262" w:lineRule="auto"/>
       </w:pPr>
       <w:r>
         <w:rPr>
           <w:rFonts w:ascii="Calibri" w:hAnsi="Calibri"/>
           <w:b/>
           <w:color w:val="1E293B"/>
-          <w:sz w:val="17"/>
+          <w:sz w:val="16"/>
         </w:rPr>
         <w:t xml:space="preserve">Enterprise Infrastructure Administration: </w:t>
       </w:r>
@@ -1364,7 +1364,7 @@
         <w:rPr>
           <w:rFonts w:ascii="Calibri" w:hAnsi="Calibri"/>
           <w:color w:val="1E293B"/>
-          <w:sz w:val="17"/>
+          <w:sz w:val="16"/>
         </w:rPr>
         <w:t>Managed enterprise IT operations, Windows Server administration (Active Directory, DNS, IIS, Group Policy up to 2019), network security, and hardware/software deployments.</w:t>
       </w:r>
@@ -1372,7 +1372,7 @@
     <w:p>
       <w:pPr>
         <w:keepNext/>
-        <w:spacing w:before="80" w:after="50"/>
+        <w:spacing w:before="80" w:after="40"/>
         <w:pBdr>
           <w:bottom w:val="single" w:sz="6" w:space="1" w:color="CBD5E1"/>
         </w:pBdr>
@@ -1390,14 +1390,14 @@
     <w:p>
       <w:pPr>
         <w:pStyle w:val="ListBullet"/>
-        <w:spacing w:before="0" w:after="24" w:line="264" w:lineRule="auto"/>
+        <w:spacing w:before="0" w:after="20" w:line="262" w:lineRule="auto"/>
       </w:pPr>
       <w:r>
         <w:rPr>
           <w:rFonts w:ascii="Calibri" w:hAnsi="Calibri"/>
           <w:b/>
           <w:color w:val="1E293B"/>
-          <w:sz w:val="17"/>
+          <w:sz w:val="16"/>
         </w:rPr>
         <w:t xml:space="preserve">Certified Odoo Consultant: </w:t>
       </w:r>
@@ -1405,7 +1405,7 @@
         <w:rPr>
           <w:rFonts w:ascii="Calibri" w:hAnsi="Calibri"/>
           <w:color w:val="1E293B"/>
-          <w:sz w:val="17"/>
+          <w:sz w:val="16"/>
         </w:rPr>
         <w:t>Metamorphosis Ltd. (Official Odoo Silver Partner). Extensive expertise in Odoo standard architecture, ORM, customization guidelines, and business process modeling.</w:t>
       </w:r>
@@ -1413,14 +1413,14 @@
     <w:p>
       <w:pPr>
         <w:pStyle w:val="ListBullet"/>
-        <w:spacing w:before="0" w:after="24" w:line="264" w:lineRule="auto"/>
+        <w:spacing w:before="0" w:after="20" w:line="262" w:lineRule="auto"/>
       </w:pPr>
       <w:r>
         <w:rPr>
           <w:rFonts w:ascii="Calibri" w:hAnsi="Calibri"/>
           <w:b/>
           <w:color w:val="1E293B"/>
-          <w:sz w:val="17"/>
+          <w:sz w:val="16"/>
         </w:rPr>
         <w:t xml:space="preserve">Master of Information Technology (MIT): </w:t>
       </w:r>
@@ -1428,7 +1428,7 @@
         <w:rPr>
           <w:rFonts w:ascii="Calibri" w:hAnsi="Calibri"/>
           <w:color w:val="1E293B"/>
-          <w:sz w:val="17"/>
+          <w:sz w:val="16"/>
         </w:rPr>
         <w:t>Jahangirnagar University (2018 – 2019). Focus on Enterprise Systems, Advanced Databases, and Distributed Architectures.</w:t>
       </w:r>
@@ -1436,14 +1436,14 @@
     <w:p>
       <w:pPr>
         <w:pStyle w:val="ListBullet"/>
-        <w:spacing w:before="0" w:after="24" w:line="264" w:lineRule="auto"/>
+        <w:spacing w:before="0" w:after="20" w:line="262" w:lineRule="auto"/>
       </w:pPr>
       <w:r>
         <w:rPr>
           <w:rFonts w:ascii="Calibri" w:hAnsi="Calibri"/>
           <w:b/>
           <w:color w:val="1E293B"/>
-          <w:sz w:val="17"/>
+          <w:sz w:val="16"/>
         </w:rPr>
         <w:t xml:space="preserve">Bachelor of Science (B.Sc): </w:t>
       </w:r>
@@ -1451,7 +1451,7 @@
         <w:rPr>
           <w:rFonts w:ascii="Calibri" w:hAnsi="Calibri"/>
           <w:color w:val="1E293B"/>
-          <w:sz w:val="17"/>
+          <w:sz w:val="16"/>
         </w:rPr>
         <w:t>Shahjalal University of Science and Technology (SUST). 1st Major in Mathematics, 2nd Major in Computer Science &amp; Engineering (CSE).</w:t>
       </w:r>
@@ -1459,14 +1459,14 @@
     <w:p>
       <w:pPr>
         <w:pStyle w:val="ListBullet"/>
-        <w:spacing w:before="0" w:after="24" w:line="264" w:lineRule="auto"/>
+        <w:spacing w:before="0" w:after="20" w:line="262" w:lineRule="auto"/>
       </w:pPr>
       <w:r>
         <w:rPr>
           <w:rFonts w:ascii="Calibri" w:hAnsi="Calibri"/>
           <w:b/>
           <w:color w:val="1E293B"/>
-          <w:sz w:val="17"/>
+          <w:sz w:val="16"/>
         </w:rPr>
         <w:t xml:space="preserve">IEEE Research Author (2021): </w:t>
       </w:r>
@@ -1474,14 +1474,14 @@
         <w:rPr>
           <w:rFonts w:ascii="Calibri" w:hAnsi="Calibri"/>
           <w:color w:val="1E293B"/>
-          <w:sz w:val="17"/>
+          <w:sz w:val="16"/>
         </w:rPr>
         <w:t>Published paper on data processing optimization in Hadoop MapReduce, introducing the IMC algorithm (65% efficiency gain). Applied these distributed processing principles to high-volume Odoo database operations.</w:t>
       </w:r>
     </w:p>
     <w:p>
       <w:pPr>
-        <w:spacing w:before="100" w:after="0"/>
+        <w:spacing w:before="80" w:after="0"/>
         <w:jc w:val="center"/>
       </w:pPr>
       <w:r>
@@ -1495,7 +1495,7 @@
     </w:p>
     <w:sectPr>
       <w:pgSz w:w="11909" w:h="16834"/>
-      <w:pgMar w:top="605" w:right="749" w:bottom="605" w:left="749" w:header="720" w:footer="720" w:gutter="0"/>
+      <w:pgMar w:top="576" w:right="720" w:bottom="576" w:left="720" w:header="720" w:footer="720" w:gutter="0"/>
       <w:cols w:space="720"/>
       <w:docGrid w:linePitch="360"/>
     </w:sectPr>

</xml_diff>